<commit_message>
docs: word de plantilla con modificaciones
</commit_message>
<xml_diff>
--- a/Entrega_Fase2_Grupo14/1_Informe/informe_fase2_PLANTILLA.docx
+++ b/Entrega_Fase2_Grupo14/1_Informe/informe_fase2_PLANTILLA.docx
@@ -88,7 +88,7 @@
               </wp:anchor>
             </w:drawing>
           </mc:Choice>
-          <mc:Fallback xmlns:w16cei="http://schemas.microsoft.com/office/word/2026/wordml/cei" xmlns:a="http://schemas.openxmlformats.org/drawingml/2006/main" xmlns:a14="http://schemas.microsoft.com/office/drawing/2010/main" xmlns:pic="http://schemas.openxmlformats.org/drawingml/2006/picture">
+          <mc:Fallback xmlns:pic="http://schemas.openxmlformats.org/drawingml/2006/picture" xmlns:a14="http://schemas.microsoft.com/office/drawing/2010/main" xmlns:a="http://schemas.openxmlformats.org/drawingml/2006/main" xmlns:w16cei="http://schemas.microsoft.com/office/word/2026/wordml/cei">
             <w:pict>
               <v:shapetype id="_x0000_t75" coordsize="21600,21600" filled="f" stroked="f" o:spt="75" o:preferrelative="t" path="m@4@5l@4@11@9@11@9@5xe">
                 <v:stroke joinstyle="miter"/>
@@ -193,16 +193,16 @@
               </wp:inline>
             </w:drawing>
           </mc:Choice>
-          <mc:Fallback xmlns:w16cei="http://schemas.microsoft.com/office/word/2026/wordml/cei" xmlns:a14="http://schemas.microsoft.com/office/drawing/2010/main" xmlns:pic="http://schemas.openxmlformats.org/drawingml/2006/picture" xmlns:a="http://schemas.openxmlformats.org/drawingml/2006/main">
-            <w:pict xmlns:w="http://schemas.openxmlformats.org/wordprocessingml/2006/main">
-              <v:shapetype xmlns:w14="http://schemas.microsoft.com/office/word/2010/wordml" xmlns:o="urn:schemas-microsoft-com:office:office" xmlns:v="urn:schemas-microsoft-com:vml" id="_x0000_t202" coordsize="21600,21600" o:spt="202" path="m,l,21600r21600,l21600,xe" w14:anchorId="11B37122">
+          <mc:Fallback>
+            <w:pict>
+              <v:shapetype w14:anchorId="1B372430" id="_x0000_t202" coordsize="21600,21600" o:spt="202" path="m,l,21600r21600,l21600,xe">
                 <v:stroke joinstyle="miter"/>
                 <v:path gradientshapeok="t" o:connecttype="rect"/>
               </v:shapetype>
-              <v:shape xmlns:o="urn:schemas-microsoft-com:office:office" xmlns:v="urn:schemas-microsoft-com:vml" id="Cuadro de texto 1" style="position:absolute;left:0;text-align:left;margin-left:161.5pt;margin-top:328.65pt;width:272.3pt;height:69.6pt;z-index:251659264;visibility:visible;mso-wrap-style:square;mso-wrap-distance-left:9pt;mso-wrap-distance-top:9pt;mso-wrap-distance-right:9pt;mso-wrap-distance-bottom:9pt;mso-position-horizontal:absolute;mso-position-horizontal-relative:page;mso-position-vertical:absolute;mso-position-vertical-relative:page;v-text-anchor:top" o:spid="_x0000_s1026" filled="f" stroked="f" type="#_x0000_t202" o:gfxdata="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">
+              <v:shape id="Cuadro de texto 1" o:spid="_x0000_s1026" type="#_x0000_t202" style="width:272.3pt;height:69.6pt;visibility:visible;mso-wrap-style:square;mso-left-percent:-10001;mso-top-percent:-10001;mso-position-horizontal:absolute;mso-position-horizontal-relative:char;mso-position-vertical:absolute;mso-position-vertical-relative:line;mso-left-percent:-10001;mso-top-percent:-10001;v-text-anchor:top" o:gfxdata="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" filled="f" stroked="f">
                 <v:textbox style="mso-fit-shape-to-text:t" inset="2.5395mm,2.5395mm,2.5395mm,2.5395mm">
                   <w:txbxContent>
-                    <w:p xmlns:w14="http://schemas.microsoft.com/office/word/2010/wordml">
+                    <w:p>
                       <w:pPr>
                         <w:spacing w:line="240" w:lineRule="auto"/>
                         <w:jc w:val="center"/>
@@ -227,7 +227,7 @@
                     </w:p>
                   </w:txbxContent>
                 </v:textbox>
-                <w10:wrap xmlns:w10="urn:schemas-microsoft-com:office:word" type="square" anchorx="page" anchory="page"/>
+                <w10:anchorlock/>
               </v:shape>
             </w:pict>
           </mc:Fallback>
@@ -664,7 +664,32 @@
           <w:sz w:val="24"/>
           <w:szCs w:val="24"/>
         </w:rPr>
-        <w:t>Caso: RutaMoto  ·  Fase 2</w:t>
+        <w:t xml:space="preserve">Caso: </w:t>
+      </w:r>
+      <w:proofErr w:type="spellStart"/>
+      <w:proofErr w:type="gramStart"/>
+      <w:r>
+        <w:rPr>
+          <w:sz w:val="24"/>
+          <w:szCs w:val="24"/>
+        </w:rPr>
+        <w:t>RutaMoto</w:t>
+      </w:r>
+      <w:proofErr w:type="spellEnd"/>
+      <w:r>
+        <w:rPr>
+          <w:sz w:val="24"/>
+          <w:szCs w:val="24"/>
+        </w:rPr>
+        <w:t xml:space="preserve">  ·</w:t>
+      </w:r>
+      <w:proofErr w:type="gramEnd"/>
+      <w:r>
+        <w:rPr>
+          <w:sz w:val="24"/>
+          <w:szCs w:val="24"/>
+        </w:rPr>
+        <w:t xml:space="preserve">  Fase 2</w:t>
       </w:r>
     </w:p>
     <w:p>
@@ -4444,7 +4469,21 @@
               <w:rPr>
                 <w:sz w:val="20"/>
               </w:rPr>
-              <w:t>Administra la instancia de Odoo, carga masiva desde el Excel (12.1) y ciclo completo de compras (12.2)</w:t>
+              <w:t xml:space="preserve">Administra la instancia de </w:t>
+            </w:r>
+            <w:proofErr w:type="spellStart"/>
+            <w:r>
+              <w:rPr>
+                <w:sz w:val="20"/>
+              </w:rPr>
+              <w:t>Odoo</w:t>
+            </w:r>
+            <w:proofErr w:type="spellEnd"/>
+            <w:r>
+              <w:rPr>
+                <w:sz w:val="20"/>
+              </w:rPr>
+              <w:t>, carga masiva desde el Excel (12.1) y ciclo completo de compras (12.2)</w:t>
             </w:r>
           </w:p>
         </w:tc>
@@ -4548,7 +4587,15 @@
     </w:p>
     <w:p>
       <w:r>
-        <w:t>La presentación técnica (20 puntos) es una demostración en vivo y es de los cuatro: cada quien demuestra lo que configuró, y cualquiera puede recibir preguntas de cualquier parte.</w:t>
+        <w:t xml:space="preserve">La presentación técnica (20 puntos) es una demostración en vivo y es de los cuatro: </w:t>
+      </w:r>
+      <w:proofErr w:type="gramStart"/>
+      <w:r>
+        <w:t>cada quien</w:t>
+      </w:r>
+      <w:proofErr w:type="gramEnd"/>
+      <w:r>
+        <w:t xml:space="preserve"> demuestra lo que configuró, y cualquiera puede recibir preguntas de cualquier parte.</w:t>
       </w:r>
     </w:p>
     <w:p>
@@ -4599,7 +4646,23 @@
         <w:spacing w:after="80"/>
       </w:pPr>
       <w:r>
-        <w:t>Las tablas de validación ya traen la columna «Resultado esperado» llena con los números del Excel. Vos llenás «Resultado obtenido» con lo que muestra Odoo. Si no coincide, se escribe lo que salió y por qué: un descuadre explicado vale más que un número maquillado.</w:t>
+        <w:t xml:space="preserve">Las tablas de validación ya traen la columna «Resultado esperado» llena con los números del Excel. Vos </w:t>
+      </w:r>
+      <w:proofErr w:type="spellStart"/>
+      <w:r>
+        <w:t>llenás</w:t>
+      </w:r>
+      <w:proofErr w:type="spellEnd"/>
+      <w:r>
+        <w:t xml:space="preserve"> «Resultado obtenido» con lo que muestra </w:t>
+      </w:r>
+      <w:proofErr w:type="spellStart"/>
+      <w:r>
+        <w:t>Odoo</w:t>
+      </w:r>
+      <w:proofErr w:type="spellEnd"/>
+      <w:r>
+        <w:t>. Si no coincide, se escribe lo que salió y por qué: un descuadre explicado vale más que un número maquillado.</w:t>
       </w:r>
     </w:p>
     <w:p>
@@ -6514,11 +6577,19 @@
               <w:spacing w:after="0"/>
               <w:jc w:val="left"/>
             </w:pPr>
-            <w:r>
-              <w:rPr>
-                <w:sz w:val="20"/>
-              </w:rPr>
-              <w:t>MotoClínica Villa Nueva (taller)</w:t>
+            <w:proofErr w:type="spellStart"/>
+            <w:r>
+              <w:rPr>
+                <w:sz w:val="20"/>
+              </w:rPr>
+              <w:t>MotoClínica</w:t>
+            </w:r>
+            <w:proofErr w:type="spellEnd"/>
+            <w:r>
+              <w:rPr>
+                <w:sz w:val="20"/>
+              </w:rPr>
+              <w:t xml:space="preserve"> Villa Nueva (taller)</w:t>
             </w:r>
           </w:p>
         </w:tc>
@@ -6756,13 +6827,58 @@
       </w:r>
     </w:p>
     <w:p>
+      <w:proofErr w:type="spellStart"/>
       <w:r>
-        <w:t>RutaMoto es la tienda en línea de repuestos y accesorios para motocicleta que el Grupo 14 desarrolla con el financiamiento y el acompañamiento de QuetzalDev. El informe de la primera fase documentó su diagnóstico, sus objetivos, el marco de planificación y la selección justificada de las herramientas, y terminó con Odoo 18.0 Community instalado y validado: el ERP y el CRM sobre una misma base de datos PostgreSQL, en contenedores, con la base rutamoto creada y sin datos de demostración.</w:t>
+        <w:t>RutaMoto</w:t>
+      </w:r>
+      <w:proofErr w:type="spellEnd"/>
+      <w:r>
+        <w:t xml:space="preserve"> es la tienda en línea de repuestos y accesorios para motocicleta que el Grupo 14 desarrolla con el financiamiento y el acompañamiento de </w:t>
+      </w:r>
+      <w:proofErr w:type="spellStart"/>
+      <w:r>
+        <w:t>QuetzalDev</w:t>
+      </w:r>
+      <w:proofErr w:type="spellEnd"/>
+      <w:r>
+        <w:t xml:space="preserve">. El informe de la primera fase documentó su diagnóstico, sus objetivos, el marco de planificación y la selección justificada de las herramientas, y terminó con </w:t>
+      </w:r>
+      <w:proofErr w:type="spellStart"/>
+      <w:r>
+        <w:t>Odoo</w:t>
+      </w:r>
+      <w:proofErr w:type="spellEnd"/>
+      <w:r>
+        <w:t xml:space="preserve"> 18.0 </w:t>
+      </w:r>
+      <w:proofErr w:type="spellStart"/>
+      <w:r>
+        <w:t>Community</w:t>
+      </w:r>
+      <w:proofErr w:type="spellEnd"/>
+      <w:r>
+        <w:t xml:space="preserve"> instalado y validado: el ERP y el CRM sobre una misma base de datos PostgreSQL, en contenedores, con la base </w:t>
+      </w:r>
+      <w:proofErr w:type="spellStart"/>
+      <w:r>
+        <w:t>rutamoto</w:t>
+      </w:r>
+      <w:proofErr w:type="spellEnd"/>
+      <w:r>
+        <w:t xml:space="preserve"> creada y sin datos de demostración.</w:t>
       </w:r>
     </w:p>
     <w:p>
       <w:r>
-        <w:t>Este informe corresponde a la segunda de las tres fases. Según la metodología del proyecto, es la fase de configuración, desarrollo de módulos y operación base. Su propósito es que el sistema deje de estar solo instalado y empiece a operar: que tenga cargado el catálogo, los proveedores y los clientes de la empresa, y que sobre esos datos funcionen los procesos que RutaMoto va a ejecutar a diario, como reabastecer el inventario, cotizar a un taller o enviar una campaña a un segmento de clientes.</w:t>
+        <w:t xml:space="preserve">Este informe corresponde a la segunda de las tres fases. Según la metodología del proyecto, es la fase de configuración, desarrollo de módulos y operación base. Su propósito es que el sistema deje de estar solo instalado y empiece a operar: que tenga cargado el catálogo, los proveedores y los clientes de la empresa, y que sobre esos datos funcionen los procesos que </w:t>
+      </w:r>
+      <w:proofErr w:type="spellStart"/>
+      <w:r>
+        <w:t>RutaMoto</w:t>
+      </w:r>
+      <w:proofErr w:type="spellEnd"/>
+      <w:r>
+        <w:t xml:space="preserve"> va a ejecutar a diario, como reabastecer el inventario, cotizar a un taller o enviar una campaña a un segmento de clientes.</w:t>
       </w:r>
     </w:p>
     <w:p>
@@ -6822,7 +6938,15 @@
     </w:p>
     <w:p>
       <w:r>
-        <w:t>Dejar el ERP y el CRM de RutaMoto operando con sus datos maestros completos, de manera que los procesos de compra a proveedores, cotización a clientes y campaña de correo se puedan demostrar de principio a fin sobre información real del caso.</w:t>
+        <w:t xml:space="preserve">Dejar el ERP y el CRM de </w:t>
+      </w:r>
+      <w:proofErr w:type="spellStart"/>
+      <w:r>
+        <w:t>RutaMoto</w:t>
+      </w:r>
+      <w:proofErr w:type="spellEnd"/>
+      <w:r>
+        <w:t xml:space="preserve"> operando con sus datos maestros completos, de manera que los procesos de compra a proveedores, cotización a clientes y campaña de correo se puedan demostrar de principio a fin sobre información real del caso.</w:t>
       </w:r>
     </w:p>
     <w:p>
@@ -6933,10 +7057,7 @@
     </w:p>
     <w:p>
       <w:r>
-        <w:t>Conviene señalar tres límites del trabajo. El primero es que el sistema sigue instalado en un ambiente local, y que el resto del equipo trabajó sobre él mediante un acceso remoto temporal, decisión que se explica en la sección de ambiente de trabajo. El segundo es que los correos de la campaña se entregaron a un servidor de correo de pruebas y no a buzones de clientes reales, porque los clientes del caso son ficticios. El tercero es que las imágenes de los productos son referenciales, porque la fotografía d</w:t>
-      </w:r>
-      <w:r>
-        <w:t>e producto figura en el presupuesto de la empresa, pero no se realizó.</w:t>
+        <w:t>Conviene señalar tres límites del trabajo. El primero es que el sistema sigue instalado en un ambiente local, y que el resto del equipo trabajó sobre él mediante un acceso remoto temporal, decisión que se explica en la sección de ambiente de trabajo. El segundo es que los correos de la campaña se entregaron a un servidor de correo de pruebas y no a buzones de clientes reales, porque los clientes del caso son ficticios. El tercero es que las imágenes de los productos son referenciales, porque la fotografía de producto figura en el presupuesto de la empresa, pero no se realizó.</w:t>
       </w:r>
     </w:p>
     <w:p>
@@ -7148,8 +7269,16 @@
               <w:rPr>
                 <w:sz w:val="20"/>
               </w:rPr>
-              <w:t>21 al 26 sep</w:t>
-            </w:r>
+              <w:t xml:space="preserve">21 al 26 </w:t>
+            </w:r>
+            <w:proofErr w:type="spellStart"/>
+            <w:r>
+              <w:rPr>
+                <w:sz w:val="20"/>
+              </w:rPr>
+              <w:t>sep</w:t>
+            </w:r>
+            <w:proofErr w:type="spellEnd"/>
           </w:p>
         </w:tc>
         <w:tc>
@@ -7231,8 +7360,16 @@
               <w:rPr>
                 <w:sz w:val="20"/>
               </w:rPr>
-              <w:t>25 al 30 sep</w:t>
-            </w:r>
+              <w:t xml:space="preserve">25 al 30 </w:t>
+            </w:r>
+            <w:proofErr w:type="spellStart"/>
+            <w:r>
+              <w:rPr>
+                <w:sz w:val="20"/>
+              </w:rPr>
+              <w:t>sep</w:t>
+            </w:r>
+            <w:proofErr w:type="spellEnd"/>
           </w:p>
         </w:tc>
         <w:tc>
@@ -7314,7 +7451,21 @@
               <w:rPr>
                 <w:sz w:val="20"/>
               </w:rPr>
-              <w:t>28 sep al 1 oct</w:t>
+              <w:t xml:space="preserve">28 </w:t>
+            </w:r>
+            <w:proofErr w:type="spellStart"/>
+            <w:r>
+              <w:rPr>
+                <w:sz w:val="20"/>
+              </w:rPr>
+              <w:t>sep</w:t>
+            </w:r>
+            <w:proofErr w:type="spellEnd"/>
+            <w:r>
+              <w:rPr>
+                <w:sz w:val="20"/>
+              </w:rPr>
+              <w:t xml:space="preserve"> al 1 oct</w:t>
             </w:r>
           </w:p>
         </w:tc>
@@ -7397,7 +7548,21 @@
               <w:rPr>
                 <w:sz w:val="20"/>
               </w:rPr>
-              <w:t>28 sep al 2 oct</w:t>
+              <w:t xml:space="preserve">28 </w:t>
+            </w:r>
+            <w:proofErr w:type="spellStart"/>
+            <w:r>
+              <w:rPr>
+                <w:sz w:val="20"/>
+              </w:rPr>
+              <w:t>sep</w:t>
+            </w:r>
+            <w:proofErr w:type="spellEnd"/>
+            <w:r>
+              <w:rPr>
+                <w:sz w:val="20"/>
+              </w:rPr>
+              <w:t xml:space="preserve"> al 2 oct</w:t>
             </w:r>
           </w:p>
         </w:tc>
@@ -7547,7 +7712,25 @@
           <w:color w:val="808080"/>
           <w:sz w:val="20"/>
         </w:rPr>
-        <w:t>Pendiente para el cierre (rol 1): llenar las columnas Real y Estado con las fechas del chat del grupo y del historial de Odoo. Si alguna actividad se atrasó, agregar una oración con la causa debajo de la tabla.</w:t>
+        <w:t xml:space="preserve">Pendiente para el cierre (rol 1): llenar las columnas Real y Estado con las fechas del chat del grupo y del historial de </w:t>
+      </w:r>
+      <w:proofErr w:type="spellStart"/>
+      <w:r>
+        <w:rPr>
+          <w:i/>
+          <w:color w:val="808080"/>
+          <w:sz w:val="20"/>
+        </w:rPr>
+        <w:t>Odoo</w:t>
+      </w:r>
+      <w:proofErr w:type="spellEnd"/>
+      <w:r>
+        <w:rPr>
+          <w:i/>
+          <w:color w:val="808080"/>
+          <w:sz w:val="20"/>
+        </w:rPr>
+        <w:t>. Si alguna actividad se atrasó, agregar una oración con la causa debajo de la tabla.</w:t>
       </w:r>
     </w:p>
     <w:p>
@@ -7799,7 +7982,25 @@
           <w:color w:val="404040"/>
           <w:sz w:val="20"/>
         </w:rPr>
-        <w:t>ROL 3 — Carga masiva y ciclo de compras (ERP)   ·   Responsable: Alberto Josué Hernández Armas</w:t>
+        <w:t>ROL 3 — Carga masiva y ciclo de compras (</w:t>
+      </w:r>
+      <w:proofErr w:type="gramStart"/>
+      <w:r>
+        <w:rPr>
+          <w:b/>
+          <w:color w:val="404040"/>
+          <w:sz w:val="20"/>
+        </w:rPr>
+        <w:t xml:space="preserve">ERP)   </w:t>
+      </w:r>
+      <w:proofErr w:type="gramEnd"/>
+      <w:r>
+        <w:rPr>
+          <w:b/>
+          <w:color w:val="404040"/>
+          <w:sz w:val="20"/>
+        </w:rPr>
+        <w:t>·   Responsable: Alberto Josué Hernández Armas</w:t>
       </w:r>
     </w:p>
     <w:p>
@@ -7812,7 +8013,43 @@
           <w:color w:val="808080"/>
           <w:sz w:val="20"/>
         </w:rPr>
-        <w:t xml:space="preserve">Qué va aquí: cómo trabajaron cuatro personas sobre UNA sola instancia de Odoo. Es una decisión que el catedrático va a preguntar, así que hay que justificarla: una sola base evita que cada quien cargue datos en una </w:t>
+        <w:t xml:space="preserve">Qué va aquí: cómo trabajaron cuatro personas sobre UNA sola instancia de </w:t>
+      </w:r>
+      <w:proofErr w:type="spellStart"/>
+      <w:r>
+        <w:rPr>
+          <w:i/>
+          <w:color w:val="808080"/>
+          <w:sz w:val="20"/>
+        </w:rPr>
+        <w:t>Odoo</w:t>
+      </w:r>
+      <w:proofErr w:type="spellEnd"/>
+      <w:r>
+        <w:rPr>
+          <w:i/>
+          <w:color w:val="808080"/>
+          <w:sz w:val="20"/>
+        </w:rPr>
+        <w:t xml:space="preserve">. Es una decisión que el catedrático va a preguntar, así que hay que justificarla: una sola base evita que </w:t>
+      </w:r>
+      <w:proofErr w:type="gramStart"/>
+      <w:r>
+        <w:rPr>
+          <w:i/>
+          <w:color w:val="808080"/>
+          <w:sz w:val="20"/>
+        </w:rPr>
+        <w:t>cada quien</w:t>
+      </w:r>
+      <w:proofErr w:type="gramEnd"/>
+      <w:r>
+        <w:rPr>
+          <w:i/>
+          <w:color w:val="808080"/>
+          <w:sz w:val="20"/>
+        </w:rPr>
+        <w:t xml:space="preserve"> cargue datos en una </w:t>
       </w:r>
       <w:r>
         <w:rPr>
@@ -7938,8 +8175,44 @@
               <w:rPr>
                 <w:sz w:val="20"/>
               </w:rPr>
-              <w:t>La de la Fase 1: contenedores rutamoto-odoo y rutamoto-db, base rutamoto</w:t>
-            </w:r>
+              <w:t xml:space="preserve">La de la Fase 1: contenedores </w:t>
+            </w:r>
+            <w:proofErr w:type="spellStart"/>
+            <w:r>
+              <w:rPr>
+                <w:sz w:val="20"/>
+              </w:rPr>
+              <w:t>rutamoto-odoo</w:t>
+            </w:r>
+            <w:proofErr w:type="spellEnd"/>
+            <w:r>
+              <w:rPr>
+                <w:sz w:val="20"/>
+              </w:rPr>
+              <w:t xml:space="preserve"> y </w:t>
+            </w:r>
+            <w:proofErr w:type="spellStart"/>
+            <w:r>
+              <w:rPr>
+                <w:sz w:val="20"/>
+              </w:rPr>
+              <w:t>rutamoto-db</w:t>
+            </w:r>
+            <w:proofErr w:type="spellEnd"/>
+            <w:r>
+              <w:rPr>
+                <w:sz w:val="20"/>
+              </w:rPr>
+              <w:t xml:space="preserve">, base </w:t>
+            </w:r>
+            <w:proofErr w:type="spellStart"/>
+            <w:r>
+              <w:rPr>
+                <w:sz w:val="20"/>
+              </w:rPr>
+              <w:t>rutamoto</w:t>
+            </w:r>
+            <w:proofErr w:type="spellEnd"/>
           </w:p>
         </w:tc>
         <w:tc>
@@ -7999,7 +8272,25 @@
                 <w:color w:val="808080"/>
                 <w:sz w:val="20"/>
               </w:rPr>
-              <w:t>Ej.: túnel de Cloudflare hacia localhost:8069 (URL temporal *.trycloudflare.com)</w:t>
+              <w:t xml:space="preserve">Ej.: túnel de </w:t>
+            </w:r>
+            <w:proofErr w:type="spellStart"/>
+            <w:r>
+              <w:rPr>
+                <w:i/>
+                <w:color w:val="808080"/>
+                <w:sz w:val="20"/>
+              </w:rPr>
+              <w:t>Cloudflare</w:t>
+            </w:r>
+            <w:proofErr w:type="spellEnd"/>
+            <w:r>
+              <w:rPr>
+                <w:i/>
+                <w:color w:val="808080"/>
+                <w:sz w:val="20"/>
+              </w:rPr>
+              <w:t xml:space="preserve"> hacia localhost:8069 (URL temporal *.trycloudflare.com)</w:t>
             </w:r>
           </w:p>
         </w:tc>
@@ -8076,7 +8367,21 @@
               <w:rPr>
                 <w:sz w:val="20"/>
               </w:rPr>
-              <w:t>El historial (chatter) de cada registro muestra quién hizo qué: es la evidencia de autoría que pide la evaluación técnica</w:t>
+              <w:t>El historial (</w:t>
+            </w:r>
+            <w:proofErr w:type="spellStart"/>
+            <w:r>
+              <w:rPr>
+                <w:sz w:val="20"/>
+              </w:rPr>
+              <w:t>chatter</w:t>
+            </w:r>
+            <w:proofErr w:type="spellEnd"/>
+            <w:r>
+              <w:rPr>
+                <w:sz w:val="20"/>
+              </w:rPr>
+              <w:t>) de cada registro muestra quién hizo qué: es la evidencia de autoría que pide la evaluación técnica</w:t>
             </w:r>
           </w:p>
         </w:tc>
@@ -8479,16 +8784,67 @@
     </w:p>
     <w:p>
       <w:pPr>
-        <w:spacing w:after="120"/>
+        <w:rPr>
+          <w:lang w:val="es-US"/>
+        </w:rPr>
       </w:pPr>
       <w:r>
         <w:rPr>
-          <w:i/>
-          <w:color w:val="808080"/>
-          <w:sz w:val="20"/>
+          <w:lang w:val="es-US"/>
         </w:rPr>
-        <w:t>Qué va aquí: dónde terminan los correos de la campaña. Sin servidor de correo, Odoo marca la campaña como fallida y la 14 no tiene evidencia. Explicar la opción elegida y por qué: Mailpit (servidor de pruebas en un contenedor, captura todos los correos y los muestra renderizados, sin credenciales) o una cuenta de Gmail del grupo con contraseña de aplicación (llega a buzones reales). Poner la configuración y una captura de la prueba de conexión exitosa.</w:t>
+        <w:t xml:space="preserve">Para gestionar el envío de correos desde el módulo de Email Marketing y el CRM, se decidió implementar </w:t>
       </w:r>
+      <w:proofErr w:type="spellStart"/>
+      <w:r>
+        <w:rPr>
+          <w:b/>
+          <w:bCs/>
+          <w:lang w:val="es-US"/>
+        </w:rPr>
+        <w:t>Mailpit</w:t>
+      </w:r>
+      <w:proofErr w:type="spellEnd"/>
+      <w:r>
+        <w:rPr>
+          <w:lang w:val="es-US"/>
+        </w:rPr>
+        <w:t xml:space="preserve"> como servidor de correo saliente. La decisión se fundamenta en que </w:t>
+      </w:r>
+      <w:proofErr w:type="spellStart"/>
+      <w:r>
+        <w:rPr>
+          <w:lang w:val="es-US"/>
+        </w:rPr>
+        <w:t>Mailpit</w:t>
+      </w:r>
+      <w:proofErr w:type="spellEnd"/>
+      <w:r>
+        <w:rPr>
+          <w:lang w:val="es-US"/>
+        </w:rPr>
+        <w:t xml:space="preserve"> es una herramienta diseñada específicamente para pruebas en entornos de desarrollo; captura todos los correos electrónicos generados por </w:t>
+      </w:r>
+      <w:proofErr w:type="spellStart"/>
+      <w:r>
+        <w:rPr>
+          <w:lang w:val="es-US"/>
+        </w:rPr>
+        <w:t>Odoo</w:t>
+      </w:r>
+      <w:proofErr w:type="spellEnd"/>
+      <w:r>
+        <w:rPr>
+          <w:lang w:val="es-US"/>
+        </w:rPr>
+        <w:t xml:space="preserve"> y los muestra en una bandeja web local sin enviarlos a destinatarios reales. Esto previene el riesgo de enviar "spam" accidental a correos reales o agotar cuotas en cuentas de Gmail, permitiendo realizar simulaciones de campañas de forma segura.</w:t>
+      </w:r>
+    </w:p>
+    <w:p>
+      <w:pPr>
+        <w:rPr>
+          <w:lang w:val="es-US"/>
+        </w:rPr>
+      </w:pPr>
     </w:p>
     <w:tbl>
       <w:tblPr>
@@ -8522,6 +8878,7 @@
                 <w:b/>
                 <w:sz w:val="20"/>
               </w:rPr>
+              <w:lastRenderedPageBreak/>
               <w:t>Parámetro</w:t>
             </w:r>
           </w:p>
@@ -8560,10 +8917,15 @@
               <w:keepNext/>
               <w:spacing w:after="0"/>
               <w:jc w:val="left"/>
-            </w:pPr>
-            <w:r>
-              <w:rPr>
-                <w:sz w:val="20"/>
+              <w:rPr>
+                <w:sz w:val="20"/>
+                <w:szCs w:val="20"/>
+              </w:rPr>
+            </w:pPr>
+            <w:r>
+              <w:rPr>
+                <w:sz w:val="20"/>
+                <w:szCs w:val="20"/>
               </w:rPr>
               <w:t>Servidor elegido</w:t>
             </w:r>
@@ -8578,7 +8940,21 @@
               <w:keepNext/>
               <w:spacing w:after="0"/>
               <w:jc w:val="left"/>
-            </w:pPr>
+              <w:rPr>
+                <w:sz w:val="20"/>
+                <w:szCs w:val="20"/>
+              </w:rPr>
+            </w:pPr>
+            <w:proofErr w:type="spellStart"/>
+            <w:r>
+              <w:rPr>
+                <w:sz w:val="20"/>
+                <w:szCs w:val="20"/>
+                <w:lang w:val="es-US"/>
+              </w:rPr>
+              <w:t>Mailpit</w:t>
+            </w:r>
+            <w:proofErr w:type="spellEnd"/>
           </w:p>
         </w:tc>
       </w:tr>
@@ -8595,10 +8971,15 @@
               <w:keepNext/>
               <w:spacing w:after="0"/>
               <w:jc w:val="left"/>
-            </w:pPr>
-            <w:r>
-              <w:rPr>
-                <w:sz w:val="20"/>
+              <w:rPr>
+                <w:sz w:val="20"/>
+                <w:szCs w:val="20"/>
+              </w:rPr>
+            </w:pPr>
+            <w:r>
+              <w:rPr>
+                <w:sz w:val="20"/>
+                <w:szCs w:val="20"/>
               </w:rPr>
               <w:t>Host y puerto</w:t>
             </w:r>
@@ -8613,7 +8994,20 @@
               <w:keepNext/>
               <w:spacing w:after="0"/>
               <w:jc w:val="left"/>
-            </w:pPr>
+              <w:rPr>
+                <w:sz w:val="20"/>
+                <w:szCs w:val="20"/>
+                <w:lang w:val="es-US"/>
+              </w:rPr>
+            </w:pPr>
+            <w:r>
+              <w:rPr>
+                <w:sz w:val="20"/>
+                <w:szCs w:val="20"/>
+                <w:lang w:val="es-US"/>
+              </w:rPr>
+              <w:t>1025</w:t>
+            </w:r>
           </w:p>
         </w:tc>
       </w:tr>
@@ -8630,10 +9024,15 @@
               <w:keepNext/>
               <w:spacing w:after="0"/>
               <w:jc w:val="left"/>
-            </w:pPr>
-            <w:r>
-              <w:rPr>
-                <w:sz w:val="20"/>
+              <w:rPr>
+                <w:sz w:val="20"/>
+                <w:szCs w:val="20"/>
+              </w:rPr>
+            </w:pPr>
+            <w:r>
+              <w:rPr>
+                <w:sz w:val="20"/>
+                <w:szCs w:val="20"/>
               </w:rPr>
               <w:t>Seguridad / autenticación</w:t>
             </w:r>
@@ -8648,7 +9047,18 @@
               <w:keepNext/>
               <w:spacing w:after="0"/>
               <w:jc w:val="left"/>
-            </w:pPr>
+              <w:rPr>
+                <w:sz w:val="20"/>
+                <w:szCs w:val="20"/>
+              </w:rPr>
+            </w:pPr>
+            <w:r>
+              <w:rPr>
+                <w:sz w:val="20"/>
+                <w:szCs w:val="20"/>
+              </w:rPr>
+              <w:t>Credenciales de autenticación</w:t>
+            </w:r>
           </w:p>
         </w:tc>
       </w:tr>
@@ -8664,10 +9074,15 @@
             <w:pPr>
               <w:spacing w:after="0"/>
               <w:jc w:val="left"/>
-            </w:pPr>
-            <w:r>
-              <w:rPr>
-                <w:sz w:val="20"/>
+              <w:rPr>
+                <w:sz w:val="20"/>
+                <w:szCs w:val="20"/>
+              </w:rPr>
+            </w:pPr>
+            <w:r>
+              <w:rPr>
+                <w:sz w:val="20"/>
+                <w:szCs w:val="20"/>
               </w:rPr>
               <w:t>Prueba de conexión</w:t>
             </w:r>
@@ -8681,7 +9096,18 @@
             <w:pPr>
               <w:spacing w:after="0"/>
               <w:jc w:val="left"/>
-            </w:pPr>
+              <w:rPr>
+                <w:sz w:val="20"/>
+                <w:szCs w:val="20"/>
+              </w:rPr>
+            </w:pPr>
+            <w:r>
+              <w:rPr>
+                <w:sz w:val="20"/>
+                <w:szCs w:val="20"/>
+              </w:rPr>
+              <w:t>Hecho</w:t>
+            </w:r>
           </w:p>
         </w:tc>
       </w:tr>
@@ -8718,9 +9144,28 @@
           <w:color w:val="808080"/>
           <w:sz w:val="20"/>
         </w:rPr>
-        <w:lastRenderedPageBreak/>
-        <w:t>[ captura: prueba de conexión exitosa del servidor de correo saliente en Odoo ]</w:t>
+        <w:t xml:space="preserve">[ captura: prueba de conexión exitosa del servidor de correo saliente en </w:t>
       </w:r>
+      <w:proofErr w:type="spellStart"/>
+      <w:proofErr w:type="gramStart"/>
+      <w:r>
+        <w:rPr>
+          <w:i/>
+          <w:color w:val="808080"/>
+          <w:sz w:val="20"/>
+        </w:rPr>
+        <w:t>Odoo</w:t>
+      </w:r>
+      <w:proofErr w:type="spellEnd"/>
+      <w:r>
+        <w:rPr>
+          <w:i/>
+          <w:color w:val="808080"/>
+          <w:sz w:val="20"/>
+        </w:rPr>
+        <w:t xml:space="preserve"> ]</w:t>
+      </w:r>
+      <w:proofErr w:type="gramEnd"/>
     </w:p>
     <w:p>
       <w:pPr>
@@ -8800,7 +9245,25 @@
           <w:color w:val="808080"/>
           <w:sz w:val="20"/>
         </w:rPr>
-        <w:t>Qué va aquí: la estructura del Excel entregado (3_Archivos_Datos/RutaMoto_datos_maestros_Fase2.xlsx) y por qué está armado así: una hoja por modelo de Odoo, en el orden de dependencia, columnas informativas separadas de las importables, y un cuadre contra el presupuesto de la Fase 1.</w:t>
+        <w:t xml:space="preserve">Qué va aquí: la estructura del Excel entregado (3_Archivos_Datos/RutaMoto_datos_maestros_Fase2.xlsx) y por qué está armado así: una hoja por modelo de </w:t>
+      </w:r>
+      <w:proofErr w:type="spellStart"/>
+      <w:r>
+        <w:rPr>
+          <w:i/>
+          <w:color w:val="808080"/>
+          <w:sz w:val="20"/>
+        </w:rPr>
+        <w:t>Odoo</w:t>
+      </w:r>
+      <w:proofErr w:type="spellEnd"/>
+      <w:r>
+        <w:rPr>
+          <w:i/>
+          <w:color w:val="808080"/>
+          <w:sz w:val="20"/>
+        </w:rPr>
+        <w:t>, en el orden de dependencia, columnas informativas separadas de las importables, y un cuadre contra el presupuesto de la Fase 1.</w:t>
       </w:r>
     </w:p>
     <w:tbl>
@@ -8897,8 +9360,17 @@
                 <w:b/>
                 <w:sz w:val="20"/>
               </w:rPr>
-              <w:t>Qué crea en Odoo</w:t>
-            </w:r>
+              <w:t xml:space="preserve">Qué crea en </w:t>
+            </w:r>
+            <w:proofErr w:type="spellStart"/>
+            <w:r>
+              <w:rPr>
+                <w:b/>
+                <w:sz w:val="20"/>
+              </w:rPr>
+              <w:t>Odoo</w:t>
+            </w:r>
+            <w:proofErr w:type="spellEnd"/>
           </w:p>
         </w:tc>
       </w:tr>
@@ -9092,7 +9564,13 @@
               <w:rPr>
                 <w:sz w:val="20"/>
               </w:rPr>
-              <w:t>Mínimo y máximo por producto</w:t>
+              <w:t xml:space="preserve">Mínimo y máximo por </w:t>
+            </w:r>
+            <w:r>
+              <w:rPr>
+                <w:sz w:val="20"/>
+              </w:rPr>
+              <w:t>producto</w:t>
             </w:r>
           </w:p>
         </w:tc>
@@ -9481,7 +9959,25 @@
           <w:color w:val="404040"/>
           <w:sz w:val="20"/>
         </w:rPr>
-        <w:t>ROL 3 — Carga masiva y ciclo de compras (ERP)   ·   Responsable: Alberto Josué Hernández Armas</w:t>
+        <w:t>ROL 3 — Carga masiva y ciclo de compras (</w:t>
+      </w:r>
+      <w:proofErr w:type="gramStart"/>
+      <w:r>
+        <w:rPr>
+          <w:b/>
+          <w:color w:val="404040"/>
+          <w:sz w:val="20"/>
+        </w:rPr>
+        <w:t xml:space="preserve">ERP)   </w:t>
+      </w:r>
+      <w:proofErr w:type="gramEnd"/>
+      <w:r>
+        <w:rPr>
+          <w:b/>
+          <w:color w:val="404040"/>
+          <w:sz w:val="20"/>
+        </w:rPr>
+        <w:t>·   Responsable: Alberto Josué Hernández Armas</w:t>
       </w:r>
     </w:p>
     <w:p>
@@ -9494,16 +9990,7 @@
           <w:color w:val="808080"/>
           <w:sz w:val="20"/>
         </w:rPr>
-        <w:t xml:space="preserve">Qué va aquí: el resumen del procedimiento (el detalle está en el MU-01), las decisiones que tomaste (por qué las categorías se crean antes, por qué se usa «Probar» antes de «Importar», cómo se resolvió el mapeo de columnas) y </w:t>
-      </w:r>
-      <w:r>
-        <w:rPr>
-          <w:i/>
-          <w:color w:val="808080"/>
-          <w:sz w:val="20"/>
-        </w:rPr>
-        <w:lastRenderedPageBreak/>
-        <w:t>los errores que salieron con su solución. Una captura clave: la pantalla de importación con el mapeo de columnas y el mensaje de validación sin errores.</w:t>
+        <w:t>Qué va aquí: el resumen del procedimiento (el detalle está en el MU-01), las decisiones que tomaste (por qué las categorías se crean antes, por qué se usa «Probar» antes de «Importar», cómo se resolvió el mapeo de columnas) y los errores que salieron con su solución. Una captura clave: la pantalla de importación con el mapeo de columnas y el mensaje de validación sin errores.</w:t>
       </w:r>
     </w:p>
     <w:p/>
@@ -9525,8 +10012,18 @@
           <w:color w:val="808080"/>
           <w:sz w:val="20"/>
         </w:rPr>
-        <w:t>[ captura: pantalla de importación de productos con el mapeo de columnas y la prueba sin errores ]</w:t>
+        <w:t xml:space="preserve">[ captura: pantalla de importación de productos con el mapeo de columnas y la prueba sin </w:t>
       </w:r>
+      <w:proofErr w:type="gramStart"/>
+      <w:r>
+        <w:rPr>
+          <w:i/>
+          <w:color w:val="808080"/>
+          <w:sz w:val="20"/>
+        </w:rPr>
+        <w:t>errores ]</w:t>
+      </w:r>
+      <w:proofErr w:type="gramEnd"/>
     </w:p>
     <w:p>
       <w:pPr>
@@ -9796,7 +10293,25 @@
           <w:color w:val="808080"/>
           <w:sz w:val="20"/>
         </w:rPr>
-        <w:t>Qué va aquí: qué se cargó a mano y por qué justo eso: la categoría Accesorios y equipaje completa (6 productos), su proveedor AccesoRuta Importaciones y 5 clientes, uno o dos por segmento. Así la carga manual no es una repetición de la masiva sino una parte distinta del catálogo. Una captura clave: el formulario de un producto recién creado, con su categoría, precio, costo y existencia.</w:t>
+        <w:t xml:space="preserve">Qué va aquí: qué se cargó a mano y por qué justo eso: la categoría Accesorios y equipaje completa (6 productos), su proveedor </w:t>
+      </w:r>
+      <w:proofErr w:type="spellStart"/>
+      <w:r>
+        <w:rPr>
+          <w:i/>
+          <w:color w:val="808080"/>
+          <w:sz w:val="20"/>
+        </w:rPr>
+        <w:t>AccesoRuta</w:t>
+      </w:r>
+      <w:proofErr w:type="spellEnd"/>
+      <w:r>
+        <w:rPr>
+          <w:i/>
+          <w:color w:val="808080"/>
+          <w:sz w:val="20"/>
+        </w:rPr>
+        <w:t xml:space="preserve"> Importaciones y 5 clientes, uno o dos por segmento. Así la carga manual no es una repetición de la masiva sino una parte distinta del catálogo. Una captura clave: el formulario de un producto recién creado, con su categoría, precio, costo y existencia.</w:t>
       </w:r>
     </w:p>
     <w:p/>
@@ -9818,8 +10333,18 @@
           <w:color w:val="808080"/>
           <w:sz w:val="20"/>
         </w:rPr>
-        <w:t>[ captura: formulario del producto ACC-001 creado a mano, con categoría, precio, costo y existencia ]</w:t>
+        <w:t xml:space="preserve">[ captura: formulario del producto ACC-001 creado a mano, con categoría, precio, costo y </w:t>
       </w:r>
+      <w:proofErr w:type="gramStart"/>
+      <w:r>
+        <w:rPr>
+          <w:i/>
+          <w:color w:val="808080"/>
+          <w:sz w:val="20"/>
+        </w:rPr>
+        <w:t>existencia ]</w:t>
+      </w:r>
+      <w:proofErr w:type="gramEnd"/>
     </w:p>
     <w:p>
       <w:pPr>
@@ -9841,6 +10366,7 @@
       </w:pPr>
       <w:bookmarkStart w:id="14" w:name="_Toc241501385"/>
       <w:r>
+        <w:lastRenderedPageBreak/>
         <w:t>Validación en el sistema</w:t>
       </w:r>
       <w:bookmarkEnd w:id="14"/>
@@ -9863,7 +10389,25 @@
           <w:color w:val="404040"/>
           <w:sz w:val="20"/>
         </w:rPr>
-        <w:t>ROL 3 — Carga masiva y ciclo de compras (ERP)   ·   Responsable: Alberto Josué Hernández Armas</w:t>
+        <w:t>ROL 3 — Carga masiva y ciclo de compras (</w:t>
+      </w:r>
+      <w:proofErr w:type="gramStart"/>
+      <w:r>
+        <w:rPr>
+          <w:b/>
+          <w:color w:val="404040"/>
+          <w:sz w:val="20"/>
+        </w:rPr>
+        <w:t xml:space="preserve">ERP)   </w:t>
+      </w:r>
+      <w:proofErr w:type="gramEnd"/>
+      <w:r>
+        <w:rPr>
+          <w:b/>
+          <w:color w:val="404040"/>
+          <w:sz w:val="20"/>
+        </w:rPr>
+        <w:t>·   Responsable: Alberto Josué Hernández Armas</w:t>
       </w:r>
     </w:p>
     <w:p>
@@ -9897,7 +10441,25 @@
           <w:color w:val="808080"/>
           <w:sz w:val="20"/>
         </w:rPr>
-        <w:t>Esta tabla es la que la rúbrica llama «se verifica en sistema». La columna de lo esperado ya viene del Excel; llenen lo que muestra Odoo. Si un número no cuadra, se escribe el que salió y por qué, no se corrige a mano para que cuadre.</w:t>
+        <w:t xml:space="preserve">Esta tabla es la que la rúbrica llama «se verifica en sistema». La columna de lo esperado ya viene del Excel; llenen lo que muestra </w:t>
+      </w:r>
+      <w:proofErr w:type="spellStart"/>
+      <w:r>
+        <w:rPr>
+          <w:i/>
+          <w:color w:val="808080"/>
+          <w:sz w:val="20"/>
+        </w:rPr>
+        <w:t>Odoo</w:t>
+      </w:r>
+      <w:proofErr w:type="spellEnd"/>
+      <w:r>
+        <w:rPr>
+          <w:i/>
+          <w:color w:val="808080"/>
+          <w:sz w:val="20"/>
+        </w:rPr>
+        <w:t>. Si un número no cuadra, se escribe el que salió y por qué, no se corrige a mano para que cuadre.</w:t>
       </w:r>
     </w:p>
     <w:tbl>
@@ -9934,7 +10496,6 @@
                 <w:b/>
                 <w:sz w:val="20"/>
               </w:rPr>
-              <w:lastRenderedPageBreak/>
               <w:t>Comprobación</w:t>
             </w:r>
           </w:p>
@@ -9955,8 +10516,17 @@
                 <w:b/>
                 <w:sz w:val="20"/>
               </w:rPr>
-              <w:t>Dónde se mira en Odoo</w:t>
-            </w:r>
+              <w:t xml:space="preserve">Dónde se mira en </w:t>
+            </w:r>
+            <w:proofErr w:type="spellStart"/>
+            <w:r>
+              <w:rPr>
+                <w:b/>
+                <w:sz w:val="20"/>
+              </w:rPr>
+              <w:t>Odoo</w:t>
+            </w:r>
+            <w:proofErr w:type="spellEnd"/>
           </w:p>
         </w:tc>
         <w:tc>
@@ -10607,7 +11177,25 @@
           <w:color w:val="404040"/>
           <w:sz w:val="20"/>
         </w:rPr>
-        <w:t>ROL 3 — Carga masiva y ciclo de compras (ERP)   ·   Responsable: Alberto Josué Hernández Armas</w:t>
+        <w:t>ROL 3 — Carga masiva y ciclo de compras (</w:t>
+      </w:r>
+      <w:proofErr w:type="gramStart"/>
+      <w:r>
+        <w:rPr>
+          <w:b/>
+          <w:color w:val="404040"/>
+          <w:sz w:val="20"/>
+        </w:rPr>
+        <w:t xml:space="preserve">ERP)   </w:t>
+      </w:r>
+      <w:proofErr w:type="gramEnd"/>
+      <w:r>
+        <w:rPr>
+          <w:b/>
+          <w:color w:val="404040"/>
+          <w:sz w:val="20"/>
+        </w:rPr>
+        <w:t>·   Responsable: Alberto Josué Hernández Armas</w:t>
       </w:r>
     </w:p>
     <w:p>
@@ -10681,6 +11269,7 @@
                 <w:b/>
                 <w:sz w:val="20"/>
               </w:rPr>
+              <w:lastRenderedPageBreak/>
               <w:t>Código</w:t>
             </w:r>
           </w:p>
@@ -10986,16 +11575,61 @@
           <w:color w:val="808080"/>
           <w:sz w:val="20"/>
         </w:rPr>
-        <w:t xml:space="preserve">Explicar cómo se implementó la requisición en Odoo 18 Community, que no tiene un documento llamado así: la requisición nace de la alerta de stock bajo (regla de reabastecimiento) y se convierte en solicitud de cotización al </w:t>
+        <w:t xml:space="preserve">Explicar cómo se implementó la requisición en </w:t>
       </w:r>
+      <w:proofErr w:type="spellStart"/>
       <w:r>
         <w:rPr>
           <w:i/>
           <w:color w:val="808080"/>
           <w:sz w:val="20"/>
         </w:rPr>
-        <w:lastRenderedPageBreak/>
-        <w:t>proveedor. Si instalaron Acuerdos de compra (licitación) para comparar dos proveedores, decirlo aquí. Luego la solicitud de cotización se confirma como orden de compra y la mercadería se recibe. Una fila por documento, con su número real de Odoo (P0000x, WH/IN/0000x).</w:t>
+        <w:t>Odoo</w:t>
+      </w:r>
+      <w:proofErr w:type="spellEnd"/>
+      <w:r>
+        <w:rPr>
+          <w:i/>
+          <w:color w:val="808080"/>
+          <w:sz w:val="20"/>
+        </w:rPr>
+        <w:t xml:space="preserve"> 18 </w:t>
+      </w:r>
+      <w:proofErr w:type="spellStart"/>
+      <w:r>
+        <w:rPr>
+          <w:i/>
+          <w:color w:val="808080"/>
+          <w:sz w:val="20"/>
+        </w:rPr>
+        <w:t>Community</w:t>
+      </w:r>
+      <w:proofErr w:type="spellEnd"/>
+      <w:r>
+        <w:rPr>
+          <w:i/>
+          <w:color w:val="808080"/>
+          <w:sz w:val="20"/>
+        </w:rPr>
+        <w:t xml:space="preserve">, que no tiene un documento llamado así: la requisición nace de la alerta de stock bajo (regla de reabastecimiento) y se convierte en solicitud de cotización al proveedor. Si instalaron Acuerdos de compra (licitación) para comparar dos proveedores, decirlo aquí. Luego la solicitud de cotización se confirma como orden de compra y la mercadería se recibe. Una fila por documento, con su número real de </w:t>
+      </w:r>
+      <w:proofErr w:type="spellStart"/>
+      <w:r>
+        <w:rPr>
+          <w:i/>
+          <w:color w:val="808080"/>
+          <w:sz w:val="20"/>
+        </w:rPr>
+        <w:t>Odoo</w:t>
+      </w:r>
+      <w:proofErr w:type="spellEnd"/>
+      <w:r>
+        <w:rPr>
+          <w:i/>
+          <w:color w:val="808080"/>
+          <w:sz w:val="20"/>
+        </w:rPr>
+        <w:t xml:space="preserve"> (P0000x, WH/IN/0000x).</w:t>
       </w:r>
     </w:p>
     <w:tbl>
@@ -11053,8 +11687,17 @@
                 <w:b/>
                 <w:sz w:val="20"/>
               </w:rPr>
-              <w:t>Documento en Odoo</w:t>
-            </w:r>
+              <w:t xml:space="preserve">Documento en </w:t>
+            </w:r>
+            <w:proofErr w:type="spellStart"/>
+            <w:r>
+              <w:rPr>
+                <w:b/>
+                <w:sz w:val="20"/>
+              </w:rPr>
+              <w:t>Odoo</w:t>
+            </w:r>
+            <w:proofErr w:type="spellEnd"/>
           </w:p>
         </w:tc>
         <w:tc>
@@ -12197,6 +12840,7 @@
                 <w:b/>
                 <w:sz w:val="20"/>
               </w:rPr>
+              <w:lastRenderedPageBreak/>
               <w:t>Producto</w:t>
             </w:r>
           </w:p>
@@ -12666,9 +13310,18 @@
           <w:color w:val="808080"/>
           <w:sz w:val="20"/>
         </w:rPr>
-        <w:lastRenderedPageBreak/>
-        <w:t>[ captura: historial de movimientos mostrando la entrada de FRE-001 desde el proveedor a WH/Existencias ]</w:t>
+        <w:t>[ captura: historial de movimientos mostrando la entrada de FRE-001 desde el proveedor a WH/</w:t>
       </w:r>
+      <w:proofErr w:type="gramStart"/>
+      <w:r>
+        <w:rPr>
+          <w:i/>
+          <w:color w:val="808080"/>
+          <w:sz w:val="20"/>
+        </w:rPr>
+        <w:t>Existencias ]</w:t>
+      </w:r>
+      <w:proofErr w:type="gramEnd"/>
     </w:p>
     <w:p>
       <w:pPr>
@@ -12988,6 +13641,7 @@
       </w:pPr>
       <w:bookmarkStart w:id="21" w:name="_Toc241501392"/>
       <w:r>
+        <w:lastRenderedPageBreak/>
         <w:t>Cotizaciones generadas</w:t>
       </w:r>
       <w:bookmarkEnd w:id="21"/>
@@ -13088,8 +13742,17 @@
                 <w:b/>
                 <w:sz w:val="20"/>
               </w:rPr>
-              <w:t>Número en Odoo</w:t>
-            </w:r>
+              <w:t xml:space="preserve">Número en </w:t>
+            </w:r>
+            <w:proofErr w:type="spellStart"/>
+            <w:r>
+              <w:rPr>
+                <w:b/>
+                <w:sz w:val="20"/>
+              </w:rPr>
+              <w:t>Odoo</w:t>
+            </w:r>
+            <w:proofErr w:type="spellEnd"/>
           </w:p>
         </w:tc>
         <w:tc>
@@ -13268,11 +13931,19 @@
               <w:spacing w:after="0"/>
               <w:jc w:val="left"/>
             </w:pPr>
-            <w:r>
-              <w:rPr>
-                <w:sz w:val="20"/>
-              </w:rPr>
-              <w:t>MotoClínica Villa Nueva</w:t>
+            <w:proofErr w:type="spellStart"/>
+            <w:r>
+              <w:rPr>
+                <w:sz w:val="20"/>
+              </w:rPr>
+              <w:t>MotoClínica</w:t>
+            </w:r>
+            <w:proofErr w:type="spellEnd"/>
+            <w:r>
+              <w:rPr>
+                <w:sz w:val="20"/>
+              </w:rPr>
+              <w:t xml:space="preserve"> Villa Nueva</w:t>
             </w:r>
           </w:p>
         </w:tc>
@@ -13560,7 +14231,6 @@
       </w:pPr>
       <w:bookmarkStart w:id="22" w:name="_Toc241501393"/>
       <w:r>
-        <w:lastRenderedPageBreak/>
         <w:t>De la cotización al pedido y a la venta</w:t>
       </w:r>
       <w:bookmarkEnd w:id="22"/>
@@ -14029,7 +14699,25 @@
           <w:color w:val="808080"/>
           <w:sz w:val="20"/>
         </w:rPr>
-        <w:t>El enunciado pide un reporte con tres cosas: existencias actuales, órdenes pendientes de proveedores y alertas de stock bajo. Se hace con los reportes nativos de Odoo (y se exporta a Excel como respaldo). Hacerlo DESPUÉS de que el rol 3 cierre las compras y vos las cotizaciones, para que los números sean los finales. Detalle en el MU-02, capítulo 4.</w:t>
+        <w:t xml:space="preserve">El enunciado pide un reporte con tres cosas: existencias actuales, órdenes pendientes de proveedores y alertas de stock bajo. Se hace con los reportes nativos de </w:t>
+      </w:r>
+      <w:proofErr w:type="spellStart"/>
+      <w:r>
+        <w:rPr>
+          <w:i/>
+          <w:color w:val="808080"/>
+          <w:sz w:val="20"/>
+        </w:rPr>
+        <w:t>Odoo</w:t>
+      </w:r>
+      <w:proofErr w:type="spellEnd"/>
+      <w:r>
+        <w:rPr>
+          <w:i/>
+          <w:color w:val="808080"/>
+          <w:sz w:val="20"/>
+        </w:rPr>
+        <w:t xml:space="preserve"> (y se exporta a Excel como respaldo). Hacerlo DESPUÉS de que el rol 3 cierre las compras y vos las cotizaciones, para que los números sean los finales. Detalle en el MU-02, capítulo 4.</w:t>
       </w:r>
     </w:p>
     <w:p>
@@ -14089,6 +14777,7 @@
                 <w:b/>
                 <w:sz w:val="20"/>
               </w:rPr>
+              <w:lastRenderedPageBreak/>
               <w:t>Categoría</w:t>
             </w:r>
           </w:p>
@@ -14602,9 +15291,18 @@
           <w:color w:val="808080"/>
           <w:sz w:val="20"/>
         </w:rPr>
-        <w:lastRenderedPageBreak/>
-        <w:t>[ captura: reporte de existencias agrupado por categoría de producto ]</w:t>
+        <w:t xml:space="preserve">[ captura: reporte de existencias agrupado por categoría de </w:t>
       </w:r>
+      <w:proofErr w:type="gramStart"/>
+      <w:r>
+        <w:rPr>
+          <w:i/>
+          <w:color w:val="808080"/>
+          <w:sz w:val="20"/>
+        </w:rPr>
+        <w:t>producto ]</w:t>
+      </w:r>
+      <w:proofErr w:type="gramEnd"/>
     </w:p>
     <w:p>
       <w:pPr>
@@ -15340,6 +16038,7 @@
       </w:pPr>
       <w:bookmarkStart w:id="27" w:name="_Toc241501398"/>
       <w:r>
+        <w:lastRenderedPageBreak/>
         <w:t>Plantillas de correo electrónico</w:t>
       </w:r>
       <w:bookmarkEnd w:id="27"/>
@@ -15411,7 +16110,6 @@
                 <w:b/>
                 <w:sz w:val="20"/>
               </w:rPr>
-              <w:lastRenderedPageBreak/>
               <w:t>Elemento exigido</w:t>
             </w:r>
           </w:p>
@@ -15488,7 +16186,20 @@
               <w:keepNext/>
               <w:spacing w:after="0"/>
               <w:jc w:val="left"/>
-            </w:pPr>
+              <w:rPr>
+                <w:sz w:val="20"/>
+                <w:szCs w:val="20"/>
+                <w:lang w:val="es-US"/>
+              </w:rPr>
+            </w:pPr>
+            <w:r>
+              <w:rPr>
+                <w:sz w:val="20"/>
+                <w:szCs w:val="20"/>
+                <w:lang w:val="es-US"/>
+              </w:rPr>
+              <w:t>Semana del mantenimiento: 15 % en tu kit de cambio de aceite</w:t>
+            </w:r>
           </w:p>
         </w:tc>
         <w:tc>
@@ -15500,7 +16211,38 @@
               <w:keepNext/>
               <w:spacing w:after="0"/>
               <w:jc w:val="left"/>
-            </w:pPr>
+              <w:rPr>
+                <w:sz w:val="20"/>
+                <w:szCs w:val="20"/>
+                <w:lang w:val="es-US"/>
+              </w:rPr>
+            </w:pPr>
+            <w:r>
+              <w:rPr>
+                <w:sz w:val="20"/>
+                <w:szCs w:val="20"/>
+                <w:lang w:val="es-US"/>
+              </w:rPr>
+              <w:t xml:space="preserve">Gracias por rodar con </w:t>
+            </w:r>
+            <w:proofErr w:type="spellStart"/>
+            <w:r>
+              <w:rPr>
+                <w:sz w:val="20"/>
+                <w:szCs w:val="20"/>
+                <w:lang w:val="es-US"/>
+              </w:rPr>
+              <w:t>RutaMoto</w:t>
+            </w:r>
+            <w:proofErr w:type="spellEnd"/>
+            <w:r>
+              <w:rPr>
+                <w:sz w:val="20"/>
+                <w:szCs w:val="20"/>
+                <w:lang w:val="es-US"/>
+              </w:rPr>
+              <w:t>: te guardamos un 10 %</w:t>
+            </w:r>
           </w:p>
         </w:tc>
       </w:tr>
@@ -15535,7 +16277,38 @@
               <w:keepNext/>
               <w:spacing w:after="0"/>
               <w:jc w:val="left"/>
-            </w:pPr>
+              <w:rPr>
+                <w:sz w:val="20"/>
+                <w:szCs w:val="20"/>
+                <w:lang w:val="es-US"/>
+              </w:rPr>
+            </w:pPr>
+            <w:r>
+              <w:rPr>
+                <w:sz w:val="20"/>
+                <w:szCs w:val="20"/>
+                <w:lang w:val="es-US"/>
+              </w:rPr>
+              <w:t> </w:t>
+            </w:r>
+            <w:proofErr w:type="spellStart"/>
+            <w:r>
+              <w:rPr>
+                <w:sz w:val="20"/>
+                <w:szCs w:val="20"/>
+                <w:lang w:val="es-US"/>
+              </w:rPr>
+              <w:t>RutaMoto</w:t>
+            </w:r>
+            <w:proofErr w:type="spellEnd"/>
+            <w:r>
+              <w:rPr>
+                <w:sz w:val="20"/>
+                <w:szCs w:val="20"/>
+                <w:lang w:val="es-US"/>
+              </w:rPr>
+              <w:t xml:space="preserve"> (Aparece en el encabezado) </w:t>
+            </w:r>
           </w:p>
         </w:tc>
         <w:tc>
@@ -15547,7 +16320,38 @@
               <w:keepNext/>
               <w:spacing w:after="0"/>
               <w:jc w:val="left"/>
-            </w:pPr>
+              <w:rPr>
+                <w:sz w:val="20"/>
+                <w:szCs w:val="20"/>
+                <w:lang w:val="es-US"/>
+              </w:rPr>
+            </w:pPr>
+            <w:r>
+              <w:rPr>
+                <w:sz w:val="20"/>
+                <w:szCs w:val="20"/>
+                <w:lang w:val="es-US"/>
+              </w:rPr>
+              <w:t> </w:t>
+            </w:r>
+            <w:proofErr w:type="spellStart"/>
+            <w:r>
+              <w:rPr>
+                <w:sz w:val="20"/>
+                <w:szCs w:val="20"/>
+                <w:lang w:val="es-US"/>
+              </w:rPr>
+              <w:t>RutaMoto</w:t>
+            </w:r>
+            <w:proofErr w:type="spellEnd"/>
+            <w:r>
+              <w:rPr>
+                <w:sz w:val="20"/>
+                <w:szCs w:val="20"/>
+                <w:lang w:val="es-US"/>
+              </w:rPr>
+              <w:t xml:space="preserve"> (Aparece en el encabezado) </w:t>
+            </w:r>
           </w:p>
         </w:tc>
       </w:tr>
@@ -15582,7 +16386,20 @@
               <w:keepNext/>
               <w:spacing w:after="0"/>
               <w:jc w:val="left"/>
-            </w:pPr>
+              <w:rPr>
+                <w:sz w:val="20"/>
+                <w:szCs w:val="20"/>
+                <w:lang w:val="es-US"/>
+              </w:rPr>
+            </w:pPr>
+            <w:r>
+              <w:rPr>
+                <w:sz w:val="20"/>
+                <w:szCs w:val="20"/>
+                <w:lang w:val="es-US"/>
+              </w:rPr>
+              <w:t>banner_promocion.png</w:t>
+            </w:r>
           </w:p>
         </w:tc>
         <w:tc>
@@ -15594,7 +16411,20 @@
               <w:keepNext/>
               <w:spacing w:after="0"/>
               <w:jc w:val="left"/>
-            </w:pPr>
+              <w:rPr>
+                <w:sz w:val="20"/>
+                <w:szCs w:val="20"/>
+                <w:lang w:val="es-US"/>
+              </w:rPr>
+            </w:pPr>
+            <w:r>
+              <w:rPr>
+                <w:sz w:val="20"/>
+                <w:szCs w:val="20"/>
+                <w:lang w:val="es-US"/>
+              </w:rPr>
+              <w:t>banner_fidelizacion.png</w:t>
+            </w:r>
           </w:p>
         </w:tc>
       </w:tr>
@@ -15629,7 +16459,20 @@
               <w:keepNext/>
               <w:spacing w:after="0"/>
               <w:jc w:val="left"/>
-            </w:pPr>
+              <w:rPr>
+                <w:sz w:val="20"/>
+                <w:szCs w:val="20"/>
+                <w:lang w:val="es-US"/>
+              </w:rPr>
+            </w:pPr>
+            <w:r>
+              <w:rPr>
+                <w:sz w:val="20"/>
+                <w:szCs w:val="20"/>
+                <w:lang w:val="es-US"/>
+              </w:rPr>
+              <w:t>Aprovecha nuestra semana del mantenimiento. Cotiza tu cambio de aceite con nosotros y obtén un 15% de descuento en el total de tu factura. ¡Mantén tu moto al 100%!</w:t>
+            </w:r>
           </w:p>
         </w:tc>
         <w:tc>
@@ -15641,7 +16484,20 @@
               <w:keepNext/>
               <w:spacing w:after="0"/>
               <w:jc w:val="left"/>
-            </w:pPr>
+              <w:rPr>
+                <w:sz w:val="20"/>
+                <w:szCs w:val="20"/>
+                <w:lang w:val="es-US"/>
+              </w:rPr>
+            </w:pPr>
+            <w:r>
+              <w:rPr>
+                <w:sz w:val="20"/>
+                <w:szCs w:val="20"/>
+                <w:lang w:val="es-US"/>
+              </w:rPr>
+              <w:t>Hola, notamos que ya casi es tiempo de tu próximo servicio. Como cliente recurrente, te regalamos un 10% de descuento en mano de obra.</w:t>
+            </w:r>
           </w:p>
         </w:tc>
       </w:tr>
@@ -15676,7 +16532,18 @@
               <w:keepNext/>
               <w:spacing w:after="0"/>
               <w:jc w:val="left"/>
-            </w:pPr>
+              <w:rPr>
+                <w:sz w:val="20"/>
+                <w:szCs w:val="20"/>
+              </w:rPr>
+            </w:pPr>
+            <w:r>
+              <w:rPr>
+                <w:sz w:val="20"/>
+                <w:szCs w:val="20"/>
+              </w:rPr>
+              <w:t>(Botón) Solicitar Cotización Ahora</w:t>
+            </w:r>
           </w:p>
         </w:tc>
         <w:tc>
@@ -15688,7 +16555,18 @@
               <w:keepNext/>
               <w:spacing w:after="0"/>
               <w:jc w:val="left"/>
-            </w:pPr>
+              <w:rPr>
+                <w:sz w:val="20"/>
+                <w:szCs w:val="20"/>
+              </w:rPr>
+            </w:pPr>
+            <w:r>
+              <w:rPr>
+                <w:sz w:val="20"/>
+                <w:szCs w:val="20"/>
+              </w:rPr>
+              <w:t>(Botón) Agendar mi Servicio</w:t>
+            </w:r>
           </w:p>
         </w:tc>
       </w:tr>
@@ -15721,7 +16599,18 @@
             <w:pPr>
               <w:spacing w:after="0"/>
               <w:jc w:val="left"/>
-            </w:pPr>
+              <w:rPr>
+                <w:sz w:val="20"/>
+                <w:szCs w:val="20"/>
+              </w:rPr>
+            </w:pPr>
+            <w:r>
+              <w:rPr>
+                <w:sz w:val="20"/>
+                <w:szCs w:val="20"/>
+              </w:rPr>
+              <w:t>Repartidores</w:t>
+            </w:r>
           </w:p>
         </w:tc>
         <w:tc>
@@ -15732,7 +16621,18 @@
             <w:pPr>
               <w:spacing w:after="0"/>
               <w:jc w:val="left"/>
-            </w:pPr>
+              <w:rPr>
+                <w:sz w:val="20"/>
+                <w:szCs w:val="20"/>
+              </w:rPr>
+            </w:pPr>
+            <w:r>
+              <w:rPr>
+                <w:sz w:val="20"/>
+                <w:szCs w:val="20"/>
+              </w:rPr>
+              <w:t>Clientes / Entusiastas</w:t>
+            </w:r>
           </w:p>
         </w:tc>
       </w:tr>
@@ -15769,8 +16669,18 @@
           <w:color w:val="808080"/>
           <w:sz w:val="20"/>
         </w:rPr>
-        <w:t>[ captura: plantilla 1 terminada en el editor de Email Marketing ]</w:t>
+        <w:t xml:space="preserve">[ captura: plantilla 1 terminada en el editor de Email </w:t>
       </w:r>
+      <w:proofErr w:type="gramStart"/>
+      <w:r>
+        <w:rPr>
+          <w:i/>
+          <w:color w:val="808080"/>
+          <w:sz w:val="20"/>
+        </w:rPr>
+        <w:t>Marketing ]</w:t>
+      </w:r>
+      <w:proofErr w:type="gramEnd"/>
     </w:p>
     <w:p>
       <w:pPr>
@@ -15804,8 +16714,18 @@
           <w:color w:val="808080"/>
           <w:sz w:val="20"/>
         </w:rPr>
-        <w:t>[ captura: plantilla 2 terminada en el editor de Email Marketing ]</w:t>
+        <w:t xml:space="preserve">[ captura: plantilla 2 terminada en el editor de Email </w:t>
       </w:r>
+      <w:proofErr w:type="gramStart"/>
+      <w:r>
+        <w:rPr>
+          <w:i/>
+          <w:color w:val="808080"/>
+          <w:sz w:val="20"/>
+        </w:rPr>
+        <w:t>Marketing ]</w:t>
+      </w:r>
+      <w:proofErr w:type="gramEnd"/>
     </w:p>
     <w:p>
       <w:pPr>
@@ -15827,6 +16747,7 @@
       </w:pPr>
       <w:bookmarkStart w:id="28" w:name="_Toc241501399"/>
       <w:r>
+        <w:lastRenderedPageBreak/>
         <w:t>Campaña publicitaria en el CRM</w:t>
       </w:r>
       <w:bookmarkEnd w:id="28"/>
@@ -15852,23 +16773,10 @@
         <w:t>ROL 4 — CRM: correo, campañas y pipeline   ·   Responsable: Brayan Emanuel García</w:t>
       </w:r>
     </w:p>
-    <w:p>
-      <w:pPr>
-        <w:spacing w:after="120"/>
-      </w:pPr>
-      <w:r>
-        <w:rPr>
-          <w:i/>
-          <w:color w:val="808080"/>
-          <w:sz w:val="20"/>
-        </w:rPr>
-        <w:t>La otra parte de los 10 puntos. El enunciado pide seleccionar al menos un segmento, asociarle una de las plantillas y simular el proceso completo. La rúbrica: «Se configuran plantillas y se ejecuta una campaña correctamente». Mostrar el filtro del segmento, el envío y la evidencia de que los correos salieron (estadísticas de la campaña y los correos recibidos en el servidor de correo).</w:t>
-      </w:r>
-    </w:p>
     <w:tbl>
       <w:tblPr>
         <w:tblStyle w:val="Tablaconcuadrcula"/>
-        <w:tblW w:w="0" w:type="auto"/>
+        <w:tblW w:w="9360" w:type="dxa"/>
         <w:tblLayout w:type="fixed"/>
         <w:tblLook w:val="04A0" w:firstRow="1" w:lastRow="0" w:firstColumn="1" w:lastColumn="0" w:noHBand="0" w:noVBand="1"/>
       </w:tblPr>
@@ -15935,10 +16843,15 @@
               <w:keepNext/>
               <w:spacing w:after="0"/>
               <w:jc w:val="left"/>
-            </w:pPr>
-            <w:r>
-              <w:rPr>
-                <w:sz w:val="20"/>
+              <w:rPr>
+                <w:sz w:val="20"/>
+                <w:szCs w:val="20"/>
+              </w:rPr>
+            </w:pPr>
+            <w:r>
+              <w:rPr>
+                <w:sz w:val="20"/>
+                <w:szCs w:val="20"/>
               </w:rPr>
               <w:t>Nombre de la campaña</w:t>
             </w:r>
@@ -15953,7 +16866,20 @@
               <w:keepNext/>
               <w:spacing w:after="0"/>
               <w:jc w:val="left"/>
-            </w:pPr>
+              <w:rPr>
+                <w:sz w:val="20"/>
+                <w:szCs w:val="20"/>
+                <w:lang w:val="es-US"/>
+              </w:rPr>
+            </w:pPr>
+            <w:r>
+              <w:rPr>
+                <w:sz w:val="20"/>
+                <w:szCs w:val="20"/>
+                <w:lang w:val="es-US"/>
+              </w:rPr>
+              <w:t>Promoción Repartidores Octubre</w:t>
+            </w:r>
           </w:p>
         </w:tc>
       </w:tr>
@@ -15970,10 +16896,15 @@
               <w:keepNext/>
               <w:spacing w:after="0"/>
               <w:jc w:val="left"/>
-            </w:pPr>
-            <w:r>
-              <w:rPr>
-                <w:sz w:val="20"/>
+              <w:rPr>
+                <w:sz w:val="20"/>
+                <w:szCs w:val="20"/>
+              </w:rPr>
+            </w:pPr>
+            <w:r>
+              <w:rPr>
+                <w:sz w:val="20"/>
+                <w:szCs w:val="20"/>
               </w:rPr>
               <w:t>Plantilla asociada</w:t>
             </w:r>
@@ -15988,7 +16919,20 @@
               <w:keepNext/>
               <w:spacing w:after="0"/>
               <w:jc w:val="left"/>
-            </w:pPr>
+              <w:rPr>
+                <w:sz w:val="20"/>
+                <w:szCs w:val="20"/>
+                <w:lang w:val="es-US"/>
+              </w:rPr>
+            </w:pPr>
+            <w:r>
+              <w:rPr>
+                <w:sz w:val="20"/>
+                <w:szCs w:val="20"/>
+                <w:lang w:val="es-US"/>
+              </w:rPr>
+              <w:t>Plantilla 1: Promoción especial</w:t>
+            </w:r>
           </w:p>
         </w:tc>
       </w:tr>
@@ -16005,10 +16949,15 @@
               <w:keepNext/>
               <w:spacing w:after="0"/>
               <w:jc w:val="left"/>
-            </w:pPr>
-            <w:r>
-              <w:rPr>
-                <w:sz w:val="20"/>
+              <w:rPr>
+                <w:sz w:val="20"/>
+                <w:szCs w:val="20"/>
+              </w:rPr>
+            </w:pPr>
+            <w:r>
+              <w:rPr>
+                <w:sz w:val="20"/>
+                <w:szCs w:val="20"/>
               </w:rPr>
               <w:t>Segmento (filtro de destinatarios)</w:t>
             </w:r>
@@ -16023,7 +16972,20 @@
               <w:keepNext/>
               <w:spacing w:after="0"/>
               <w:jc w:val="left"/>
-            </w:pPr>
+              <w:rPr>
+                <w:sz w:val="20"/>
+                <w:szCs w:val="20"/>
+                <w:lang w:val="es-US"/>
+              </w:rPr>
+            </w:pPr>
+            <w:r>
+              <w:rPr>
+                <w:sz w:val="20"/>
+                <w:szCs w:val="20"/>
+                <w:lang w:val="es-US"/>
+              </w:rPr>
+              <w:t>Etiquetas contiene «Repartidor»</w:t>
+            </w:r>
           </w:p>
         </w:tc>
       </w:tr>
@@ -16040,10 +17002,15 @@
               <w:keepNext/>
               <w:spacing w:after="0"/>
               <w:jc w:val="left"/>
-            </w:pPr>
-            <w:r>
-              <w:rPr>
-                <w:sz w:val="20"/>
+              <w:rPr>
+                <w:sz w:val="20"/>
+                <w:szCs w:val="20"/>
+              </w:rPr>
+            </w:pPr>
+            <w:r>
+              <w:rPr>
+                <w:sz w:val="20"/>
+                <w:szCs w:val="20"/>
               </w:rPr>
               <w:t>Destinatarios</w:t>
             </w:r>
@@ -16058,7 +17025,20 @@
               <w:keepNext/>
               <w:spacing w:after="0"/>
               <w:jc w:val="left"/>
-            </w:pPr>
+              <w:rPr>
+                <w:sz w:val="20"/>
+                <w:szCs w:val="20"/>
+                <w:lang w:val="es-US"/>
+              </w:rPr>
+            </w:pPr>
+            <w:r>
+              <w:rPr>
+                <w:sz w:val="20"/>
+                <w:szCs w:val="20"/>
+                <w:lang w:val="es-US"/>
+              </w:rPr>
+              <w:t>13 (12 de carga masiva + 1 manual)</w:t>
+            </w:r>
           </w:p>
         </w:tc>
       </w:tr>
@@ -16075,10 +17055,15 @@
               <w:keepNext/>
               <w:spacing w:after="0"/>
               <w:jc w:val="left"/>
-            </w:pPr>
-            <w:r>
-              <w:rPr>
-                <w:sz w:val="20"/>
+              <w:rPr>
+                <w:sz w:val="20"/>
+                <w:szCs w:val="20"/>
+              </w:rPr>
+            </w:pPr>
+            <w:r>
+              <w:rPr>
+                <w:sz w:val="20"/>
+                <w:szCs w:val="20"/>
               </w:rPr>
               <w:t>Fecha y hora de envío</w:t>
             </w:r>
@@ -16093,6 +17078,10 @@
               <w:keepNext/>
               <w:spacing w:after="0"/>
               <w:jc w:val="left"/>
+              <w:rPr>
+                <w:sz w:val="20"/>
+                <w:szCs w:val="20"/>
+              </w:rPr>
             </w:pPr>
           </w:p>
         </w:tc>
@@ -16109,10 +17098,15 @@
             <w:pPr>
               <w:spacing w:after="0"/>
               <w:jc w:val="left"/>
-            </w:pPr>
-            <w:r>
-              <w:rPr>
-                <w:sz w:val="20"/>
+              <w:rPr>
+                <w:sz w:val="20"/>
+                <w:szCs w:val="20"/>
+              </w:rPr>
+            </w:pPr>
+            <w:r>
+              <w:rPr>
+                <w:sz w:val="20"/>
+                <w:szCs w:val="20"/>
               </w:rPr>
               <w:t>Enviados / entregados / fallidos</w:t>
             </w:r>
@@ -16126,7 +17120,20 @@
             <w:pPr>
               <w:spacing w:after="0"/>
               <w:jc w:val="left"/>
-            </w:pPr>
+              <w:rPr>
+                <w:sz w:val="20"/>
+                <w:szCs w:val="20"/>
+                <w:lang w:val="es-US"/>
+              </w:rPr>
+            </w:pPr>
+            <w:r>
+              <w:rPr>
+                <w:sz w:val="20"/>
+                <w:szCs w:val="20"/>
+                <w:lang w:val="es-US"/>
+              </w:rPr>
+              <w:t> 13 / 13 / 0</w:t>
+            </w:r>
           </w:p>
         </w:tc>
       </w:tr>
@@ -16163,9 +17170,18 @@
           <w:color w:val="808080"/>
           <w:sz w:val="20"/>
         </w:rPr>
-        <w:lastRenderedPageBreak/>
-        <w:t>[ captura: estadísticas de la campaña enviada en Email Marketing ]</w:t>
+        <w:t xml:space="preserve">[ captura: estadísticas de la campaña enviada en Email </w:t>
       </w:r>
+      <w:proofErr w:type="gramStart"/>
+      <w:r>
+        <w:rPr>
+          <w:i/>
+          <w:color w:val="808080"/>
+          <w:sz w:val="20"/>
+        </w:rPr>
+        <w:t>Marketing ]</w:t>
+      </w:r>
+      <w:proofErr w:type="gramEnd"/>
     </w:p>
     <w:p>
       <w:pPr>
@@ -16199,8 +17215,18 @@
           <w:color w:val="808080"/>
           <w:sz w:val="20"/>
         </w:rPr>
-        <w:t>[ captura: bandeja del servidor de correo con los mensajes de la campaña recibidos ]</w:t>
+        <w:t xml:space="preserve">[ captura: bandeja del servidor de correo con los mensajes de la campaña </w:t>
       </w:r>
+      <w:proofErr w:type="gramStart"/>
+      <w:r>
+        <w:rPr>
+          <w:i/>
+          <w:color w:val="808080"/>
+          <w:sz w:val="20"/>
+        </w:rPr>
+        <w:t>recibidos ]</w:t>
+      </w:r>
+      <w:proofErr w:type="gramEnd"/>
     </w:p>
     <w:p>
       <w:pPr>
@@ -16245,19 +17271,6 @@
           <w:sz w:val="20"/>
         </w:rPr>
         <w:t>ROL 4 — CRM: correo, campañas y pipeline   ·   Responsable: Brayan Emanuel García</w:t>
-      </w:r>
-    </w:p>
-    <w:p>
-      <w:pPr>
-        <w:spacing w:after="120"/>
-      </w:pPr>
-      <w:r>
-        <w:rPr>
-          <w:i/>
-          <w:color w:val="808080"/>
-          <w:sz w:val="20"/>
-        </w:rPr>
-        <w:t>El enunciado pide al menos 4 etapas, un mínimo de 5 clientes ficticios repartidos en ellas y al menos uno movido por TODAS las etapas mostrando la trazabilidad. Los clientes salen de la base cargada (talleres y entusiastas). La trazabilidad se demuestra con el historial de la oportunidad, que registra cada cambio de etapa con fecha y usuario. Detalle en el MU-03, capítulo 4.</w:t>
       </w:r>
     </w:p>
     <w:tbl>
@@ -16313,8 +17326,17 @@
                 <w:b/>
                 <w:sz w:val="20"/>
               </w:rPr>
-              <w:t>Qué significa en RutaMoto</w:t>
-            </w:r>
+              <w:t xml:space="preserve">Qué significa en </w:t>
+            </w:r>
+            <w:proofErr w:type="spellStart"/>
+            <w:r>
+              <w:rPr>
+                <w:b/>
+                <w:sz w:val="20"/>
+              </w:rPr>
+              <w:t>RutaMoto</w:t>
+            </w:r>
+            <w:proofErr w:type="spellEnd"/>
           </w:p>
         </w:tc>
         <w:tc>
@@ -16369,7 +17391,18 @@
               <w:keepNext/>
               <w:spacing w:after="0"/>
               <w:jc w:val="left"/>
-            </w:pPr>
+              <w:rPr>
+                <w:sz w:val="20"/>
+                <w:szCs w:val="20"/>
+              </w:rPr>
+            </w:pPr>
+            <w:r>
+              <w:rPr>
+                <w:sz w:val="20"/>
+                <w:szCs w:val="20"/>
+              </w:rPr>
+              <w:t>Contacto inicial o prospecto interesado que aún no ha sido atendido.</w:t>
+            </w:r>
           </w:p>
         </w:tc>
         <w:tc>
@@ -16381,7 +17414,18 @@
               <w:keepNext/>
               <w:spacing w:after="0"/>
               <w:jc w:val="left"/>
-            </w:pPr>
+              <w:rPr>
+                <w:sz w:val="20"/>
+                <w:szCs w:val="20"/>
+              </w:rPr>
+            </w:pPr>
+            <w:r>
+              <w:rPr>
+                <w:sz w:val="20"/>
+                <w:szCs w:val="20"/>
+              </w:rPr>
+              <w:t>Se contacta al prospecto para conocer sus necesidades.</w:t>
+            </w:r>
           </w:p>
         </w:tc>
       </w:tr>
@@ -16416,7 +17460,18 @@
               <w:keepNext/>
               <w:spacing w:after="0"/>
               <w:jc w:val="left"/>
-            </w:pPr>
+              <w:rPr>
+                <w:sz w:val="20"/>
+                <w:szCs w:val="20"/>
+              </w:rPr>
+            </w:pPr>
+            <w:r>
+              <w:rPr>
+                <w:sz w:val="20"/>
+                <w:szCs w:val="20"/>
+              </w:rPr>
+              <w:t>El vendedor ya se comunicó con el cliente y determinó los productos requeridos.</w:t>
+            </w:r>
           </w:p>
         </w:tc>
         <w:tc>
@@ -16428,7 +17483,18 @@
               <w:keepNext/>
               <w:spacing w:after="0"/>
               <w:jc w:val="left"/>
-            </w:pPr>
+              <w:rPr>
+                <w:sz w:val="20"/>
+                <w:szCs w:val="20"/>
+              </w:rPr>
+            </w:pPr>
+            <w:r>
+              <w:rPr>
+                <w:sz w:val="20"/>
+                <w:szCs w:val="20"/>
+              </w:rPr>
+              <w:t>Se generan los datos suficientes para crear una cotización formal.</w:t>
+            </w:r>
           </w:p>
         </w:tc>
       </w:tr>
@@ -16463,7 +17529,34 @@
               <w:keepNext/>
               <w:spacing w:after="0"/>
               <w:jc w:val="left"/>
-            </w:pPr>
+              <w:rPr>
+                <w:sz w:val="20"/>
+                <w:szCs w:val="20"/>
+              </w:rPr>
+            </w:pPr>
+            <w:r>
+              <w:rPr>
+                <w:sz w:val="20"/>
+                <w:szCs w:val="20"/>
+              </w:rPr>
+              <w:t xml:space="preserve">Se generó una cotización desde </w:t>
+            </w:r>
+            <w:proofErr w:type="spellStart"/>
+            <w:r>
+              <w:rPr>
+                <w:sz w:val="20"/>
+                <w:szCs w:val="20"/>
+              </w:rPr>
+              <w:t>Odoo</w:t>
+            </w:r>
+            <w:proofErr w:type="spellEnd"/>
+            <w:r>
+              <w:rPr>
+                <w:sz w:val="20"/>
+                <w:szCs w:val="20"/>
+              </w:rPr>
+              <w:t xml:space="preserve"> y se le envió por correo al cliente.</w:t>
+            </w:r>
           </w:p>
         </w:tc>
         <w:tc>
@@ -16475,7 +17568,18 @@
               <w:keepNext/>
               <w:spacing w:after="0"/>
               <w:jc w:val="left"/>
-            </w:pPr>
+              <w:rPr>
+                <w:sz w:val="20"/>
+                <w:szCs w:val="20"/>
+              </w:rPr>
+            </w:pPr>
+            <w:r>
+              <w:rPr>
+                <w:sz w:val="20"/>
+                <w:szCs w:val="20"/>
+              </w:rPr>
+              <w:t>El cliente responde a la propuesta negociando o aceptando.</w:t>
+            </w:r>
           </w:p>
         </w:tc>
       </w:tr>
@@ -16510,7 +17614,18 @@
               <w:keepNext/>
               <w:spacing w:after="0"/>
               <w:jc w:val="left"/>
-            </w:pPr>
+              <w:rPr>
+                <w:sz w:val="20"/>
+                <w:szCs w:val="20"/>
+              </w:rPr>
+            </w:pPr>
+            <w:r>
+              <w:rPr>
+                <w:sz w:val="20"/>
+                <w:szCs w:val="20"/>
+              </w:rPr>
+              <w:t>El cliente evalúa la cotización, pide cambios o descuentos.</w:t>
+            </w:r>
           </w:p>
         </w:tc>
         <w:tc>
@@ -16522,7 +17637,18 @@
               <w:keepNext/>
               <w:spacing w:after="0"/>
               <w:jc w:val="left"/>
-            </w:pPr>
+              <w:rPr>
+                <w:sz w:val="20"/>
+                <w:szCs w:val="20"/>
+              </w:rPr>
+            </w:pPr>
+            <w:r>
+              <w:rPr>
+                <w:sz w:val="20"/>
+                <w:szCs w:val="20"/>
+              </w:rPr>
+              <w:t>El cliente acepta formalmente el monto.</w:t>
+            </w:r>
           </w:p>
         </w:tc>
       </w:tr>
@@ -16555,7 +17681,18 @@
             <w:pPr>
               <w:spacing w:after="0"/>
               <w:jc w:val="left"/>
-            </w:pPr>
+              <w:rPr>
+                <w:sz w:val="20"/>
+                <w:szCs w:val="20"/>
+              </w:rPr>
+            </w:pPr>
+            <w:r>
+              <w:rPr>
+                <w:sz w:val="20"/>
+                <w:szCs w:val="20"/>
+              </w:rPr>
+              <w:t>Desenlace del negocio. Se cierra la venta (Ganado) o se rechaza (Perdido).</w:t>
+            </w:r>
           </w:p>
         </w:tc>
         <w:tc>
@@ -16566,7 +17703,18 @@
             <w:pPr>
               <w:spacing w:after="0"/>
               <w:jc w:val="left"/>
-            </w:pPr>
+              <w:rPr>
+                <w:sz w:val="20"/>
+                <w:szCs w:val="20"/>
+              </w:rPr>
+            </w:pPr>
+            <w:r>
+              <w:rPr>
+                <w:sz w:val="20"/>
+                <w:szCs w:val="20"/>
+              </w:rPr>
+              <w:t>Etapa final del flujo de ventas.</w:t>
+            </w:r>
           </w:p>
         </w:tc>
       </w:tr>
@@ -16594,10 +17742,9 @@
       </w:tblPr>
       <w:tblGrid>
         <w:gridCol w:w="2433"/>
-        <w:gridCol w:w="2433"/>
-        <w:gridCol w:w="1497"/>
-        <w:gridCol w:w="1497"/>
-        <w:gridCol w:w="1497"/>
+        <w:gridCol w:w="2240"/>
+        <w:gridCol w:w="2126"/>
+        <w:gridCol w:w="1843"/>
       </w:tblGrid>
       <w:tr>
         <w:trPr>
@@ -16620,13 +17767,14 @@
                 <w:b/>
                 <w:sz w:val="20"/>
               </w:rPr>
-              <w:t>Oportunidad</w:t>
-            </w:r>
-          </w:p>
-        </w:tc>
-        <w:tc>
-          <w:tcPr>
-            <w:tcW w:w="2433" w:type="dxa"/>
+              <w:lastRenderedPageBreak/>
+              <w:t>Oportunidad (cliente)</w:t>
+            </w:r>
+          </w:p>
+        </w:tc>
+        <w:tc>
+          <w:tcPr>
+            <w:tcW w:w="2240" w:type="dxa"/>
             <w:shd w:val="clear" w:color="auto" w:fill="D9D9D9"/>
           </w:tcPr>
           <w:p>
@@ -16640,13 +17788,13 @@
                 <w:b/>
                 <w:sz w:val="20"/>
               </w:rPr>
-              <w:t>Cliente</w:t>
-            </w:r>
-          </w:p>
-        </w:tc>
-        <w:tc>
-          <w:tcPr>
-            <w:tcW w:w="1497" w:type="dxa"/>
+              <w:t>Segmento</w:t>
+            </w:r>
+          </w:p>
+        </w:tc>
+        <w:tc>
+          <w:tcPr>
+            <w:tcW w:w="2126" w:type="dxa"/>
             <w:shd w:val="clear" w:color="auto" w:fill="D9D9D9"/>
           </w:tcPr>
           <w:p>
@@ -16660,33 +17808,13 @@
                 <w:b/>
                 <w:sz w:val="20"/>
               </w:rPr>
-              <w:t>Segmento</w:t>
-            </w:r>
-          </w:p>
-        </w:tc>
-        <w:tc>
-          <w:tcPr>
-            <w:tcW w:w="1497" w:type="dxa"/>
-            <w:shd w:val="clear" w:color="auto" w:fill="D9D9D9"/>
-          </w:tcPr>
-          <w:p>
-            <w:pPr>
-              <w:keepNext/>
-              <w:spacing w:after="0"/>
-              <w:jc w:val="left"/>
-            </w:pPr>
-            <w:r>
-              <w:rPr>
-                <w:b/>
-                <w:sz w:val="20"/>
-              </w:rPr>
               <w:t>Ingreso esperado</w:t>
             </w:r>
           </w:p>
         </w:tc>
         <w:tc>
           <w:tcPr>
-            <w:tcW w:w="1497" w:type="dxa"/>
+            <w:tcW w:w="1843" w:type="dxa"/>
             <w:shd w:val="clear" w:color="auto" w:fill="D9D9D9"/>
           </w:tcPr>
           <w:p>
@@ -16718,55 +17846,87 @@
               <w:keepNext/>
               <w:spacing w:after="0"/>
               <w:jc w:val="left"/>
-            </w:pPr>
-          </w:p>
-        </w:tc>
-        <w:tc>
-          <w:tcPr>
-            <w:tcW w:w="2433" w:type="dxa"/>
-          </w:tcPr>
-          <w:p>
-            <w:pPr>
-              <w:keepNext/>
-              <w:spacing w:after="0"/>
-              <w:jc w:val="left"/>
-            </w:pPr>
-          </w:p>
-        </w:tc>
-        <w:tc>
-          <w:tcPr>
-            <w:tcW w:w="1497" w:type="dxa"/>
-          </w:tcPr>
-          <w:p>
-            <w:pPr>
-              <w:keepNext/>
-              <w:spacing w:after="0"/>
-              <w:jc w:val="left"/>
-            </w:pPr>
-          </w:p>
-        </w:tc>
-        <w:tc>
-          <w:tcPr>
-            <w:tcW w:w="1497" w:type="dxa"/>
-          </w:tcPr>
-          <w:p>
-            <w:pPr>
-              <w:keepNext/>
-              <w:spacing w:after="0"/>
-              <w:jc w:val="left"/>
-            </w:pPr>
-          </w:p>
-        </w:tc>
-        <w:tc>
-          <w:tcPr>
-            <w:tcW w:w="1497" w:type="dxa"/>
-          </w:tcPr>
-          <w:p>
-            <w:pPr>
-              <w:keepNext/>
-              <w:spacing w:after="0"/>
-              <w:jc w:val="left"/>
-            </w:pPr>
+              <w:rPr>
+                <w:sz w:val="20"/>
+                <w:szCs w:val="20"/>
+              </w:rPr>
+            </w:pPr>
+            <w:r>
+              <w:rPr>
+                <w:sz w:val="20"/>
+                <w:szCs w:val="20"/>
+              </w:rPr>
+              <w:t>Taller Moto Express Zona 7</w:t>
+            </w:r>
+          </w:p>
+        </w:tc>
+        <w:tc>
+          <w:tcPr>
+            <w:tcW w:w="2240" w:type="dxa"/>
+          </w:tcPr>
+          <w:p>
+            <w:pPr>
+              <w:keepNext/>
+              <w:spacing w:after="0"/>
+              <w:jc w:val="left"/>
+              <w:rPr>
+                <w:sz w:val="20"/>
+                <w:szCs w:val="20"/>
+              </w:rPr>
+            </w:pPr>
+            <w:r>
+              <w:rPr>
+                <w:sz w:val="20"/>
+                <w:szCs w:val="20"/>
+              </w:rPr>
+              <w:t>Taller</w:t>
+            </w:r>
+          </w:p>
+        </w:tc>
+        <w:tc>
+          <w:tcPr>
+            <w:tcW w:w="2126" w:type="dxa"/>
+          </w:tcPr>
+          <w:p>
+            <w:pPr>
+              <w:keepNext/>
+              <w:spacing w:after="0"/>
+              <w:jc w:val="left"/>
+              <w:rPr>
+                <w:sz w:val="20"/>
+                <w:szCs w:val="20"/>
+              </w:rPr>
+            </w:pPr>
+            <w:r>
+              <w:rPr>
+                <w:sz w:val="20"/>
+                <w:szCs w:val="20"/>
+              </w:rPr>
+              <w:t>Q 1,500.00</w:t>
+            </w:r>
+          </w:p>
+        </w:tc>
+        <w:tc>
+          <w:tcPr>
+            <w:tcW w:w="1843" w:type="dxa"/>
+          </w:tcPr>
+          <w:p>
+            <w:pPr>
+              <w:keepNext/>
+              <w:spacing w:after="0"/>
+              <w:jc w:val="left"/>
+              <w:rPr>
+                <w:sz w:val="20"/>
+                <w:szCs w:val="20"/>
+              </w:rPr>
+            </w:pPr>
+            <w:r>
+              <w:rPr>
+                <w:sz w:val="20"/>
+                <w:szCs w:val="20"/>
+              </w:rPr>
+              <w:t>Ganado</w:t>
+            </w:r>
           </w:p>
         </w:tc>
       </w:tr>
@@ -16783,55 +17943,89 @@
               <w:keepNext/>
               <w:spacing w:after="0"/>
               <w:jc w:val="left"/>
-            </w:pPr>
-          </w:p>
-        </w:tc>
-        <w:tc>
-          <w:tcPr>
-            <w:tcW w:w="2433" w:type="dxa"/>
-          </w:tcPr>
-          <w:p>
-            <w:pPr>
-              <w:keepNext/>
-              <w:spacing w:after="0"/>
-              <w:jc w:val="left"/>
-            </w:pPr>
-          </w:p>
-        </w:tc>
-        <w:tc>
-          <w:tcPr>
-            <w:tcW w:w="1497" w:type="dxa"/>
-          </w:tcPr>
-          <w:p>
-            <w:pPr>
-              <w:keepNext/>
-              <w:spacing w:after="0"/>
-              <w:jc w:val="left"/>
-            </w:pPr>
-          </w:p>
-        </w:tc>
-        <w:tc>
-          <w:tcPr>
-            <w:tcW w:w="1497" w:type="dxa"/>
-          </w:tcPr>
-          <w:p>
-            <w:pPr>
-              <w:keepNext/>
-              <w:spacing w:after="0"/>
-              <w:jc w:val="left"/>
-            </w:pPr>
-          </w:p>
-        </w:tc>
-        <w:tc>
-          <w:tcPr>
-            <w:tcW w:w="1497" w:type="dxa"/>
-          </w:tcPr>
-          <w:p>
-            <w:pPr>
-              <w:keepNext/>
-              <w:spacing w:after="0"/>
-              <w:jc w:val="left"/>
-            </w:pPr>
+              <w:rPr>
+                <w:sz w:val="20"/>
+                <w:szCs w:val="20"/>
+              </w:rPr>
+            </w:pPr>
+            <w:r>
+              <w:rPr>
+                <w:sz w:val="20"/>
+                <w:szCs w:val="20"/>
+              </w:rPr>
+              <w:t>Moto Servicio La Florida</w:t>
+            </w:r>
+          </w:p>
+        </w:tc>
+        <w:tc>
+          <w:tcPr>
+            <w:tcW w:w="2240" w:type="dxa"/>
+          </w:tcPr>
+          <w:p>
+            <w:pPr>
+              <w:keepNext/>
+              <w:spacing w:after="0"/>
+              <w:jc w:val="left"/>
+              <w:rPr>
+                <w:sz w:val="20"/>
+                <w:szCs w:val="20"/>
+              </w:rPr>
+            </w:pPr>
+            <w:r>
+              <w:rPr>
+                <w:sz w:val="20"/>
+                <w:szCs w:val="20"/>
+              </w:rPr>
+              <w:t>Taller</w:t>
+            </w:r>
+          </w:p>
+        </w:tc>
+        <w:tc>
+          <w:tcPr>
+            <w:tcW w:w="2126" w:type="dxa"/>
+          </w:tcPr>
+          <w:p>
+            <w:pPr>
+              <w:keepNext/>
+              <w:spacing w:after="0"/>
+              <w:jc w:val="left"/>
+              <w:rPr>
+                <w:sz w:val="20"/>
+                <w:szCs w:val="20"/>
+              </w:rPr>
+            </w:pPr>
+            <w:r>
+              <w:rPr>
+                <w:sz w:val="20"/>
+                <w:szCs w:val="20"/>
+              </w:rPr>
+              <w:t>Q 3,200.00</w:t>
+            </w:r>
+          </w:p>
+        </w:tc>
+        <w:tc>
+          <w:tcPr>
+            <w:tcW w:w="1843" w:type="dxa"/>
+          </w:tcPr>
+          <w:p>
+            <w:pPr>
+              <w:keepNext/>
+              <w:spacing w:after="0"/>
+              <w:jc w:val="left"/>
+              <w:rPr>
+                <w:sz w:val="20"/>
+                <w:szCs w:val="20"/>
+              </w:rPr>
+            </w:pPr>
+            <w:proofErr w:type="spellStart"/>
+            <w:r>
+              <w:rPr>
+                <w:sz w:val="20"/>
+                <w:szCs w:val="20"/>
+              </w:rPr>
+              <w:t>Negociacion</w:t>
+            </w:r>
+            <w:proofErr w:type="spellEnd"/>
           </w:p>
         </w:tc>
       </w:tr>
@@ -16848,55 +18042,87 @@
               <w:keepNext/>
               <w:spacing w:after="0"/>
               <w:jc w:val="left"/>
-            </w:pPr>
-          </w:p>
-        </w:tc>
-        <w:tc>
-          <w:tcPr>
-            <w:tcW w:w="2433" w:type="dxa"/>
-          </w:tcPr>
-          <w:p>
-            <w:pPr>
-              <w:keepNext/>
-              <w:spacing w:after="0"/>
-              <w:jc w:val="left"/>
-            </w:pPr>
-          </w:p>
-        </w:tc>
-        <w:tc>
-          <w:tcPr>
-            <w:tcW w:w="1497" w:type="dxa"/>
-          </w:tcPr>
-          <w:p>
-            <w:pPr>
-              <w:keepNext/>
-              <w:spacing w:after="0"/>
-              <w:jc w:val="left"/>
-            </w:pPr>
-          </w:p>
-        </w:tc>
-        <w:tc>
-          <w:tcPr>
-            <w:tcW w:w="1497" w:type="dxa"/>
-          </w:tcPr>
-          <w:p>
-            <w:pPr>
-              <w:keepNext/>
-              <w:spacing w:after="0"/>
-              <w:jc w:val="left"/>
-            </w:pPr>
-          </w:p>
-        </w:tc>
-        <w:tc>
-          <w:tcPr>
-            <w:tcW w:w="1497" w:type="dxa"/>
-          </w:tcPr>
-          <w:p>
-            <w:pPr>
-              <w:keepNext/>
-              <w:spacing w:after="0"/>
-              <w:jc w:val="left"/>
-            </w:pPr>
+              <w:rPr>
+                <w:sz w:val="20"/>
+                <w:szCs w:val="20"/>
+              </w:rPr>
+            </w:pPr>
+            <w:r>
+              <w:rPr>
+                <w:sz w:val="20"/>
+                <w:szCs w:val="20"/>
+              </w:rPr>
+              <w:t>Taller Hermanos Cutzal</w:t>
+            </w:r>
+          </w:p>
+        </w:tc>
+        <w:tc>
+          <w:tcPr>
+            <w:tcW w:w="2240" w:type="dxa"/>
+          </w:tcPr>
+          <w:p>
+            <w:pPr>
+              <w:keepNext/>
+              <w:spacing w:after="0"/>
+              <w:jc w:val="left"/>
+              <w:rPr>
+                <w:sz w:val="20"/>
+                <w:szCs w:val="20"/>
+              </w:rPr>
+            </w:pPr>
+            <w:r>
+              <w:rPr>
+                <w:sz w:val="20"/>
+                <w:szCs w:val="20"/>
+              </w:rPr>
+              <w:t>Taller</w:t>
+            </w:r>
+          </w:p>
+        </w:tc>
+        <w:tc>
+          <w:tcPr>
+            <w:tcW w:w="2126" w:type="dxa"/>
+          </w:tcPr>
+          <w:p>
+            <w:pPr>
+              <w:keepNext/>
+              <w:spacing w:after="0"/>
+              <w:jc w:val="left"/>
+              <w:rPr>
+                <w:sz w:val="20"/>
+                <w:szCs w:val="20"/>
+              </w:rPr>
+            </w:pPr>
+            <w:r>
+              <w:rPr>
+                <w:sz w:val="20"/>
+                <w:szCs w:val="20"/>
+              </w:rPr>
+              <w:t>Q 850.00</w:t>
+            </w:r>
+          </w:p>
+        </w:tc>
+        <w:tc>
+          <w:tcPr>
+            <w:tcW w:w="1843" w:type="dxa"/>
+          </w:tcPr>
+          <w:p>
+            <w:pPr>
+              <w:keepNext/>
+              <w:spacing w:after="0"/>
+              <w:jc w:val="left"/>
+              <w:rPr>
+                <w:sz w:val="20"/>
+                <w:szCs w:val="20"/>
+              </w:rPr>
+            </w:pPr>
+            <w:r>
+              <w:rPr>
+                <w:sz w:val="20"/>
+                <w:szCs w:val="20"/>
+              </w:rPr>
+              <w:t>Cotización enviada</w:t>
+            </w:r>
           </w:p>
         </w:tc>
       </w:tr>
@@ -16913,55 +18139,96 @@
               <w:keepNext/>
               <w:spacing w:after="0"/>
               <w:jc w:val="left"/>
-            </w:pPr>
-          </w:p>
-        </w:tc>
-        <w:tc>
-          <w:tcPr>
-            <w:tcW w:w="2433" w:type="dxa"/>
-          </w:tcPr>
-          <w:p>
-            <w:pPr>
-              <w:keepNext/>
-              <w:spacing w:after="0"/>
-              <w:jc w:val="left"/>
-            </w:pPr>
-          </w:p>
-        </w:tc>
-        <w:tc>
-          <w:tcPr>
-            <w:tcW w:w="1497" w:type="dxa"/>
-          </w:tcPr>
-          <w:p>
-            <w:pPr>
-              <w:keepNext/>
-              <w:spacing w:after="0"/>
-              <w:jc w:val="left"/>
-            </w:pPr>
-          </w:p>
-        </w:tc>
-        <w:tc>
-          <w:tcPr>
-            <w:tcW w:w="1497" w:type="dxa"/>
-          </w:tcPr>
-          <w:p>
-            <w:pPr>
-              <w:keepNext/>
-              <w:spacing w:after="0"/>
-              <w:jc w:val="left"/>
-            </w:pPr>
-          </w:p>
-        </w:tc>
-        <w:tc>
-          <w:tcPr>
-            <w:tcW w:w="1497" w:type="dxa"/>
-          </w:tcPr>
-          <w:p>
-            <w:pPr>
-              <w:keepNext/>
-              <w:spacing w:after="0"/>
-              <w:jc w:val="left"/>
-            </w:pPr>
+              <w:rPr>
+                <w:sz w:val="20"/>
+                <w:szCs w:val="20"/>
+              </w:rPr>
+            </w:pPr>
+            <w:r>
+              <w:rPr>
+                <w:sz w:val="20"/>
+                <w:szCs w:val="20"/>
+              </w:rPr>
+              <w:t xml:space="preserve">Centro de Servicio </w:t>
+            </w:r>
+            <w:proofErr w:type="spellStart"/>
+            <w:r>
+              <w:rPr>
+                <w:sz w:val="20"/>
+                <w:szCs w:val="20"/>
+              </w:rPr>
+              <w:t>Motoaventura</w:t>
+            </w:r>
+            <w:proofErr w:type="spellEnd"/>
+          </w:p>
+        </w:tc>
+        <w:tc>
+          <w:tcPr>
+            <w:tcW w:w="2240" w:type="dxa"/>
+          </w:tcPr>
+          <w:p>
+            <w:pPr>
+              <w:keepNext/>
+              <w:spacing w:after="0"/>
+              <w:jc w:val="left"/>
+              <w:rPr>
+                <w:sz w:val="20"/>
+                <w:szCs w:val="20"/>
+              </w:rPr>
+            </w:pPr>
+            <w:r>
+              <w:rPr>
+                <w:sz w:val="20"/>
+                <w:szCs w:val="20"/>
+              </w:rPr>
+              <w:t>Taller</w:t>
+            </w:r>
+          </w:p>
+        </w:tc>
+        <w:tc>
+          <w:tcPr>
+            <w:tcW w:w="2126" w:type="dxa"/>
+          </w:tcPr>
+          <w:p>
+            <w:pPr>
+              <w:keepNext/>
+              <w:spacing w:after="0"/>
+              <w:jc w:val="left"/>
+              <w:rPr>
+                <w:sz w:val="20"/>
+                <w:szCs w:val="20"/>
+              </w:rPr>
+            </w:pPr>
+            <w:r>
+              <w:rPr>
+                <w:sz w:val="20"/>
+                <w:szCs w:val="20"/>
+              </w:rPr>
+              <w:t>Q 4,100.00</w:t>
+            </w:r>
+          </w:p>
+        </w:tc>
+        <w:tc>
+          <w:tcPr>
+            <w:tcW w:w="1843" w:type="dxa"/>
+          </w:tcPr>
+          <w:p>
+            <w:pPr>
+              <w:keepNext/>
+              <w:spacing w:after="0"/>
+              <w:jc w:val="left"/>
+              <w:rPr>
+                <w:sz w:val="20"/>
+                <w:szCs w:val="20"/>
+              </w:rPr>
+            </w:pPr>
+            <w:r>
+              <w:rPr>
+                <w:sz w:val="20"/>
+                <w:szCs w:val="20"/>
+              </w:rPr>
+              <w:t>Contactado</w:t>
+            </w:r>
           </w:p>
         </w:tc>
       </w:tr>
@@ -16977,51 +18244,84 @@
             <w:pPr>
               <w:spacing w:after="0"/>
               <w:jc w:val="left"/>
-            </w:pPr>
-          </w:p>
-        </w:tc>
-        <w:tc>
-          <w:tcPr>
-            <w:tcW w:w="2433" w:type="dxa"/>
-          </w:tcPr>
-          <w:p>
-            <w:pPr>
-              <w:spacing w:after="0"/>
-              <w:jc w:val="left"/>
-            </w:pPr>
-          </w:p>
-        </w:tc>
-        <w:tc>
-          <w:tcPr>
-            <w:tcW w:w="1497" w:type="dxa"/>
-          </w:tcPr>
-          <w:p>
-            <w:pPr>
-              <w:spacing w:after="0"/>
-              <w:jc w:val="left"/>
-            </w:pPr>
-          </w:p>
-        </w:tc>
-        <w:tc>
-          <w:tcPr>
-            <w:tcW w:w="1497" w:type="dxa"/>
-          </w:tcPr>
-          <w:p>
-            <w:pPr>
-              <w:spacing w:after="0"/>
-              <w:jc w:val="left"/>
-            </w:pPr>
-          </w:p>
-        </w:tc>
-        <w:tc>
-          <w:tcPr>
-            <w:tcW w:w="1497" w:type="dxa"/>
-          </w:tcPr>
-          <w:p>
-            <w:pPr>
-              <w:spacing w:after="0"/>
-              <w:jc w:val="left"/>
-            </w:pPr>
+              <w:rPr>
+                <w:sz w:val="20"/>
+                <w:szCs w:val="20"/>
+              </w:rPr>
+            </w:pPr>
+            <w:r>
+              <w:rPr>
+                <w:sz w:val="20"/>
+                <w:szCs w:val="20"/>
+              </w:rPr>
+              <w:t>Mónica Isabel Arévalo Soto</w:t>
+            </w:r>
+          </w:p>
+        </w:tc>
+        <w:tc>
+          <w:tcPr>
+            <w:tcW w:w="2240" w:type="dxa"/>
+          </w:tcPr>
+          <w:p>
+            <w:pPr>
+              <w:spacing w:after="0"/>
+              <w:jc w:val="left"/>
+              <w:rPr>
+                <w:sz w:val="20"/>
+                <w:szCs w:val="20"/>
+              </w:rPr>
+            </w:pPr>
+            <w:r>
+              <w:rPr>
+                <w:sz w:val="20"/>
+                <w:szCs w:val="20"/>
+              </w:rPr>
+              <w:t>Entusiasta</w:t>
+            </w:r>
+          </w:p>
+        </w:tc>
+        <w:tc>
+          <w:tcPr>
+            <w:tcW w:w="2126" w:type="dxa"/>
+          </w:tcPr>
+          <w:p>
+            <w:pPr>
+              <w:spacing w:after="0"/>
+              <w:jc w:val="left"/>
+              <w:rPr>
+                <w:sz w:val="20"/>
+                <w:szCs w:val="20"/>
+              </w:rPr>
+            </w:pPr>
+            <w:r>
+              <w:rPr>
+                <w:sz w:val="20"/>
+                <w:szCs w:val="20"/>
+              </w:rPr>
+              <w:t>Q 350.00</w:t>
+            </w:r>
+          </w:p>
+        </w:tc>
+        <w:tc>
+          <w:tcPr>
+            <w:tcW w:w="1843" w:type="dxa"/>
+          </w:tcPr>
+          <w:p>
+            <w:pPr>
+              <w:spacing w:after="0"/>
+              <w:jc w:val="left"/>
+              <w:rPr>
+                <w:sz w:val="20"/>
+                <w:szCs w:val="20"/>
+              </w:rPr>
+            </w:pPr>
+            <w:r>
+              <w:rPr>
+                <w:sz w:val="20"/>
+                <w:szCs w:val="20"/>
+              </w:rPr>
+              <w:t>Perdido</w:t>
+            </w:r>
           </w:p>
         </w:tc>
       </w:tr>
@@ -17058,9 +18358,18 @@
           <w:color w:val="808080"/>
           <w:sz w:val="20"/>
         </w:rPr>
-        <w:lastRenderedPageBreak/>
-        <w:t>[ captura: vista Kanban del pipeline con las 5 oportunidades repartidas en las etapas ]</w:t>
+        <w:t xml:space="preserve">[ captura: vista Kanban del pipeline con las 5 oportunidades repartidas en las </w:t>
       </w:r>
+      <w:proofErr w:type="gramStart"/>
+      <w:r>
+        <w:rPr>
+          <w:i/>
+          <w:color w:val="808080"/>
+          <w:sz w:val="20"/>
+        </w:rPr>
+        <w:t>etapas ]</w:t>
+      </w:r>
+      <w:proofErr w:type="gramEnd"/>
     </w:p>
     <w:p>
       <w:pPr>
@@ -17073,7 +18382,25 @@
           <w:color w:val="808080"/>
           <w:sz w:val="18"/>
         </w:rPr>
-        <w:t>Figura __. Pipeline de ventas de RutaMoto. Elaboración propia.</w:t>
+        <w:t xml:space="preserve">Figura __. Pipeline de ventas de </w:t>
+      </w:r>
+      <w:proofErr w:type="spellStart"/>
+      <w:r>
+        <w:rPr>
+          <w:i/>
+          <w:color w:val="808080"/>
+          <w:sz w:val="18"/>
+        </w:rPr>
+        <w:t>RutaMoto</w:t>
+      </w:r>
+      <w:proofErr w:type="spellEnd"/>
+      <w:r>
+        <w:rPr>
+          <w:i/>
+          <w:color w:val="808080"/>
+          <w:sz w:val="18"/>
+        </w:rPr>
+        <w:t>. Elaboración propia.</w:t>
       </w:r>
     </w:p>
     <w:p>
@@ -17094,8 +18421,18 @@
           <w:color w:val="808080"/>
           <w:sz w:val="20"/>
         </w:rPr>
-        <w:t>[ captura: historial de la oportunidad que recorrió todas las etapas ]</w:t>
+        <w:t xml:space="preserve">[ captura: historial de la oportunidad que recorrió todas las </w:t>
       </w:r>
+      <w:proofErr w:type="gramStart"/>
+      <w:r>
+        <w:rPr>
+          <w:i/>
+          <w:color w:val="808080"/>
+          <w:sz w:val="20"/>
+        </w:rPr>
+        <w:t>etapas ]</w:t>
+      </w:r>
+      <w:proofErr w:type="gramEnd"/>
     </w:p>
     <w:p>
       <w:pPr>
@@ -17152,7 +18489,25 @@
           <w:color w:val="808080"/>
           <w:sz w:val="20"/>
         </w:rPr>
-        <w:t>5 puntos: «Se definen indicadores y se valida la ejecución del proceso». Dos partes. Primera: los indicadores del PROCESO de esta fase, medidos con los datos reales de Odoo. Segunda: la validación del flujo, es decir, que un dato cargado recorre el sistema de punta a punta. Y por primera vez el KPI 5 de la Fase 1 (quiebre de stock) se puede calcular con datos reales: hacerlo.</w:t>
+        <w:t xml:space="preserve">5 puntos: «Se definen indicadores y se valida la ejecución del proceso». Dos partes. Primera: los indicadores del PROCESO de esta fase, medidos con los datos reales de </w:t>
+      </w:r>
+      <w:proofErr w:type="spellStart"/>
+      <w:r>
+        <w:rPr>
+          <w:i/>
+          <w:color w:val="808080"/>
+          <w:sz w:val="20"/>
+        </w:rPr>
+        <w:t>Odoo</w:t>
+      </w:r>
+      <w:proofErr w:type="spellEnd"/>
+      <w:r>
+        <w:rPr>
+          <w:i/>
+          <w:color w:val="808080"/>
+          <w:sz w:val="20"/>
+        </w:rPr>
+        <w:t>. Segunda: la validación del flujo, es decir, que un dato cargado recorre el sistema de punta a punta. Y por primera vez el KPI 5 de la Fase 1 (quiebre de stock) se puede calcular con datos reales: hacerlo.</w:t>
       </w:r>
     </w:p>
     <w:p>
@@ -17161,6 +18516,7 @@
       </w:pPr>
       <w:bookmarkStart w:id="31" w:name="_Toc241501402"/>
       <w:r>
+        <w:lastRenderedPageBreak/>
         <w:t>Indicadores del proceso</w:t>
       </w:r>
       <w:bookmarkEnd w:id="31"/>
@@ -17404,7 +18760,21 @@
               <w:rPr>
                 <w:sz w:val="20"/>
               </w:rPr>
-              <w:t>Valor inicial en Odoo − valor del Excel</w:t>
+              <w:t xml:space="preserve">Valor inicial en </w:t>
+            </w:r>
+            <w:proofErr w:type="spellStart"/>
+            <w:r>
+              <w:rPr>
+                <w:sz w:val="20"/>
+              </w:rPr>
+              <w:t>Odoo</w:t>
+            </w:r>
+            <w:proofErr w:type="spellEnd"/>
+            <w:r>
+              <w:rPr>
+                <w:sz w:val="20"/>
+              </w:rPr>
+              <w:t xml:space="preserve"> − valor del Excel</w:t>
             </w:r>
           </w:p>
         </w:tc>
@@ -17863,7 +19233,6 @@
                 <w:b/>
                 <w:sz w:val="20"/>
               </w:rPr>
-              <w:lastRenderedPageBreak/>
               <w:t>Paso</w:t>
             </w:r>
           </w:p>
@@ -18407,7 +19776,16 @@
           <w:color w:val="808080"/>
           <w:sz w:val="20"/>
         </w:rPr>
-        <w:t>Tres o cuatro conclusiones, cada una apoyada en una tabla de este informe. No resumir lo que se hizo: decir lo que se aprendió. Candidatas: qué obligó el orden de dependencias de la carga; qué mostró la medición del quiebre de stock con datos reales; qué costó más de lo previsto y por qué. Cerrar con lo que queda para la Fase 3 y los riesgos abiertos (el túnel, el ambiente en una sola laptop).</w:t>
+        <w:t xml:space="preserve">Tres o cuatro conclusiones, cada una apoyada en una tabla de este informe. No resumir lo que se hizo: decir lo que se aprendió. Candidatas: qué obligó el orden de dependencias de la carga; qué mostró la medición del quiebre de </w:t>
+      </w:r>
+      <w:r>
+        <w:rPr>
+          <w:i/>
+          <w:color w:val="808080"/>
+          <w:sz w:val="20"/>
+        </w:rPr>
+        <w:lastRenderedPageBreak/>
+        <w:t>stock con datos reales; qué costó más de lo previsto y por qué. Cerrar con lo que queda para la Fase 3 y los riesgos abiertos (el túnel, el ambiente en una sola laptop).</w:t>
       </w:r>
     </w:p>
     <w:p/>
@@ -18452,7 +19830,25 @@
           <w:color w:val="808080"/>
           <w:sz w:val="20"/>
         </w:rPr>
-        <w:t>Mismo formato de citación que la Fase 1. Agregar la documentación de Odoo 18 que se haya consultado: importación de datos, inventario, compras, ventas, email marketing y CRM, con fecha de consulta.</w:t>
+        <w:t xml:space="preserve">Mismo formato de citación que la Fase 1. Agregar la documentación de </w:t>
+      </w:r>
+      <w:proofErr w:type="spellStart"/>
+      <w:r>
+        <w:rPr>
+          <w:i/>
+          <w:color w:val="808080"/>
+          <w:sz w:val="20"/>
+        </w:rPr>
+        <w:t>Odoo</w:t>
+      </w:r>
+      <w:proofErr w:type="spellEnd"/>
+      <w:r>
+        <w:rPr>
+          <w:i/>
+          <w:color w:val="808080"/>
+          <w:sz w:val="20"/>
+        </w:rPr>
+        <w:t xml:space="preserve"> 18 que se haya consultado: importación de datos, inventario, compras, ventas, email marketing y CRM, con fecha de consulta.</w:t>
       </w:r>
     </w:p>
     <w:p>
@@ -18465,7 +19861,21 @@
         <w:spacing w:after="80"/>
       </w:pPr>
       <w:r>
-        <w:t>Odoo S.A. (2026). Odoo 18.0 documentation: Import data into Odoo. Recuperado el __ de ______ de 2026 de https://www.odoo.com/documentation/18.0/applications/essentials/export_import_data.html</w:t>
+        <w:rPr>
+          <w:lang w:val="en-US"/>
+        </w:rPr>
+        <w:t xml:space="preserve">Odoo S.A. (2026). Odoo 18.0 documentation: Import data into Odoo. </w:t>
+      </w:r>
+      <w:r>
+        <w:t xml:space="preserve">Recuperado el __ de ______ </w:t>
+      </w:r>
+      <w:proofErr w:type="spellStart"/>
+      <w:r>
+        <w:t>de</w:t>
+      </w:r>
+      <w:proofErr w:type="spellEnd"/>
+      <w:r>
+        <w:t xml:space="preserve"> 2026 de https://www.odoo.com/documentation/18.0/applications/essentials/export_import_data.html</w:t>
       </w:r>
     </w:p>
     <w:p>
@@ -18483,7 +19893,6 @@
       </w:pPr>
       <w:bookmarkStart w:id="35" w:name="_Toc241501406"/>
       <w:r>
-        <w:lastRenderedPageBreak/>
         <w:t>Anexos</w:t>
       </w:r>
       <w:bookmarkEnd w:id="35"/>
@@ -18700,7 +20109,21 @@
               <w:rPr>
                 <w:sz w:val="20"/>
               </w:rPr>
-              <w:t>3_Archivos_Datos/imagenes_productos y 3_Archivos_Datos/marca</w:t>
+              <w:t>3_Archivos_Datos/</w:t>
+            </w:r>
+            <w:proofErr w:type="spellStart"/>
+            <w:r>
+              <w:rPr>
+                <w:sz w:val="20"/>
+              </w:rPr>
+              <w:t>imagenes_productos</w:t>
+            </w:r>
+            <w:proofErr w:type="spellEnd"/>
+            <w:r>
+              <w:rPr>
+                <w:sz w:val="20"/>
+              </w:rPr>
+              <w:t xml:space="preserve"> y 3_Archivos_Datos/marca</w:t>
             </w:r>
           </w:p>
         </w:tc>
@@ -22007,7 +23430,6 @@
   <w:style w:type="character" w:default="1" w:styleId="Fuentedeprrafopredeter">
     <w:name w:val="Default Paragraph Font"/>
     <w:uiPriority w:val="1"/>
-    <w:semiHidden/>
     <w:unhideWhenUsed/>
   </w:style>
   <w:style w:type="table" w:default="1" w:styleId="Tablanormal">

</xml_diff>

<commit_message>
docs: seccion 6.1, bibliografia y enlaces de videos en el informe
</commit_message>
<xml_diff>
--- a/Entrega_Fase2_Grupo14/1_Informe/informe_fase2_PLANTILLA.docx
+++ b/Entrega_Fase2_Grupo14/1_Informe/informe_fase2_PLANTILLA.docx
@@ -9236,34 +9236,13 @@
       </w:r>
     </w:p>
     <w:p>
-      <w:pPr>
-        <w:spacing w:after="120"/>
-      </w:pPr>
       <w:r>
-        <w:rPr>
-          <w:i/>
-          <w:color w:val="808080"/>
-          <w:sz w:val="20"/>
-        </w:rPr>
-        <w:t xml:space="preserve">Qué va aquí: la estructura del Excel entregado (3_Archivos_Datos/RutaMoto_datos_maestros_Fase2.xlsx) y por qué está armado así: una hoja por modelo de </w:t>
+        <w:t>El archivo de datos maestros es el libro de Excel RutaMoto_datos_maestros_Fase2.xlsx, que se entrega en la carpeta 3_Archivos_Datos como el entregable «Archivos de datos» del enunciado. Reúne los tres grupos de datos que pide el punto 12.1: los productos con su código, nombre, categoría, precio, costo, stock inicial e imagen; los clientes con su nombre, correo, teléfono, dirección y segmento; y los proveedores con su nombre, contacto, productos que proveen y condiciones de pago. Se preparó antes de que el equipo empezara a trabajar en el sistema, a partir del catálogo y de los segmentos de cliente definidos en la Fase 1.</w:t>
       </w:r>
-      <w:proofErr w:type="spellStart"/>
+    </w:p>
+    <w:p>
       <w:r>
-        <w:rPr>
-          <w:i/>
-          <w:color w:val="808080"/>
-          <w:sz w:val="20"/>
-        </w:rPr>
-        <w:t>Odoo</w:t>
-      </w:r>
-      <w:proofErr w:type="spellEnd"/>
-      <w:r>
-        <w:rPr>
-          <w:i/>
-          <w:color w:val="808080"/>
-          <w:sz w:val="20"/>
-        </w:rPr>
-        <w:t>, en el orden de dependencia, columnas informativas separadas de las importables, y un cuadre contra el presupuesto de la Fase 1.</w:t>
+        <w:t>El libro tiene siete hojas que se importan y cuatro de apoyo. Cada hoja importable corresponde a un solo modelo de Odoo, porque el importador del sistema recibe una hoja a la vez y la escribe en un único modelo. Eso obligó a separar datos que el enunciado nombra juntos: el stock inicial no es un campo del producto sino un conteo de inventario, de modo que va en su propia hoja, y los productos que provee cada proveedor tampoco son un campo del proveedor, sino una lista de precios que enlaza a ambos. Las hojas están numeradas en el orden en que deben importarse, porque cada una apunta a registros que crea la anterior: las existencias y las reglas de reabastecimiento necesitan que el producto exista, y la lista de lo que provee cada proveedor necesita al producto y al proveedor. La tabla siguiente resume las siete hojas.</w:t>
       </w:r>
     </w:p>
     <w:tbl>
@@ -9928,6 +9907,26 @@
           <w:sz w:val="18"/>
         </w:rPr>
         <w:t>Tabla __. Estructura del archivo de datos maestros. Elaboración propia.</w:t>
+      </w:r>
+    </w:p>
+    <w:p>
+      <w:r>
+        <w:t>Dentro de cada hoja se distinguen dos tipos de columna. Las de encabezado azul son las que se importan, y su encabezado está escrito con el nombre que Odoo le da al campo en español, para que el importador las reconozca sin intervención. Las grises en cursiva son informativas: repiten el nombre del producto junto a su código, o muestran el valor al costo de cada línea y el contacto de cada proveedor. Existen para que el archivo se pueda leer y cuadrar sin abrir el sistema, y al importar se dejan sin asignar.</w:t>
+      </w:r>
+    </w:p>
+    <w:p>
+      <w:r>
+        <w:t>Las cuatro hojas de apoyo no se importan. La hoja LEEME explica el orden y las precauciones de la importación, y la hoja Diccionario relaciona cada encabezado con el nombre técnico del campo de Odoo. La hoja NO_IMPORTAR_carga_manual contiene lo que se registró a mano para cumplir con la segunda modalidad de carga que pide el enunciado: la categoría Accesorios y equipaje con sus seis productos, su proveedor y cinco clientes. Las imágenes de producto se referencian por una dirección pública del repositorio del grupo, que el sistema descarga al importar, y todos los correos usan el dominio example.com, reservado para ejemplos, de manera que ninguna campaña pueda llegar a una persona real.</w:t>
+      </w:r>
+    </w:p>
+    <w:p>
+      <w:r>
+        <w:t>La cuarta hoja de apoyo, Cuadre, fija los totales que el sistema debe mostrar al terminar las dos cargas: 36 productos, de los cuales 30 se importan y 6 se registran a mano; 6 proveedores, 5 y 1; y 40 clientes, 35 y 5, repartidos en 13 repartidores, 12 motociclistas particulares, 9 talleres mecánicos y 6 entusiastas. El inventario inicial valorizado al costo suma Q 38,096.00 en la carga masiva y Q 6,904.00 en la manual, es decir, Q 45,000.00, que es exactamente el rubro «Inventario inicial (36 SKU)» del presupuesto pre-operativo de la Fase 1. Las cantidades tampoco son arbitrarias: tres productos quedan por debajo de su mínimo y uno en cero, para que al terminar la carga existan alertas de reabastecimiento que atender y un quiebre de stock que medir, de 1 producto sobre 36, equivalente a 2.8 %.</w:t>
+      </w:r>
+    </w:p>
+    <w:p>
+      <w:r>
+        <w:t>El archivo se entrega tal como se preparó. La única columna que no coincidió con la instancia fue la ubicación de las existencias, y su tratamiento se explica en la sección de importación masiva.</w:t>
       </w:r>
     </w:p>
     <w:p/>
@@ -19822,37 +19821,6 @@
     </w:p>
     <w:p>
       <w:pPr>
-        <w:spacing w:after="120"/>
-      </w:pPr>
-      <w:r>
-        <w:rPr>
-          <w:i/>
-          <w:color w:val="808080"/>
-          <w:sz w:val="20"/>
-        </w:rPr>
-        <w:t xml:space="preserve">Mismo formato de citación que la Fase 1. Agregar la documentación de </w:t>
-      </w:r>
-      <w:proofErr w:type="spellStart"/>
-      <w:r>
-        <w:rPr>
-          <w:i/>
-          <w:color w:val="808080"/>
-          <w:sz w:val="20"/>
-        </w:rPr>
-        <w:t>Odoo</w:t>
-      </w:r>
-      <w:proofErr w:type="spellEnd"/>
-      <w:r>
-        <w:rPr>
-          <w:i/>
-          <w:color w:val="808080"/>
-          <w:sz w:val="20"/>
-        </w:rPr>
-        <w:t xml:space="preserve"> 18 que se haya consultado: importación de datos, inventario, compras, ventas, email marketing y CRM, con fecha de consulta.</w:t>
-      </w:r>
-    </w:p>
-    <w:p>
-      <w:pPr>
         <w:pStyle w:val="Prrafodelista"/>
         <w:numPr>
           <w:ilvl w:val="0"/>
@@ -19864,19 +19832,190 @@
         <w:rPr>
           <w:lang w:val="en-US"/>
         </w:rPr>
-        <w:t xml:space="preserve">Odoo S.A. (2026). Odoo 18.0 documentation: Import data into Odoo. </w:t>
-      </w:r>
-      <w:r>
-        <w:t xml:space="preserve">Recuperado el __ de ______ </w:t>
+        <w:t>Mailpit (2026). Mailpit documentation. Recuperado el 5 de octubre de 2026 de https://mailpit.axllent.org/docs/</w:t>
       </w:r>
       <w:proofErr w:type="spellStart"/>
+      <w:proofErr w:type="spellEnd"/>
+    </w:p>
+    <w:p>
+      <w:pPr>
+        <w:pStyle w:val="Prrafodelista"/>
+        <w:numPr>
+          <w:ilvl w:val="0"/>
+          <w:numId w:val="16"/>
+        </w:numPr>
+        <w:spacing w:after="80"/>
+      </w:pPr>
       <w:r>
-        <w:t>de</w:t>
+        <w:rPr>
+          <w:lang w:val="en-US"/>
+        </w:rPr>
+        <w:t>Odoo S.A. (2026). Odoo 18.0 documentation: CRM. Recuperado el 5 de octubre de 2026 de https://www.odoo.com/documentation/18.0/applications/sales/crm.html</w:t>
       </w:r>
+      <w:proofErr w:type="spellStart"/>
       <w:proofErr w:type="spellEnd"/>
+    </w:p>
+    <w:p>
+      <w:pPr>
+        <w:pStyle w:val="Prrafodelista"/>
+        <w:numPr>
+          <w:ilvl w:val="0"/>
+          <w:numId w:val="16"/>
+        </w:numPr>
+        <w:spacing w:after="80"/>
+      </w:pPr>
       <w:r>
-        <w:t xml:space="preserve"> 2026 de https://www.odoo.com/documentation/18.0/applications/essentials/export_import_data.html</w:t>
+        <w:rPr>
+          <w:lang w:val="en-US"/>
+        </w:rPr>
+        <w:t>Odoo S.A. (2026). Odoo 18.0 documentation: Create quotations. Recuperado el 5 de octubre de 2026 de https://www.odoo.com/documentation/18.0/applications/sales/sales/sales_quotations/create_quotations.html</w:t>
       </w:r>
+      <w:proofErr w:type="spellStart"/>
+      <w:proofErr w:type="spellEnd"/>
+    </w:p>
+    <w:p>
+      <w:pPr>
+        <w:pStyle w:val="Prrafodelista"/>
+        <w:numPr>
+          <w:ilvl w:val="0"/>
+          <w:numId w:val="16"/>
+        </w:numPr>
+        <w:spacing w:after="80"/>
+      </w:pPr>
+      <w:r>
+        <w:rPr>
+          <w:lang w:val="en-US"/>
+        </w:rPr>
+        <w:t>Odoo S.A. (2026). Odoo 18.0 documentation: Email Marketing. Recuperado el 5 de octubre de 2026 de https://www.odoo.com/documentation/18.0/applications/marketing/email_marketing.html</w:t>
+      </w:r>
+      <w:proofErr w:type="spellStart"/>
+      <w:proofErr w:type="spellEnd"/>
+    </w:p>
+    <w:p>
+      <w:pPr>
+        <w:pStyle w:val="Prrafodelista"/>
+        <w:numPr>
+          <w:ilvl w:val="0"/>
+          <w:numId w:val="16"/>
+        </w:numPr>
+        <w:spacing w:after="80"/>
+      </w:pPr>
+      <w:r>
+        <w:rPr>
+          <w:lang w:val="en-US"/>
+        </w:rPr>
+        <w:t>Odoo S.A. (2026). Odoo 18.0 documentation: Export and import data. Recuperado el 5 de octubre de 2026 de https://www.odoo.com/documentation/18.0/applications/essentials/export_import_data.html</w:t>
+      </w:r>
+      <w:proofErr w:type="spellStart"/>
+      <w:proofErr w:type="spellEnd"/>
+    </w:p>
+    <w:p>
+      <w:pPr>
+        <w:pStyle w:val="Prrafodelista"/>
+        <w:numPr>
+          <w:ilvl w:val="0"/>
+          <w:numId w:val="16"/>
+        </w:numPr>
+        <w:spacing w:after="80"/>
+      </w:pPr>
+      <w:r>
+        <w:rPr>
+          <w:lang w:val="en-US"/>
+        </w:rPr>
+        <w:t>Odoo S.A. (2026). Odoo 18.0 documentation: Inventory adjustments. Recuperado el 5 de octubre de 2026 de https://www.odoo.com/documentation/18.0/applications/inventory_and_mrp/inventory/warehouses_storage/inventory_management/count_products.html</w:t>
+      </w:r>
+      <w:proofErr w:type="spellStart"/>
+      <w:proofErr w:type="spellEnd"/>
+    </w:p>
+    <w:p>
+      <w:pPr>
+        <w:pStyle w:val="Prrafodelista"/>
+        <w:numPr>
+          <w:ilvl w:val="0"/>
+          <w:numId w:val="16"/>
+        </w:numPr>
+        <w:spacing w:after="80"/>
+      </w:pPr>
+      <w:r>
+        <w:rPr>
+          <w:lang w:val="en-US"/>
+        </w:rPr>
+        <w:t>Odoo S.A. (2026). Odoo 18.0 documentation: Manage outbound messages. Recuperado el 5 de octubre de 2026 de https://www.odoo.com/documentation/18.0/applications/general/email_communication/email_servers_outbound.html</w:t>
+      </w:r>
+      <w:proofErr w:type="spellStart"/>
+      <w:proofErr w:type="spellEnd"/>
+    </w:p>
+    <w:p>
+      <w:pPr>
+        <w:pStyle w:val="Prrafodelista"/>
+        <w:numPr>
+          <w:ilvl w:val="0"/>
+          <w:numId w:val="16"/>
+        </w:numPr>
+        <w:spacing w:after="80"/>
+      </w:pPr>
+      <w:r>
+        <w:rPr>
+          <w:lang w:val="en-US"/>
+        </w:rPr>
+        <w:t>Odoo S.A. (2026). Odoo 18.0 documentation: Pricelists. Recuperado el 5 de octubre de 2026 de https://www.odoo.com/documentation/18.0/applications/sales/sales/products_prices/prices/pricing.html</w:t>
+      </w:r>
+      <w:proofErr w:type="spellStart"/>
+      <w:proofErr w:type="spellEnd"/>
+    </w:p>
+    <w:p>
+      <w:pPr>
+        <w:pStyle w:val="Prrafodelista"/>
+        <w:numPr>
+          <w:ilvl w:val="0"/>
+          <w:numId w:val="16"/>
+        </w:numPr>
+        <w:spacing w:after="80"/>
+      </w:pPr>
+      <w:r>
+        <w:rPr>
+          <w:lang w:val="en-US"/>
+        </w:rPr>
+        <w:t>Odoo S.A. (2026). Odoo 18.0 documentation: Reordering rules. Recuperado el 5 de octubre de 2026 de https://www.odoo.com/documentation/18.0/applications/inventory_and_mrp/inventory/warehouses_storage/replenishment/reordering_rules.html</w:t>
+      </w:r>
+      <w:proofErr w:type="spellStart"/>
+      <w:proofErr w:type="spellEnd"/>
+    </w:p>
+    <w:p>
+      <w:pPr>
+        <w:pStyle w:val="Prrafodelista"/>
+        <w:numPr>
+          <w:ilvl w:val="0"/>
+          <w:numId w:val="16"/>
+        </w:numPr>
+        <w:spacing w:after="80"/>
+      </w:pPr>
+      <w:r>
+        <w:rPr>
+          <w:lang w:val="en-US"/>
+        </w:rPr>
+        <w:t>Odoo S.A. (2026). Odoo 18.0 documentation: Requests for quotation. Recuperado el 5 de octubre de 2026 de https://www.odoo.com/documentation/18.0/applications/inventory_and_mrp/purchase/manage_deals/rfq.html</w:t>
+      </w:r>
+      <w:proofErr w:type="spellStart"/>
+      <w:proofErr w:type="spellEnd"/>
+    </w:p>
+    <w:p>
+      <w:pPr>
+        <w:pStyle w:val="Prrafodelista"/>
+        <w:numPr>
+          <w:ilvl w:val="0"/>
+          <w:numId w:val="16"/>
+        </w:numPr>
+        <w:spacing w:after="80"/>
+      </w:pPr>
+      <w:r>
+        <w:rPr>
+          <w:lang w:val="en-US"/>
+        </w:rPr>
+        <w:t>Universidad de San Carlos de Guatemala, Facultad de Ingeniería (2026). Proyecto 1: Transformación digital en e-commerce con ERP, CRM y BI. Enunciado del curso Sistemas Organizacionales y Gerenciales 1, segundo semestre de 2026.</w:t>
+      </w:r>
+      <w:proofErr w:type="spellStart"/>
+      <w:proofErr w:type="spellEnd"/>
     </w:p>
     <w:p>
       <w:pPr>
@@ -20239,11 +20378,9 @@
             </w:pPr>
             <w:r>
               <w:rPr>
-                <w:i/>
-                <w:color w:val="808080"/>
-                <w:sz w:val="20"/>
-              </w:rPr>
-              <w:t>enlace de Drive</w:t>
+                <w:sz w:val="20"/>
+              </w:rPr>
+              <w:t>https://drive.google.com/file/d/1n1EAp5D2XiO8zLlHyS1h4BaQnkK97gq_/view</w:t>
             </w:r>
           </w:p>
         </w:tc>
@@ -20361,11 +20498,9 @@
             </w:pPr>
             <w:r>
               <w:rPr>
-                <w:i/>
-                <w:color w:val="808080"/>
-                <w:sz w:val="20"/>
-              </w:rPr>
-              <w:t>enlace de Drive</w:t>
+                <w:sz w:val="20"/>
+              </w:rPr>
+              <w:t>https://drive.google.com/file/d/1ywP4V_gbuOaNemGewB_7NpK3JAX8cilS/view</w:t>
             </w:r>
           </w:p>
         </w:tc>

</xml_diff>

<commit_message>
docs: secciones 5, 6.2, 6.4 y 7 del rol 3 pasadas al informe
</commit_message>
<xml_diff>
--- a/Entrega_Fase2_Grupo14/1_Informe/informe_fase2_PLANTILLA.docx
+++ b/Entrega_Fase2_Grupo14/1_Informe/informe_fase2_PLANTILLA.docx
@@ -8009,56 +8009,46 @@
       </w:pPr>
       <w:r>
         <w:rPr>
-          <w:i/>
-          <w:color w:val="808080"/>
-          <w:sz w:val="20"/>
+          <w:i w:val="0"/>
+          <w:color w:val="000000"/>
         </w:rPr>
-        <w:t xml:space="preserve">Qué va aquí: cómo trabajaron cuatro personas sobre UNA sola instancia de </w:t>
+        <w:t>Las cuatro personas del equipo trabajaron sobre una sola instancia de Odoo, la que quedó instalada y documentada en la Fase 1. La alternativa, que cada quien levantara su propia copia, se descartó temprano: la carga de datos, el ciclo de compras, las cotizaciones y la campaña del CRM se apoyan unas en otras, y con cuatro bases distintas ningún número de este informe cuadraría contra otro. El costo de la decisión se asume de forma explícita: todo depende de que una sola máquina esté encendida, que es el mismo punto único de falla que ya se señaló en la fase anterior.</w:t>
       </w:r>
-      <w:proofErr w:type="spellStart"/>
+    </w:p>
+    <w:p>
+      <w:pPr>
+        <w:spacing w:after="120"/>
+      </w:pPr>
       <w:r>
         <w:rPr>
-          <w:i/>
-          <w:color w:val="808080"/>
-          <w:sz w:val="20"/>
+          <w:i w:val="0"/>
+          <w:color w:val="000000"/>
         </w:rPr>
-        <w:t>Odoo</w:t>
+        <w:t>El acceso del resto del equipo se resolvió con un túnel de Cloudflare, que publica el puerto 8069 de esa máquina en una dirección temporal sin abrir puertos en el enrutador ni contratar un servidor. En la configuración de Odoo se activó el modo de proxy para que el servidor confíe en las cabeceras del túnel y construya bien sus direcciones absolutas. La dirección cambia cada vez que el túnel se reinicia, así que se comparte por el chat del grupo.</w:t>
       </w:r>
-      <w:proofErr w:type="spellEnd"/>
+    </w:p>
+    <w:p>
+      <w:pPr>
+        <w:spacing w:after="120"/>
+      </w:pPr>
       <w:r>
         <w:rPr>
-          <w:i/>
-          <w:color w:val="808080"/>
-          <w:sz w:val="20"/>
+          <w:i w:val="0"/>
+          <w:color w:val="000000"/>
         </w:rPr>
-        <w:t xml:space="preserve">. Es una decisión que el catedrático va a preguntar, así que hay que justificarla: una sola base evita que </w:t>
+        <w:t>Cada integrante entra con su propio usuario interno y no con el administrador. No es una formalidad: Odoo guarda en el historial de cada registro quién lo creó y quién lo modificó, de modo que la autoría de cada parte de la fase queda registrada en la propia base de datos y se puede mostrar durante la evaluación técnica, que es justamente lo que el enunciado exige demostrar.</w:t>
       </w:r>
-      <w:proofErr w:type="gramStart"/>
+    </w:p>
+    <w:p>
+      <w:pPr>
+        <w:spacing w:after="120"/>
+      </w:pPr>
       <w:r>
         <w:rPr>
-          <w:i/>
-          <w:color w:val="808080"/>
-          <w:sz w:val="20"/>
+          <w:i w:val="0"/>
+          <w:color w:val="000000"/>
         </w:rPr>
-        <w:t>cada quien</w:t>
-      </w:r>
-      <w:proofErr w:type="gramEnd"/>
-      <w:r>
-        <w:rPr>
-          <w:i/>
-          <w:color w:val="808080"/>
-          <w:sz w:val="20"/>
-        </w:rPr>
-        <w:t xml:space="preserve"> cargue datos en una </w:t>
-      </w:r>
-      <w:r>
-        <w:rPr>
-          <w:i/>
-          <w:color w:val="808080"/>
-          <w:sz w:val="20"/>
-        </w:rPr>
-        <w:lastRenderedPageBreak/>
-        <w:t>copia distinta y que al final no cuadre nada. Explicar el acceso remoto (túnel), los usuarios individuales y los respaldos.</w:t>
+        <w:t>Los respaldos se toman desde el gestor de bases de datos de Odoo, en formato comprimido, y se suben a la carpeta del grupo en Drive. El respaldo del cierre de la carga es el punto de retorno del resto de la fase: a partir de él trabajan en paralelo la carga manual, las cotizaciones y el CRM.</w:t>
       </w:r>
     </w:p>
     <w:tbl>
@@ -8173,46 +8163,12 @@
             </w:pPr>
             <w:r>
               <w:rPr>
-                <w:sz w:val="20"/>
-              </w:rPr>
-              <w:t xml:space="preserve">La de la Fase 1: contenedores </w:t>
-            </w:r>
-            <w:proofErr w:type="spellStart"/>
-            <w:r>
-              <w:rPr>
-                <w:sz w:val="20"/>
-              </w:rPr>
-              <w:t>rutamoto-odoo</w:t>
-            </w:r>
-            <w:proofErr w:type="spellEnd"/>
-            <w:r>
-              <w:rPr>
-                <w:sz w:val="20"/>
-              </w:rPr>
-              <w:t xml:space="preserve"> y </w:t>
-            </w:r>
-            <w:proofErr w:type="spellStart"/>
-            <w:r>
-              <w:rPr>
-                <w:sz w:val="20"/>
-              </w:rPr>
-              <w:t>rutamoto-db</w:t>
-            </w:r>
-            <w:proofErr w:type="spellEnd"/>
-            <w:r>
-              <w:rPr>
-                <w:sz w:val="20"/>
-              </w:rPr>
-              <w:t xml:space="preserve">, base </w:t>
-            </w:r>
-            <w:proofErr w:type="spellStart"/>
-            <w:r>
-              <w:rPr>
-                <w:sz w:val="20"/>
-              </w:rPr>
-              <w:t>rutamoto</w:t>
-            </w:r>
-            <w:proofErr w:type="spellEnd"/>
+                <w:i w:val="0"/>
+                <w:color w:val="000000"/>
+                <w:sz w:val="20"/>
+              </w:rPr>
+              <w:t>Contenedores rutamoto-odoo (Odoo Community 18.0) y rutamoto-db (PostgreSQL 16.15) sobre Docker Compose. Base rutamoto, compañía RutaMoto, país Guatemala, moneda GTQ.</w:t>
+            </w:r>
           </w:p>
         </w:tc>
         <w:tc>
@@ -8268,29 +8224,11 @@
             </w:pPr>
             <w:r>
               <w:rPr>
-                <w:i/>
-                <w:color w:val="808080"/>
-                <w:sz w:val="20"/>
-              </w:rPr>
-              <w:t xml:space="preserve">Ej.: túnel de </w:t>
-            </w:r>
-            <w:proofErr w:type="spellStart"/>
-            <w:r>
-              <w:rPr>
-                <w:i/>
-                <w:color w:val="808080"/>
-                <w:sz w:val="20"/>
-              </w:rPr>
-              <w:t>Cloudflare</w:t>
-            </w:r>
-            <w:proofErr w:type="spellEnd"/>
-            <w:r>
-              <w:rPr>
-                <w:i/>
-                <w:color w:val="808080"/>
-                <w:sz w:val="20"/>
-              </w:rPr>
-              <w:t xml:space="preserve"> hacia localhost:8069 (URL temporal *.trycloudflare.com)</w:t>
+                <w:i w:val="0"/>
+                <w:color w:val="000000"/>
+                <w:sz w:val="20"/>
+              </w:rPr>
+              <w:t>Túnel de Cloudflare hacia localhost:8069, con el modo de proxy activado en odoo.conf. La dirección es temporal y se comparte por el chat del grupo cada vez que se reinicia.</w:t>
             </w:r>
           </w:p>
         </w:tc>
@@ -8306,9 +8244,11 @@
             </w:pPr>
             <w:r>
               <w:rPr>
-                <w:sz w:val="20"/>
-              </w:rPr>
-              <w:t>Los demás roles trabajan desde su casa sin instalar nada</w:t>
+                <w:i w:val="0"/>
+                <w:color w:val="000000"/>
+                <w:sz w:val="20"/>
+              </w:rPr>
+              <w:t>Los otros tres integrantes trabajan desde su casa sin instalar nada</w:t>
             </w:r>
           </w:p>
         </w:tc>
@@ -8347,9 +8287,11 @@
             </w:pPr>
             <w:r>
               <w:rPr>
-                <w:sz w:val="20"/>
-              </w:rPr>
-              <w:t>Un usuario interno por integrante, con su nombre</w:t>
+                <w:i w:val="0"/>
+                <w:color w:val="000000"/>
+                <w:sz w:val="20"/>
+              </w:rPr>
+              <w:t>Cuatro usuarios internos, uno por integrante, con correo del dominio de la empresa.</w:t>
             </w:r>
           </w:p>
         </w:tc>
@@ -8367,21 +8309,7 @@
               <w:rPr>
                 <w:sz w:val="20"/>
               </w:rPr>
-              <w:t>El historial (</w:t>
-            </w:r>
-            <w:proofErr w:type="spellStart"/>
-            <w:r>
-              <w:rPr>
-                <w:sz w:val="20"/>
-              </w:rPr>
-              <w:t>chatter</w:t>
-            </w:r>
-            <w:proofErr w:type="spellEnd"/>
-            <w:r>
-              <w:rPr>
-                <w:sz w:val="20"/>
-              </w:rPr>
-              <w:t>) de cada registro muestra quién hizo qué: es la evidencia de autoría que pide la evaluación técnica</w:t>
+              <w:t>El historial (chatter) de cada registro muestra quién hizo qué: es la evidencia de autoría que pide la evaluación técnica</w:t>
             </w:r>
           </w:p>
         </w:tc>
@@ -8418,11 +8346,11 @@
             </w:pPr>
             <w:r>
               <w:rPr>
-                <w:i/>
-                <w:color w:val="808080"/>
-                <w:sz w:val="20"/>
-              </w:rPr>
-              <w:t>Fecha y hora de cada respaldo, antes y después de la carga</w:t>
+                <w:i w:val="0"/>
+                <w:color w:val="000000"/>
+                <w:sz w:val="20"/>
+              </w:rPr>
+              <w:t>Desde el gestor de bases de datos, en formato comprimido, al cerrar cada bloque de trabajo, y subidos a la carpeta del grupo en Drive.</w:t>
             </w:r>
           </w:p>
         </w:tc>
@@ -8573,9 +8501,11 @@
             </w:pPr>
             <w:r>
               <w:rPr>
-                <w:sz w:val="20"/>
-              </w:rPr>
-              <w:t>Rol 3 (administrador)</w:t>
+                <w:i w:val="0"/>
+                <w:color w:val="000000"/>
+                <w:sz w:val="20"/>
+              </w:rPr>
+              <w:t>Alberto Josué Hernández Armas</w:t>
             </w:r>
           </w:p>
         </w:tc>
@@ -8591,9 +8521,11 @@
             </w:pPr>
             <w:r>
               <w:rPr>
-                <w:sz w:val="20"/>
-              </w:rPr>
-              <w:t>Administración</w:t>
+                <w:i w:val="0"/>
+                <w:color w:val="000000"/>
+                <w:sz w:val="20"/>
+              </w:rPr>
+              <w:t>Administración de la instancia, inventario y compras</w:t>
             </w:r>
           </w:p>
         </w:tc>
@@ -8612,6 +8544,14 @@
               <w:spacing w:after="0"/>
               <w:jc w:val="left"/>
             </w:pPr>
+            <w:r>
+              <w:rPr>
+                <w:i w:val="0"/>
+                <w:color w:val="000000"/>
+                <w:sz w:val="20"/>
+              </w:rPr>
+              <w:t>santiago@rutamoto.gt</w:t>
+            </w:r>
           </w:p>
         </w:tc>
         <w:tc>
@@ -8626,9 +8566,11 @@
             </w:pPr>
             <w:r>
               <w:rPr>
-                <w:sz w:val="20"/>
-              </w:rPr>
-              <w:t>Rol 1</w:t>
+                <w:i w:val="0"/>
+                <w:color w:val="000000"/>
+                <w:sz w:val="20"/>
+              </w:rPr>
+              <w:t>Santiago Julián Barrera Reyes</w:t>
             </w:r>
           </w:p>
         </w:tc>
@@ -8642,6 +8584,14 @@
               <w:spacing w:after="0"/>
               <w:jc w:val="left"/>
             </w:pPr>
+            <w:r>
+              <w:rPr>
+                <w:i w:val="0"/>
+                <w:color w:val="000000"/>
+                <w:sz w:val="20"/>
+              </w:rPr>
+              <w:t>Inventario, ventas, compras, facturación y contactos</w:t>
+            </w:r>
           </w:p>
         </w:tc>
       </w:tr>
@@ -8659,6 +8609,14 @@
               <w:spacing w:after="0"/>
               <w:jc w:val="left"/>
             </w:pPr>
+            <w:r>
+              <w:rPr>
+                <w:i w:val="0"/>
+                <w:color w:val="000000"/>
+                <w:sz w:val="20"/>
+              </w:rPr>
+              <w:t>jemima@rutamoto.gt</w:t>
+            </w:r>
           </w:p>
         </w:tc>
         <w:tc>
@@ -8673,9 +8631,11 @@
             </w:pPr>
             <w:r>
               <w:rPr>
-                <w:sz w:val="20"/>
-              </w:rPr>
-              <w:t>Rol 2</w:t>
+                <w:i w:val="0"/>
+                <w:color w:val="000000"/>
+                <w:sz w:val="20"/>
+              </w:rPr>
+              <w:t>Jemima Solmaira Chavajay</w:t>
             </w:r>
           </w:p>
         </w:tc>
@@ -8689,6 +8649,14 @@
               <w:spacing w:after="0"/>
               <w:jc w:val="left"/>
             </w:pPr>
+            <w:r>
+              <w:rPr>
+                <w:i w:val="0"/>
+                <w:color w:val="000000"/>
+                <w:sz w:val="20"/>
+              </w:rPr>
+              <w:t>Inventario, ventas, compras, facturación y contactos</w:t>
+            </w:r>
           </w:p>
         </w:tc>
       </w:tr>
@@ -8705,6 +8673,14 @@
               <w:spacing w:after="0"/>
               <w:jc w:val="left"/>
             </w:pPr>
+            <w:r>
+              <w:rPr>
+                <w:i w:val="0"/>
+                <w:color w:val="000000"/>
+                <w:sz w:val="20"/>
+              </w:rPr>
+              <w:t>brayan@rutamoto.gt</w:t>
+            </w:r>
           </w:p>
         </w:tc>
         <w:tc>
@@ -8718,9 +8694,11 @@
             </w:pPr>
             <w:r>
               <w:rPr>
-                <w:sz w:val="20"/>
-              </w:rPr>
-              <w:t>Rol 4</w:t>
+                <w:i w:val="0"/>
+                <w:color w:val="000000"/>
+                <w:sz w:val="20"/>
+              </w:rPr>
+              <w:t>Brayan Emanuel García</w:t>
             </w:r>
           </w:p>
         </w:tc>
@@ -8733,6 +8711,14 @@
               <w:spacing w:after="0"/>
               <w:jc w:val="left"/>
             </w:pPr>
+            <w:r>
+              <w:rPr>
+                <w:i w:val="0"/>
+                <w:color w:val="000000"/>
+                <w:sz w:val="20"/>
+              </w:rPr>
+              <w:t>Inventario, ventas, compras, facturación, contactos y CRM</w:t>
+            </w:r>
           </w:p>
         </w:tc>
       </w:tr>
@@ -9985,11 +9971,70 @@
       </w:pPr>
       <w:r>
         <w:rPr>
-          <w:i/>
-          <w:color w:val="808080"/>
-          <w:sz w:val="20"/>
+          <w:i w:val="0"/>
+          <w:color w:val="000000"/>
         </w:rPr>
-        <w:t>Qué va aquí: el resumen del procedimiento (el detalle está en el MU-01), las decisiones que tomaste (por qué las categorías se crean antes, por qué se usa «Probar» antes de «Importar», cómo se resolvió el mapeo de columnas) y los errores que salieron con su solución. Una captura clave: la pantalla de importación con el mapeo de columnas y el mensaje de validación sin errores.</w:t>
+        <w:t>La importación se hizo hoja por hoja y en el orden que impone la dependencia entre registros: productos, existencias iniciales, reglas de reabastecimiento, proveedores, contactos de proveedor, lista de precios de proveedor y clientes. Ese orden no es una preferencia de método. Cada hoja nombra por texto registros que crea la anterior, así que invertir dos pasos deja filas sin referencia y la importación se detiene.</w:t>
+      </w:r>
+    </w:p>
+    <w:p>
+      <w:pPr>
+        <w:spacing w:after="120"/>
+      </w:pPr>
+      <w:r>
+        <w:rPr>
+          <w:i w:val="0"/>
+          <w:color w:val="000000"/>
+        </w:rPr>
+        <w:t>Antes de tocar el archivo hubo que preparar la base. Las seis categorías de producto se crearon sin categoría padre, porque Odoo compone el nombre completo con la jerarquía y una categoría colgada de «All» deja de coincidir con el texto del Excel. Las cuatro etiquetas de segmento se crearon por la misma razón. Y los términos de pago, que Odoo instala con nombre en inglés aunque la base esté en español, se renombraron a como los escribe el archivo; el quinto, «50% anticipo, 50% contra entrega», se creó con dos líneas porcentuales, porque Odoo 18 ya no admite el tipo de línea de saldo que usaban versiones anteriores.</w:t>
+      </w:r>
+    </w:p>
+    <w:p>
+      <w:pPr>
+        <w:spacing w:after="120"/>
+      </w:pPr>
+      <w:r>
+        <w:rPr>
+          <w:i w:val="0"/>
+          <w:color w:val="000000"/>
+        </w:rPr>
+        <w:t>Cada hoja se pasó primero por el botón «Probar», que ejecuta la importación completa contra la base y después deshace la transacción. Es la decisión de método que más tiempo ahorró. La validación encontró, sin escribir nada, que la columna de ubicación del archivo decía WH/Existencias mientras la ubicación real de la instancia es RMT/Existencias, porque la bodega se llama «Bodega Central RutaMoto» y su código corto es RMT desde la Fase 1. Con las treinta filas rechazadas y la base intacta, corregir costó un clic: como la instancia tiene una sola bodega, la columna se dejó en «No importar» y Odoo asignó la ubicación por omisión, que es precisamente la correcta. Se prefirió esa salida a editar el archivo, que ya estaba repartido entre los cuatro integrantes y cuya copia modificada habría abierto la puerta a que cada quien importara una versión distinta.</w:t>
+      </w:r>
+    </w:p>
+    <w:p>
+      <w:pPr>
+        <w:spacing w:after="120"/>
+      </w:pPr>
+      <w:r>
+        <w:rPr>
+          <w:i w:val="0"/>
+          <w:color w:val="000000"/>
+        </w:rPr>
+        <w:t>El mapeo de columnas se resolvió con la hoja «Diccionario» del propio archivo, que trae el nombre técnico de cada campo de Odoo. El importador reconoció por su cuenta solo dos columnas; las demás se asignaron a mano, y las columnas informativas, que están para cuadrar números y no para cargarse, se dejaron en «No importar». Las imágenes de producto entraron durante la misma importación: la columna correspondiente trae la dirección pública de cada archivo en el repositorio del grupo y Odoo las descarga sola, lo que obliga a que ese repositorio siga siendo público.</w:t>
+      </w:r>
+    </w:p>
+    <w:p>
+      <w:pPr>
+        <w:spacing w:after="120"/>
+      </w:pPr>
+      <w:r>
+        <w:rPr>
+          <w:i w:val="0"/>
+          <w:color w:val="000000"/>
+        </w:rPr>
+        <w:t>Dos advertencias conviene dejar escritas, porque las dos pueden arruinar la carga en silencio. La primera es que la hoja de existencias no carga existencia sino cantidades contadas: mientras no se pulse «Aplicar», el inventario sigue en cero y todo lo que venga después trabaja sobre datos vacíos. La segunda es que LUB-001 ya existía en la base desde la Fase 1, donde se creó como prueba de que la instalación operaba, con la misma referencia y los mismos precios del catálogo. El importador de Odoo no reconoce registros existentes si el archivo no trae una columna de identificador externo, así que importar esa fila habría dejado dos productos con el mismo código: se importaron las veintinueve restantes y se completó la ficha que ya estaba. Por eso la cantidad contada de sesenta unidades se aplicó sobre lo que había y el producto quedó en sesenta, y no en setenta y cinco.</w:t>
+      </w:r>
+    </w:p>
+    <w:p>
+      <w:pPr>
+        <w:spacing w:after="120"/>
+      </w:pPr>
+      <w:r>
+        <w:rPr>
+          <w:i w:val="0"/>
+          <w:color w:val="000000"/>
+        </w:rPr>
+        <w:t>El resultado de la carga masiva son 30 productos con su imagen, 30 líneas de existencia aplicadas por un valor al costo de Q 38,096.00, 30 reglas de reabastecimiento, 5 proveedores con su plazo de pago y su persona de contacto, 30 líneas de lista de precios de proveedor y 35 clientes con su segmento. El procedimiento completo, con captura en cada pantalla, está en el manual MU-01.</w:t>
       </w:r>
     </w:p>
     <w:p/>
@@ -10006,23 +10051,39 @@
         <w:jc w:val="center"/>
       </w:pPr>
       <w:r>
-        <w:rPr>
-          <w:i/>
-          <w:color w:val="808080"/>
-          <w:sz w:val="20"/>
-        </w:rPr>
-        <w:t xml:space="preserve">[ captura: pantalla de importación de productos con el mapeo de columnas y la prueba sin </w:t>
+        <w:drawing>
+          <wp:inline xmlns:a="http://schemas.openxmlformats.org/drawingml/2006/main" xmlns:pic="http://schemas.openxmlformats.org/drawingml/2006/picture">
+            <wp:extent cx="5486400" cy="4286250"/>
+            <wp:docPr id="101" name="Picture 1"/>
+            <wp:cNvGraphicFramePr>
+              <a:graphicFrameLocks noChangeAspect="1"/>
+            </wp:cNvGraphicFramePr>
+            <a:graphic>
+              <a:graphicData uri="http://schemas.openxmlformats.org/drawingml/2006/picture">
+                <pic:pic>
+                  <pic:nvPicPr>
+                    <pic:cNvPr id="0" name="mano_04_error_ubicacion.jpg"/>
+                    <pic:cNvPicPr/>
+                  </pic:nvPicPr>
+                  <pic:blipFill>
+                    <a:blip r:embed="rId8"/>
+                    <a:stretch>
+                      <a:fillRect/>
+                    </a:stretch>
+                  </pic:blipFill>
+                  <pic:spPr>
+                    <a:xfrm>
+                      <a:off x="0" y="0"/>
+                      <a:ext cx="5486400" cy="4286250"/>
+                    </a:xfrm>
+                    <a:prstGeom prst="rect"/>
+                  </pic:spPr>
+                </pic:pic>
+              </a:graphicData>
+            </a:graphic>
+          </wp:inline>
+        </w:drawing>
       </w:r>
-      <w:proofErr w:type="gramStart"/>
-      <w:r>
-        <w:rPr>
-          <w:i/>
-          <w:color w:val="808080"/>
-          <w:sz w:val="20"/>
-        </w:rPr>
-        <w:t>errores ]</w:t>
-      </w:r>
-      <w:proofErr w:type="gramEnd"/>
     </w:p>
     <w:p>
       <w:pPr>
@@ -10035,7 +10096,7 @@
           <w:color w:val="808080"/>
           <w:sz w:val="18"/>
         </w:rPr>
-        <w:t>Figura __. Importación masiva de productos: mapeo de columnas y validación. Elaboración propia.</w:t>
+        <w:t>Figura __. Validación previa de la importación: Odoo rechaza las 30 filas de la hoja de existencias porque la ubicación del archivo no existe en la instancia, y no escribe nada. Elaboración propia.</w:t>
       </w:r>
     </w:p>
     <w:tbl>
@@ -10130,6 +10191,14 @@
               <w:spacing w:after="0"/>
               <w:jc w:val="left"/>
             </w:pPr>
+            <w:r>
+              <w:rPr>
+                <w:i w:val="0"/>
+                <w:color w:val="000000"/>
+                <w:sz w:val="20"/>
+              </w:rPr>
+              <w:t>La columna de ubicación del archivo no existe en la instancia</w:t>
+            </w:r>
           </w:p>
         </w:tc>
         <w:tc>
@@ -10142,6 +10211,14 @@
               <w:spacing w:after="0"/>
               <w:jc w:val="left"/>
             </w:pPr>
+            <w:r>
+              <w:rPr>
+                <w:i w:val="0"/>
+                <w:color w:val="000000"/>
+                <w:sz w:val="20"/>
+              </w:rPr>
+              <w:t>El archivo trae WH/Existencias, que es el código por omisión de Odoo. La bodega del proyecto se llama «Bodega Central RutaMoto» y su código corto es RMT desde la Fase 1, así que su ubicación interna es RMT/Existencias.</w:t>
+            </w:r>
           </w:p>
         </w:tc>
         <w:tc>
@@ -10154,6 +10231,14 @@
               <w:spacing w:after="0"/>
               <w:jc w:val="left"/>
             </w:pPr>
+            <w:r>
+              <w:rPr>
+                <w:i w:val="0"/>
+                <w:color w:val="000000"/>
+                <w:sz w:val="20"/>
+              </w:rPr>
+              <w:t>La validación previa rechazó las 30 filas sin escribir nada. Como hay una sola bodega, la columna se dejó en «No importar» y Odoo asignó la ubicación por omisión, que es la correcta. El archivo de datos maestros no se modificó, para que los cuatro integrantes sigan trabajando sobre la misma copia.</w:t>
+            </w:r>
           </w:p>
         </w:tc>
       </w:tr>
@@ -10171,6 +10256,14 @@
               <w:spacing w:after="0"/>
               <w:jc w:val="left"/>
             </w:pPr>
+            <w:r>
+              <w:rPr>
+                <w:i w:val="0"/>
+                <w:color w:val="000000"/>
+                <w:sz w:val="20"/>
+              </w:rPr>
+              <w:t>LUB-001 ya existía en la base</w:t>
+            </w:r>
           </w:p>
         </w:tc>
         <w:tc>
@@ -10183,6 +10276,14 @@
               <w:spacing w:after="0"/>
               <w:jc w:val="left"/>
             </w:pPr>
+            <w:r>
+              <w:rPr>
+                <w:i w:val="0"/>
+                <w:color w:val="000000"/>
+                <w:sz w:val="20"/>
+              </w:rPr>
+              <w:t>Se creó en la Fase 1 como producto de prueba de la instalación, con la misma referencia del catálogo. El importador de Odoo no reconoce registros existentes si el archivo no trae columna de identificador externo.</w:t>
+            </w:r>
           </w:p>
         </w:tc>
         <w:tc>
@@ -10195,6 +10296,14 @@
               <w:spacing w:after="0"/>
               <w:jc w:val="left"/>
             </w:pPr>
+            <w:r>
+              <w:rPr>
+                <w:i w:val="0"/>
+                <w:color w:val="000000"/>
+                <w:sz w:val="20"/>
+              </w:rPr>
+              <w:t>Se importaron las 29 filas restantes y se completó la ficha existente, en lugar de crear un duplicado con el mismo código. La cantidad contada de la hoja de existencias se aplicó sobre esa misma ficha y la dejó en 60 unidades.</w:t>
+            </w:r>
           </w:p>
         </w:tc>
       </w:tr>
@@ -10211,6 +10320,14 @@
               <w:spacing w:after="0"/>
               <w:jc w:val="left"/>
             </w:pPr>
+            <w:r>
+              <w:rPr>
+                <w:i w:val="0"/>
+                <w:color w:val="000000"/>
+                <w:sz w:val="20"/>
+              </w:rPr>
+              <w:t>Los términos de pago estaban en inglés</w:t>
+            </w:r>
           </w:p>
         </w:tc>
         <w:tc>
@@ -10222,6 +10339,14 @@
               <w:spacing w:after="0"/>
               <w:jc w:val="left"/>
             </w:pPr>
+            <w:r>
+              <w:rPr>
+                <w:i w:val="0"/>
+                <w:color w:val="000000"/>
+                <w:sz w:val="20"/>
+              </w:rPr>
+              <w:t>La base se creó en español de Guatemala, pero los términos que Odoo instala por omisión conservan su nombre en inglés, y el archivo los nombra en español.</w:t>
+            </w:r>
           </w:p>
         </w:tc>
         <w:tc>
@@ -10233,6 +10358,14 @@
               <w:spacing w:after="0"/>
               <w:jc w:val="left"/>
             </w:pPr>
+            <w:r>
+              <w:rPr>
+                <w:i w:val="0"/>
+                <w:color w:val="000000"/>
+                <w:sz w:val="20"/>
+              </w:rPr>
+              <w:t>Se renombraron los cuatro existentes y se creó el quinto. Al crearlo se encontró que Odoo 18 ya no acepta el tipo de línea de saldo: las dos líneas se configuraron como porcentajes de 50 cada una.</w:t>
+            </w:r>
           </w:p>
         </w:tc>
       </w:tr>
@@ -10461,6 +10594,18 @@
         <w:t>. Si un número no cuadra, se escribe el que salió y por qué, no se corrige a mano para que cuadre.</w:t>
       </w:r>
     </w:p>
+    <w:p>
+      <w:pPr>
+        <w:spacing w:after="120"/>
+      </w:pPr>
+      <w:r>
+        <w:rPr>
+          <w:i w:val="0"/>
+          <w:color w:val="000000"/>
+        </w:rPr>
+        <w:t>La comprobación se hizo contra el archivo de origen y no contra la memoria: para cada fila se consultó Odoo y se comparó con la hoja «Cuadre» del Excel. La columna de resultado distingue lo que entró por importación de lo que aporta la carga manual, porque las dos cargas corren en paralelo y sus cifras se suman al final.</w:t>
+      </w:r>
+    </w:p>
     <w:tbl>
       <w:tblPr>
         <w:tblStyle w:val="Tablaconcuadrcula"/>
@@ -10495,6 +10640,7 @@
                 <w:b/>
                 <w:sz w:val="20"/>
               </w:rPr>
+              <w:lastRenderedPageBreak/>
               <w:t>Comprobación</w:t>
             </w:r>
           </w:p>
@@ -10515,17 +10661,8 @@
                 <w:b/>
                 <w:sz w:val="20"/>
               </w:rPr>
-              <w:t xml:space="preserve">Dónde se mira en </w:t>
-            </w:r>
-            <w:proofErr w:type="spellStart"/>
-            <w:r>
-              <w:rPr>
-                <w:b/>
-                <w:sz w:val="20"/>
-              </w:rPr>
-              <w:t>Odoo</w:t>
-            </w:r>
-            <w:proofErr w:type="spellEnd"/>
+              <w:t>Dónde se mira en Odoo</w:t>
+            </w:r>
           </w:p>
         </w:tc>
         <w:tc>
@@ -10637,6 +10774,14 @@
               <w:spacing w:after="0"/>
               <w:jc w:val="left"/>
             </w:pPr>
+            <w:r>
+              <w:rPr>
+                <w:i w:val="0"/>
+                <w:color w:val="000000"/>
+                <w:sz w:val="20"/>
+              </w:rPr>
+              <w:t>30 por importación, verificados contra la hoja 1_Productos. Los 6 restantes entran por la carga manual.</w:t>
+            </w:r>
           </w:p>
         </w:tc>
       </w:tr>
@@ -10708,6 +10853,14 @@
               <w:spacing w:after="0"/>
               <w:jc w:val="left"/>
             </w:pPr>
+            <w:r>
+              <w:rPr>
+                <w:i w:val="0"/>
+                <w:color w:val="000000"/>
+                <w:sz w:val="20"/>
+              </w:rPr>
+              <w:t>6 en cada una de las cinco categorías importadas. La sexta se completa con la carga manual.</w:t>
+            </w:r>
           </w:p>
         </w:tc>
       </w:tr>
@@ -10779,6 +10932,14 @@
               <w:spacing w:after="0"/>
               <w:jc w:val="left"/>
             </w:pPr>
+            <w:r>
+              <w:rPr>
+                <w:i w:val="0"/>
+                <w:color w:val="000000"/>
+                <w:sz w:val="20"/>
+              </w:rPr>
+              <w:t>Q 38,096.00 de la carga masiva, igual al centavo que la hoja «Cuadre». Con la carga manual llega a Q 45,000.00.</w:t>
+            </w:r>
           </w:p>
         </w:tc>
       </w:tr>
@@ -10850,6 +11011,14 @@
               <w:spacing w:after="0"/>
               <w:jc w:val="left"/>
             </w:pPr>
+            <w:r>
+              <w:rPr>
+                <w:i w:val="0"/>
+                <w:color w:val="000000"/>
+                <w:sz w:val="20"/>
+              </w:rPr>
+              <w:t>5 por importación, cada uno con su plazo de pago y su persona de contacto.</w:t>
+            </w:r>
           </w:p>
         </w:tc>
       </w:tr>
@@ -10921,6 +11090,14 @@
               <w:spacing w:after="0"/>
               <w:jc w:val="left"/>
             </w:pPr>
+            <w:r>
+              <w:rPr>
+                <w:i w:val="0"/>
+                <w:color w:val="000000"/>
+                <w:sz w:val="20"/>
+              </w:rPr>
+              <w:t>Por importación: Repartidor 12, Motociclista particular 11, Taller mecánico 7 y Entusiasta 5.</w:t>
+            </w:r>
           </w:p>
         </w:tc>
       </w:tr>
@@ -10992,6 +11169,14 @@
               <w:spacing w:after="0"/>
               <w:jc w:val="left"/>
             </w:pPr>
+            <w:r>
+              <w:rPr>
+                <w:i w:val="0"/>
+                <w:color w:val="000000"/>
+                <w:sz w:val="20"/>
+              </w:rPr>
+              <w:t>30 importadas, más 2 creadas con los productos adicionales: 32 al cierre de esta parte.</w:t>
+            </w:r>
           </w:p>
         </w:tc>
       </w:tr>
@@ -11063,6 +11248,14 @@
               <w:spacing w:after="0"/>
               <w:jc w:val="left"/>
             </w:pPr>
+            <w:r>
+              <w:rPr>
+                <w:i w:val="0"/>
+                <w:color w:val="000000"/>
+                <w:sz w:val="20"/>
+              </w:rPr>
+              <w:t>4: LUB-004 con 8 contra un mínimo de 20, FRE-001 con 6 contra 15, ELE-002 con 12 contra 30 y LLA-002 en cero contra 4.</w:t>
+            </w:r>
           </w:p>
         </w:tc>
       </w:tr>
@@ -11130,6 +11323,14 @@
               <w:spacing w:after="0"/>
               <w:jc w:val="left"/>
             </w:pPr>
+            <w:r>
+              <w:rPr>
+                <w:i w:val="0"/>
+                <w:color w:val="000000"/>
+                <w:sz w:val="20"/>
+              </w:rPr>
+              <w:t>Verificado: las 30 líneas de lista de precios quedaron en la pestaña de compra de cada producto, y las órdenes tomaron de ahí el proveedor, el precio y el plazo sin escribir nada.</w:t>
+            </w:r>
           </w:p>
         </w:tc>
       </w:tr>
@@ -11203,11 +11404,10 @@
       </w:pPr>
       <w:r>
         <w:rPr>
-          <w:i/>
-          <w:color w:val="808080"/>
-          <w:sz w:val="20"/>
+          <w:i w:val="0"/>
+          <w:color w:val="000000"/>
         </w:rPr>
-        <w:t>15 puntos compartidos con la 12.3. El alcance obligatorio del enunciado pide el ciclo COMPLETO: requisición, solicitud de cotización, orden de compra y recepción. Además, el «Módulo avanzado implementado» es requisito para optar a la calificación: si el ciclo no es demostrable, la nota del proyecto es cero. Detalle paso a paso en el MU-01, capítulos 8 a 12.</w:t>
+        <w:t>El enunciado exige el ciclo de compras completo: requisición, solicitud de cotización, orden de compra y recepción, con el movimiento reflejado en el módulo de inventario. Esta sección documenta cómo se implementó cada eslabón sobre Odoo 18 Community y qué documentos quedaron en la base como evidencia de cada uno.</w:t>
       </w:r>
     </w:p>
     <w:p>
@@ -11226,11 +11426,22 @@
       </w:pPr>
       <w:r>
         <w:rPr>
-          <w:i/>
-          <w:color w:val="808080"/>
-          <w:sz w:val="20"/>
+          <w:i w:val="0"/>
+          <w:color w:val="000000"/>
         </w:rPr>
-        <w:t>LUB-007 y ELE-007, creados desde el formulario y no desde el Excel, con existencia cero. Su existencia entra por la orden de compra: así un mismo producto demuestra la creación y el ciclo completo.</w:t>
+        <w:t>LUB-007, lubricante de cadena en aerosol de 400 ml, y ELE-007, bombillo LED de stop 1157, se crearon desde el formulario de producto y no desde el archivo, con la casilla de seguimiento de inventario marcada, existencia cero y su proveedor cargado en la pestaña de compra.</w:t>
+      </w:r>
+    </w:p>
+    <w:p>
+      <w:pPr>
+        <w:spacing w:after="120"/>
+      </w:pPr>
+      <w:r>
+        <w:rPr>
+          <w:i w:val="0"/>
+          <w:color w:val="000000"/>
+        </w:rPr>
+        <w:t>Su existencia entró después por las compras 2 y 3, de modo que un mismo producto demuestra las dos cosas que pide el enunciado: la creación desde el sistema y el ciclo de compras completo. Las reglas de reabastecimiento de ambos, con mínimo 10 y máximo 40, se crearon al final, con la mercadería ya recibida. El orden importa: creadas antes, los dos habrían entrado en la lista de alertas con existencia cero y la propuesta de reposición habría sido de cuarenta unidades de cada uno, en lugar de las cantidades del plan de compras.</w:t>
       </w:r>
     </w:p>
     <w:tbl>
@@ -11268,7 +11479,6 @@
                 <w:b/>
                 <w:sz w:val="20"/>
               </w:rPr>
-              <w:lastRenderedPageBreak/>
               <w:t>Código</w:t>
             </w:r>
           </w:p>
@@ -11570,65 +11780,58 @@
       </w:pPr>
       <w:r>
         <w:rPr>
-          <w:i/>
-          <w:color w:val="808080"/>
-          <w:sz w:val="20"/>
+          <w:i w:val="0"/>
+          <w:color w:val="000000"/>
         </w:rPr>
-        <w:t xml:space="preserve">Explicar cómo se implementó la requisición en </w:t>
+        <w:t>Odoo 18 Community no tiene un documento que se llame requisición. El módulo de Acuerdos de compra, que es lo más parecido, no viene en esta edición, y a dos semanas de la entrega no se quiso depender de un módulo de terceros para un requisito obligatorio. La requisición de este proyecto es, entonces, la alerta de la regla de reabastecimiento, y el acto de requerir es el botón «Ordenar una vez». Se documenta como decisión de diseño y no como una carencia disimulada, porque el ciclo queda completo y, sobre todo, trazable: cada orden de compra conserva como documento de origen la regla que la disparó.</w:t>
       </w:r>
-      <w:proofErr w:type="spellStart"/>
+    </w:p>
+    <w:p>
+      <w:pPr>
+        <w:spacing w:after="120"/>
+      </w:pPr>
       <w:r>
         <w:rPr>
-          <w:i/>
-          <w:color w:val="808080"/>
-          <w:sz w:val="20"/>
+          <w:i w:val="0"/>
+          <w:color w:val="000000"/>
         </w:rPr>
-        <w:t>Odoo</w:t>
+        <w:t>El inventario inicial del archivo está construido para que eso ocurra. Cuatro productos quedan por debajo de su mínimo al terminar la carga, y la cantidad que la regla propone para cada uno es exactamente la que lo lleva a su máximo: 44 unidades de FRE-001, 72 de LUB-004, 88 de ELE-002 y 16 de LLA-002. Esas cuatro cantidades son las de las compras del plan, de manera que ninguna cifra de esta sección se escribió a mano.</w:t>
       </w:r>
-      <w:proofErr w:type="spellEnd"/>
+    </w:p>
+    <w:p>
+      <w:pPr>
+        <w:spacing w:after="120"/>
+      </w:pPr>
       <w:r>
         <w:rPr>
-          <w:i/>
-          <w:color w:val="808080"/>
-          <w:sz w:val="20"/>
+          <w:i w:val="0"/>
+          <w:color w:val="000000"/>
         </w:rPr>
-        <w:t xml:space="preserve"> 18 </w:t>
+        <w:t>La compra 1 recorre el ciclo entero y es la que se documenta con detalle. La alerta de FRE-001, con 6 unidades contra un mínimo de 15, generó la solicitud de presupuesto P00001 a Frenos y Transmisiones de Guatemala por 44 unidades a Q 55, Q 2,420 en total. Ni el proveedor ni el precio ni la fecha prevista se escribieron: salieron de la lista de precios de proveedor importada, y el plazo de treinta días vino de la ficha del proveedor. Al confirmar, la solicitud pasó a pedido de compra y Odoo generó por su cuenta la recepción RMT/IN/00001, que se validó con las 44 unidades completas.</w:t>
       </w:r>
-      <w:proofErr w:type="spellStart"/>
+    </w:p>
+    <w:p>
+      <w:pPr>
+        <w:spacing w:after="120"/>
+      </w:pPr>
       <w:r>
         <w:rPr>
-          <w:i/>
-          <w:color w:val="808080"/>
-          <w:sz w:val="20"/>
+          <w:i w:val="0"/>
+          <w:color w:val="000000"/>
         </w:rPr>
-        <w:t>Community</w:t>
+        <w:t>Las compras 2 y 3 siguieron el mismo camino. La segunda nació de la alerta de LUB-004, por 72 unidades, y antes de confirmarla se le agregó una línea de 24 unidades de LUB-007: Q 2,280 recibidos en RMT/IN/00002. La tercera, 30 unidades de ELE-007 por Q 660, se creó desde el formulario porque ese producto todavía no tenía regla de reabastecimiento, y se recibió en RMT/IN/00003.</w:t>
       </w:r>
-      <w:proofErr w:type="spellEnd"/>
+    </w:p>
+    <w:p>
+      <w:pPr>
+        <w:spacing w:after="120"/>
+      </w:pPr>
       <w:r>
         <w:rPr>
-          <w:i/>
-          <w:color w:val="808080"/>
-          <w:sz w:val="20"/>
+          <w:i w:val="0"/>
+          <w:color w:val="000000"/>
         </w:rPr>
-        <w:t xml:space="preserve">, que no tiene un documento llamado así: la requisición nace de la alerta de stock bajo (regla de reabastecimiento) y se convierte en solicitud de cotización al proveedor. Si instalaron Acuerdos de compra (licitación) para comparar dos proveedores, decirlo aquí. Luego la solicitud de cotización se confirma como orden de compra y la mercadería se recibe. Una fila por documento, con su número real de </w:t>
-      </w:r>
-      <w:proofErr w:type="spellStart"/>
-      <w:r>
-        <w:rPr>
-          <w:i/>
-          <w:color w:val="808080"/>
-          <w:sz w:val="20"/>
-        </w:rPr>
-        <w:t>Odoo</w:t>
-      </w:r>
-      <w:proofErr w:type="spellEnd"/>
-      <w:r>
-        <w:rPr>
-          <w:i/>
-          <w:color w:val="808080"/>
-          <w:sz w:val="20"/>
-        </w:rPr>
-        <w:t xml:space="preserve"> (P0000x, WH/IN/0000x).</w:t>
+        <w:t>Las compras 4 y 5 quedaron abiertas a propósito. La cuarta está confirmada, con su recepción preparada pero sin validar; la quinta quedó como solicitud enviada, sin confirmar. Son las órdenes pendientes de proveedores que pide el informe de inventario de la sección 9, y son también la razón por la que LLA-002 sigue en cero al cierre de la fase.</w:t>
       </w:r>
     </w:p>
     <w:tbl>
@@ -11686,17 +11889,8 @@
                 <w:b/>
                 <w:sz w:val="20"/>
               </w:rPr>
-              <w:t xml:space="preserve">Documento en </w:t>
-            </w:r>
-            <w:proofErr w:type="spellStart"/>
-            <w:r>
-              <w:rPr>
-                <w:b/>
-                <w:sz w:val="20"/>
-              </w:rPr>
-              <w:t>Odoo</w:t>
-            </w:r>
-            <w:proofErr w:type="spellEnd"/>
+              <w:t>Documento en Odoo</w:t>
+            </w:r>
           </w:p>
         </w:tc>
         <w:tc>
@@ -11810,6 +12004,14 @@
               <w:spacing w:after="0"/>
               <w:jc w:val="left"/>
             </w:pPr>
+            <w:r>
+              <w:rPr>
+                <w:i w:val="0"/>
+                <w:color w:val="000000"/>
+                <w:sz w:val="20"/>
+              </w:rPr>
+              <w:t>Regla de FRE-001</w:t>
+            </w:r>
           </w:p>
         </w:tc>
         <w:tc>
@@ -11840,6 +12042,14 @@
               <w:spacing w:after="0"/>
               <w:jc w:val="left"/>
             </w:pPr>
+            <w:r>
+              <w:rPr>
+                <w:i w:val="0"/>
+                <w:color w:val="000000"/>
+                <w:sz w:val="20"/>
+              </w:rPr>
+              <w:t>Disparada: propone 44 unidades para llegar al máximo de 50</w:t>
+            </w:r>
           </w:p>
         </w:tc>
       </w:tr>
@@ -11895,11 +12105,11 @@
             </w:pPr>
             <w:r>
               <w:rPr>
-                <w:i/>
-                <w:color w:val="808080"/>
-                <w:sz w:val="20"/>
-              </w:rPr>
-              <w:t>P0000_</w:t>
+                <w:i w:val="0"/>
+                <w:color w:val="000000"/>
+                <w:sz w:val="20"/>
+              </w:rPr>
+              <w:t>P00001</w:t>
             </w:r>
           </w:p>
         </w:tc>
@@ -11931,6 +12141,14 @@
               <w:spacing w:after="0"/>
               <w:jc w:val="left"/>
             </w:pPr>
+            <w:r>
+              <w:rPr>
+                <w:i w:val="0"/>
+                <w:color w:val="000000"/>
+                <w:sz w:val="20"/>
+              </w:rPr>
+              <w:t>Enviada al proveedor</w:t>
+            </w:r>
           </w:p>
         </w:tc>
       </w:tr>
@@ -11986,11 +12204,11 @@
             </w:pPr>
             <w:r>
               <w:rPr>
-                <w:i/>
-                <w:color w:val="808080"/>
-                <w:sz w:val="20"/>
-              </w:rPr>
-              <w:t>P0000_</w:t>
+                <w:i w:val="0"/>
+                <w:color w:val="000000"/>
+                <w:sz w:val="20"/>
+              </w:rPr>
+              <w:t>P00001</w:t>
             </w:r>
           </w:p>
         </w:tc>
@@ -12022,6 +12240,14 @@
               <w:spacing w:after="0"/>
               <w:jc w:val="left"/>
             </w:pPr>
+            <w:r>
+              <w:rPr>
+                <w:i w:val="0"/>
+                <w:color w:val="000000"/>
+                <w:sz w:val="20"/>
+              </w:rPr>
+              <w:t>Confirmada</w:t>
+            </w:r>
           </w:p>
         </w:tc>
       </w:tr>
@@ -12074,11 +12300,11 @@
             </w:pPr>
             <w:r>
               <w:rPr>
-                <w:i/>
-                <w:color w:val="808080"/>
-                <w:sz w:val="20"/>
-              </w:rPr>
-              <w:t>WH/IN/0000_</w:t>
+                <w:i w:val="0"/>
+                <w:color w:val="000000"/>
+                <w:sz w:val="20"/>
+              </w:rPr>
+              <w:t>RMT/IN/00001</w:t>
             </w:r>
           </w:p>
         </w:tc>
@@ -12108,6 +12334,14 @@
               <w:spacing w:after="0"/>
               <w:jc w:val="left"/>
             </w:pPr>
+            <w:r>
+              <w:rPr>
+                <w:i w:val="0"/>
+                <w:color w:val="000000"/>
+                <w:sz w:val="20"/>
+              </w:rPr>
+              <w:t>Validada, estado Hecho</w:t>
+            </w:r>
           </w:p>
         </w:tc>
       </w:tr>
@@ -12335,6 +12569,14 @@
               <w:spacing w:after="0"/>
               <w:jc w:val="left"/>
             </w:pPr>
+            <w:r>
+              <w:rPr>
+                <w:i w:val="0"/>
+                <w:color w:val="000000"/>
+                <w:sz w:val="20"/>
+              </w:rPr>
+              <w:t>P00001</w:t>
+            </w:r>
           </w:p>
         </w:tc>
         <w:tc>
@@ -12349,6 +12591,8 @@
             </w:pPr>
             <w:r>
               <w:rPr>
+                <w:i w:val="0"/>
+                <w:color w:val="000000"/>
                 <w:sz w:val="20"/>
               </w:rPr>
               <w:t>Recibida</w:t>
@@ -12365,6 +12609,14 @@
               <w:spacing w:after="0"/>
               <w:jc w:val="left"/>
             </w:pPr>
+            <w:r>
+              <w:rPr>
+                <w:i w:val="0"/>
+                <w:color w:val="000000"/>
+                <w:sz w:val="20"/>
+              </w:rPr>
+              <w:t>Recibida completa en RMT/IN/00001, por Q 2,420</w:t>
+            </w:r>
           </w:p>
         </w:tc>
       </w:tr>
@@ -12436,6 +12688,14 @@
               <w:spacing w:after="0"/>
               <w:jc w:val="left"/>
             </w:pPr>
+            <w:r>
+              <w:rPr>
+                <w:i w:val="0"/>
+                <w:color w:val="000000"/>
+                <w:sz w:val="20"/>
+              </w:rPr>
+              <w:t>P00002</w:t>
+            </w:r>
           </w:p>
         </w:tc>
         <w:tc>
@@ -12450,6 +12710,8 @@
             </w:pPr>
             <w:r>
               <w:rPr>
+                <w:i w:val="0"/>
+                <w:color w:val="000000"/>
                 <w:sz w:val="20"/>
               </w:rPr>
               <w:t>Recibida</w:t>
@@ -12466,6 +12728,14 @@
               <w:spacing w:after="0"/>
               <w:jc w:val="left"/>
             </w:pPr>
+            <w:r>
+              <w:rPr>
+                <w:i w:val="0"/>
+                <w:color w:val="000000"/>
+                <w:sz w:val="20"/>
+              </w:rPr>
+              <w:t>Recibida completa en RMT/IN/00002, por Q 2,280</w:t>
+            </w:r>
           </w:p>
         </w:tc>
       </w:tr>
@@ -12537,6 +12807,14 @@
               <w:spacing w:after="0"/>
               <w:jc w:val="left"/>
             </w:pPr>
+            <w:r>
+              <w:rPr>
+                <w:i w:val="0"/>
+                <w:color w:val="000000"/>
+                <w:sz w:val="20"/>
+              </w:rPr>
+              <w:t>P00003</w:t>
+            </w:r>
           </w:p>
         </w:tc>
         <w:tc>
@@ -12551,6 +12829,8 @@
             </w:pPr>
             <w:r>
               <w:rPr>
+                <w:i w:val="0"/>
+                <w:color w:val="000000"/>
                 <w:sz w:val="20"/>
               </w:rPr>
               <w:t>Recibida</w:t>
@@ -12567,6 +12847,14 @@
               <w:spacing w:after="0"/>
               <w:jc w:val="left"/>
             </w:pPr>
+            <w:r>
+              <w:rPr>
+                <w:i w:val="0"/>
+                <w:color w:val="000000"/>
+                <w:sz w:val="20"/>
+              </w:rPr>
+              <w:t>Recibida completa en RMT/IN/00003, por Q 660</w:t>
+            </w:r>
           </w:p>
         </w:tc>
       </w:tr>
@@ -12638,6 +12926,14 @@
               <w:spacing w:after="0"/>
               <w:jc w:val="left"/>
             </w:pPr>
+            <w:r>
+              <w:rPr>
+                <w:i w:val="0"/>
+                <w:color w:val="000000"/>
+                <w:sz w:val="20"/>
+              </w:rPr>
+              <w:t>P00004</w:t>
+            </w:r>
           </w:p>
         </w:tc>
         <w:tc>
@@ -12652,6 +12948,8 @@
             </w:pPr>
             <w:r>
               <w:rPr>
+                <w:i w:val="0"/>
+                <w:color w:val="000000"/>
                 <w:sz w:val="20"/>
               </w:rPr>
               <w:t>Por recibir</w:t>
@@ -12668,6 +12966,14 @@
               <w:spacing w:after="0"/>
               <w:jc w:val="left"/>
             </w:pPr>
+            <w:r>
+              <w:rPr>
+                <w:i w:val="0"/>
+                <w:color w:val="000000"/>
+                <w:sz w:val="20"/>
+              </w:rPr>
+              <w:t>Confirmada por Q 4,400; la recepción RMT/IN/00004 queda lista sin validar</w:t>
+            </w:r>
           </w:p>
         </w:tc>
       </w:tr>
@@ -12735,6 +13041,14 @@
               <w:spacing w:after="0"/>
               <w:jc w:val="left"/>
             </w:pPr>
+            <w:r>
+              <w:rPr>
+                <w:i w:val="0"/>
+                <w:color w:val="000000"/>
+                <w:sz w:val="20"/>
+              </w:rPr>
+              <w:t>P00005</w:t>
+            </w:r>
           </w:p>
         </w:tc>
         <w:tc>
@@ -12748,6 +13062,8 @@
             </w:pPr>
             <w:r>
               <w:rPr>
+                <w:i w:val="0"/>
+                <w:color w:val="000000"/>
                 <w:sz w:val="20"/>
               </w:rPr>
               <w:t>Solicitud enviada</w:t>
@@ -12763,6 +13079,14 @@
               <w:spacing w:after="0"/>
               <w:jc w:val="left"/>
             </w:pPr>
+            <w:r>
+              <w:rPr>
+                <w:i w:val="0"/>
+                <w:color w:val="000000"/>
+                <w:sz w:val="20"/>
+              </w:rPr>
+              <w:t>Solicitud de cotización por Q 1,584, sin confirmar</w:t>
+            </w:r>
           </w:p>
         </w:tc>
       </w:tr>
@@ -12797,11 +13121,22 @@
       </w:pPr>
       <w:r>
         <w:rPr>
-          <w:i/>
-          <w:color w:val="808080"/>
-          <w:sz w:val="20"/>
+          <w:i w:val="0"/>
+          <w:color w:val="000000"/>
         </w:rPr>
-        <w:t>El enunciado pide «verificar que el movimiento se refleje en el módulo de inventario». Mostrarlo con un antes y después del mismo producto, y con el movimiento registrado en Inventario › Informes › Historial de movimientos.</w:t>
+        <w:t>La comprobación que pide el enunciado es que el movimiento de compra se vea en el módulo de inventario, y se hizo producto por producto, con el antes y el después. FRE-001 pasó de 6 a 50 unidades, LUB-004 de 8 a 80, y los dos productos creados desde el sistema pasaron de cero a 24 y a 30 unidades. En el historial de movimientos queda, por cada recepción, la línea de entrada desde la ubicación de proveedores hacia RMT/Existencias, con su fecha, su documento de origen y el usuario que la validó.</w:t>
+      </w:r>
+    </w:p>
+    <w:p>
+      <w:pPr>
+        <w:spacing w:after="120"/>
+      </w:pPr>
+      <w:r>
+        <w:rPr>
+          <w:i w:val="0"/>
+          <w:color w:val="000000"/>
+        </w:rPr>
+        <w:t>El efecto se ve además donde no se estaba buscando. Las alertas de reabastecimiento de los productos recibidos desaparecieron solas, porque la existencia volvió a estar por encima del mínimo, y el inventario valorizado subió de Q 38,096.00 a Q 43,456.00: exactamente el costo de las tres compras recibidas, Q 2,420 más Q 2,280 más Q 660. Que esa suma cierre al quetzal es la prueba de que el movimiento no se registró en dos lugares distintos, sino en uno solo que los módulos comparten.</w:t>
       </w:r>
     </w:p>
     <w:tbl>
@@ -12839,7 +13174,6 @@
                 <w:b/>
                 <w:sz w:val="20"/>
               </w:rPr>
-              <w:lastRenderedPageBreak/>
               <w:t>Producto</w:t>
             </w:r>
           </w:p>
@@ -13011,6 +13345,14 @@
               <w:spacing w:after="0"/>
               <w:jc w:val="left"/>
             </w:pPr>
+            <w:r>
+              <w:rPr>
+                <w:i w:val="0"/>
+                <w:color w:val="000000"/>
+                <w:sz w:val="20"/>
+              </w:rPr>
+              <w:t>50</w:t>
+            </w:r>
           </w:p>
         </w:tc>
       </w:tr>
@@ -13100,6 +13442,14 @@
               <w:spacing w:after="0"/>
               <w:jc w:val="left"/>
             </w:pPr>
+            <w:r>
+              <w:rPr>
+                <w:i w:val="0"/>
+                <w:color w:val="000000"/>
+                <w:sz w:val="20"/>
+              </w:rPr>
+              <w:t>80</w:t>
+            </w:r>
           </w:p>
         </w:tc>
       </w:tr>
@@ -13189,6 +13539,14 @@
               <w:spacing w:after="0"/>
               <w:jc w:val="left"/>
             </w:pPr>
+            <w:r>
+              <w:rPr>
+                <w:i w:val="0"/>
+                <w:color w:val="000000"/>
+                <w:sz w:val="20"/>
+              </w:rPr>
+              <w:t>24</w:t>
+            </w:r>
           </w:p>
         </w:tc>
       </w:tr>
@@ -13273,6 +13631,14 @@
               <w:spacing w:after="0"/>
               <w:jc w:val="left"/>
             </w:pPr>
+            <w:r>
+              <w:rPr>
+                <w:i w:val="0"/>
+                <w:color w:val="000000"/>
+                <w:sz w:val="20"/>
+              </w:rPr>
+              <w:t>30</w:t>
+            </w:r>
           </w:p>
         </w:tc>
       </w:tr>
@@ -13304,23 +13670,39 @@
         <w:jc w:val="center"/>
       </w:pPr>
       <w:r>
-        <w:rPr>
-          <w:i/>
-          <w:color w:val="808080"/>
-          <w:sz w:val="20"/>
-        </w:rPr>
-        <w:t>[ captura: historial de movimientos mostrando la entrada de FRE-001 desde el proveedor a WH/</w:t>
+        <w:drawing>
+          <wp:inline xmlns:a="http://schemas.openxmlformats.org/drawingml/2006/main" xmlns:pic="http://schemas.openxmlformats.org/drawingml/2006/picture">
+            <wp:extent cx="5486400" cy="3105937"/>
+            <wp:docPr id="102" name="Picture 2"/>
+            <wp:cNvGraphicFramePr>
+              <a:graphicFrameLocks noChangeAspect="1"/>
+            </wp:cNvGraphicFramePr>
+            <a:graphic>
+              <a:graphicData uri="http://schemas.openxmlformats.org/drawingml/2006/picture">
+                <pic:pic>
+                  <pic:nvPicPr>
+                    <pic:cNvPr id="0" name="28_historial_movimientos.png"/>
+                    <pic:cNvPicPr/>
+                  </pic:nvPicPr>
+                  <pic:blipFill>
+                    <a:blip r:embed="rId9"/>
+                    <a:stretch>
+                      <a:fillRect/>
+                    </a:stretch>
+                  </pic:blipFill>
+                  <pic:spPr>
+                    <a:xfrm>
+                      <a:off x="0" y="0"/>
+                      <a:ext cx="5486400" cy="3105937"/>
+                    </a:xfrm>
+                    <a:prstGeom prst="rect"/>
+                  </pic:spPr>
+                </pic:pic>
+              </a:graphicData>
+            </a:graphic>
+          </wp:inline>
+        </w:drawing>
       </w:r>
-      <w:proofErr w:type="gramStart"/>
-      <w:r>
-        <w:rPr>
-          <w:i/>
-          <w:color w:val="808080"/>
-          <w:sz w:val="20"/>
-        </w:rPr>
-        <w:t>Existencias ]</w:t>
-      </w:r>
-      <w:proofErr w:type="gramEnd"/>
     </w:p>
     <w:p>
       <w:pPr>
@@ -13333,7 +13715,7 @@
           <w:color w:val="808080"/>
           <w:sz w:val="18"/>
         </w:rPr>
-        <w:t>Figura __. Movimiento de inventario generado por la recepción. Elaboración propia.</w:t>
+        <w:t>Figura __. Historial de movimientos: la entrada de FRE-001 desde la ubicación de proveedores hacia RMT/Existencias. Elaboración propia.</w:t>
       </w:r>
     </w:p>
     <w:p>

</xml_diff>

<commit_message>
docs: informe con las secciones del rol 3 integradas
</commit_message>
<xml_diff>
--- a/Entrega_Fase2_Grupo14/1_Informe/informe_fase2_PLANTILLA.docx
+++ b/Entrega_Fase2_Grupo14/1_Informe/informe_fase2_PLANTILLA.docx
@@ -8009,56 +8009,46 @@
       </w:pPr>
       <w:r>
         <w:rPr>
-          <w:i/>
-          <w:color w:val="808080"/>
-          <w:sz w:val="20"/>
+          <w:i w:val="0"/>
+          <w:color w:val="000000"/>
         </w:rPr>
-        <w:t xml:space="preserve">Qué va aquí: cómo trabajaron cuatro personas sobre UNA sola instancia de </w:t>
+        <w:t>Las cuatro personas del equipo trabajaron sobre una sola instancia de Odoo, la que quedó instalada y documentada en la Fase 1. La alternativa, que cada quien levantara su propia copia, se descartó temprano: la carga de datos, el ciclo de compras, las cotizaciones y la campaña del CRM se apoyan unas en otras, y con cuatro bases distintas ningún número de este informe cuadraría contra otro. El costo de la decisión se asume de forma explícita: todo depende de que una sola máquina esté encendida, que es el mismo punto único de falla que ya se señaló en la fase anterior.</w:t>
       </w:r>
-      <w:proofErr w:type="spellStart"/>
+    </w:p>
+    <w:p>
+      <w:pPr>
+        <w:spacing w:after="120"/>
+      </w:pPr>
       <w:r>
         <w:rPr>
-          <w:i/>
-          <w:color w:val="808080"/>
-          <w:sz w:val="20"/>
+          <w:i w:val="0"/>
+          <w:color w:val="000000"/>
         </w:rPr>
-        <w:t>Odoo</w:t>
+        <w:t>El acceso del resto del equipo se resolvió con un túnel de Cloudflare, que publica el puerto 8069 de esa máquina en una dirección temporal sin abrir puertos en el enrutador ni contratar un servidor. En la configuración de Odoo se activó el modo de proxy para que el servidor confíe en las cabeceras del túnel y construya bien sus direcciones absolutas. La dirección cambia cada vez que el túnel se reinicia, así que se comparte por el chat del grupo.</w:t>
       </w:r>
-      <w:proofErr w:type="spellEnd"/>
+    </w:p>
+    <w:p>
+      <w:pPr>
+        <w:spacing w:after="120"/>
+      </w:pPr>
       <w:r>
         <w:rPr>
-          <w:i/>
-          <w:color w:val="808080"/>
-          <w:sz w:val="20"/>
+          <w:i w:val="0"/>
+          <w:color w:val="000000"/>
         </w:rPr>
-        <w:t xml:space="preserve">. Es una decisión que el catedrático va a preguntar, así que hay que justificarla: una sola base evita que </w:t>
+        <w:t>Cada integrante entra con su propio usuario interno y no con el administrador. No es una formalidad: Odoo guarda en el historial de cada registro quién lo creó y quién lo modificó, de modo que la autoría de cada parte de la fase queda registrada en la propia base de datos y se puede mostrar durante la evaluación técnica, que es justamente lo que el enunciado exige demostrar.</w:t>
       </w:r>
-      <w:proofErr w:type="gramStart"/>
+    </w:p>
+    <w:p>
+      <w:pPr>
+        <w:spacing w:after="120"/>
+      </w:pPr>
       <w:r>
         <w:rPr>
-          <w:i/>
-          <w:color w:val="808080"/>
-          <w:sz w:val="20"/>
+          <w:i w:val="0"/>
+          <w:color w:val="000000"/>
         </w:rPr>
-        <w:t>cada quien</w:t>
-      </w:r>
-      <w:proofErr w:type="gramEnd"/>
-      <w:r>
-        <w:rPr>
-          <w:i/>
-          <w:color w:val="808080"/>
-          <w:sz w:val="20"/>
-        </w:rPr>
-        <w:t xml:space="preserve"> cargue datos en una </w:t>
-      </w:r>
-      <w:r>
-        <w:rPr>
-          <w:i/>
-          <w:color w:val="808080"/>
-          <w:sz w:val="20"/>
-        </w:rPr>
-        <w:lastRenderedPageBreak/>
-        <w:t>copia distinta y que al final no cuadre nada. Explicar el acceso remoto (túnel), los usuarios individuales y los respaldos.</w:t>
+        <w:t>Los respaldos se toman desde el gestor de bases de datos de Odoo, en formato comprimido, y se suben a la carpeta del grupo en Drive. El respaldo del cierre de la carga es el punto de retorno del resto de la fase: a partir de él trabajan en paralelo la carga manual, las cotizaciones y el CRM.</w:t>
       </w:r>
     </w:p>
     <w:tbl>
@@ -8173,46 +8163,12 @@
             </w:pPr>
             <w:r>
               <w:rPr>
-                <w:sz w:val="20"/>
-              </w:rPr>
-              <w:t xml:space="preserve">La de la Fase 1: contenedores </w:t>
-            </w:r>
-            <w:proofErr w:type="spellStart"/>
-            <w:r>
-              <w:rPr>
-                <w:sz w:val="20"/>
-              </w:rPr>
-              <w:t>rutamoto-odoo</w:t>
-            </w:r>
-            <w:proofErr w:type="spellEnd"/>
-            <w:r>
-              <w:rPr>
-                <w:sz w:val="20"/>
-              </w:rPr>
-              <w:t xml:space="preserve"> y </w:t>
-            </w:r>
-            <w:proofErr w:type="spellStart"/>
-            <w:r>
-              <w:rPr>
-                <w:sz w:val="20"/>
-              </w:rPr>
-              <w:t>rutamoto-db</w:t>
-            </w:r>
-            <w:proofErr w:type="spellEnd"/>
-            <w:r>
-              <w:rPr>
-                <w:sz w:val="20"/>
-              </w:rPr>
-              <w:t xml:space="preserve">, base </w:t>
-            </w:r>
-            <w:proofErr w:type="spellStart"/>
-            <w:r>
-              <w:rPr>
-                <w:sz w:val="20"/>
-              </w:rPr>
-              <w:t>rutamoto</w:t>
-            </w:r>
-            <w:proofErr w:type="spellEnd"/>
+                <w:i w:val="0"/>
+                <w:color w:val="000000"/>
+                <w:sz w:val="20"/>
+              </w:rPr>
+              <w:t>Contenedores rutamoto-odoo (Odoo Community 18.0) y rutamoto-db (PostgreSQL 16.15) sobre Docker Compose. Base rutamoto, compañía RutaMoto, país Guatemala, moneda GTQ.</w:t>
+            </w:r>
           </w:p>
         </w:tc>
         <w:tc>
@@ -8268,29 +8224,11 @@
             </w:pPr>
             <w:r>
               <w:rPr>
-                <w:i/>
-                <w:color w:val="808080"/>
-                <w:sz w:val="20"/>
-              </w:rPr>
-              <w:t xml:space="preserve">Ej.: túnel de </w:t>
-            </w:r>
-            <w:proofErr w:type="spellStart"/>
-            <w:r>
-              <w:rPr>
-                <w:i/>
-                <w:color w:val="808080"/>
-                <w:sz w:val="20"/>
-              </w:rPr>
-              <w:t>Cloudflare</w:t>
-            </w:r>
-            <w:proofErr w:type="spellEnd"/>
-            <w:r>
-              <w:rPr>
-                <w:i/>
-                <w:color w:val="808080"/>
-                <w:sz w:val="20"/>
-              </w:rPr>
-              <w:t xml:space="preserve"> hacia localhost:8069 (URL temporal *.trycloudflare.com)</w:t>
+                <w:i w:val="0"/>
+                <w:color w:val="000000"/>
+                <w:sz w:val="20"/>
+              </w:rPr>
+              <w:t>Túnel de Cloudflare hacia localhost:8069, con el modo de proxy activado en odoo.conf. La dirección es temporal y se comparte por el chat del grupo cada vez que se reinicia.</w:t>
             </w:r>
           </w:p>
         </w:tc>
@@ -8306,9 +8244,11 @@
             </w:pPr>
             <w:r>
               <w:rPr>
-                <w:sz w:val="20"/>
-              </w:rPr>
-              <w:t>Los demás roles trabajan desde su casa sin instalar nada</w:t>
+                <w:i w:val="0"/>
+                <w:color w:val="000000"/>
+                <w:sz w:val="20"/>
+              </w:rPr>
+              <w:t>Los otros tres integrantes trabajan desde su casa sin instalar nada</w:t>
             </w:r>
           </w:p>
         </w:tc>
@@ -8347,9 +8287,11 @@
             </w:pPr>
             <w:r>
               <w:rPr>
-                <w:sz w:val="20"/>
-              </w:rPr>
-              <w:t>Un usuario interno por integrante, con su nombre</w:t>
+                <w:i w:val="0"/>
+                <w:color w:val="000000"/>
+                <w:sz w:val="20"/>
+              </w:rPr>
+              <w:t>Cuatro usuarios internos, uno por integrante, con correo del dominio de la empresa.</w:t>
             </w:r>
           </w:p>
         </w:tc>
@@ -8367,21 +8309,7 @@
               <w:rPr>
                 <w:sz w:val="20"/>
               </w:rPr>
-              <w:t>El historial (</w:t>
-            </w:r>
-            <w:proofErr w:type="spellStart"/>
-            <w:r>
-              <w:rPr>
-                <w:sz w:val="20"/>
-              </w:rPr>
-              <w:t>chatter</w:t>
-            </w:r>
-            <w:proofErr w:type="spellEnd"/>
-            <w:r>
-              <w:rPr>
-                <w:sz w:val="20"/>
-              </w:rPr>
-              <w:t>) de cada registro muestra quién hizo qué: es la evidencia de autoría que pide la evaluación técnica</w:t>
+              <w:t>El historial (chatter) de cada registro muestra quién hizo qué: es la evidencia de autoría que pide la evaluación técnica</w:t>
             </w:r>
           </w:p>
         </w:tc>
@@ -8418,11 +8346,11 @@
             </w:pPr>
             <w:r>
               <w:rPr>
-                <w:i/>
-                <w:color w:val="808080"/>
-                <w:sz w:val="20"/>
-              </w:rPr>
-              <w:t>Fecha y hora de cada respaldo, antes y después de la carga</w:t>
+                <w:i w:val="0"/>
+                <w:color w:val="000000"/>
+                <w:sz w:val="20"/>
+              </w:rPr>
+              <w:t>Desde el gestor de bases de datos, en formato comprimido, al cerrar cada bloque de trabajo, y subidos a la carpeta del grupo en Drive.</w:t>
             </w:r>
           </w:p>
         </w:tc>
@@ -8573,9 +8501,11 @@
             </w:pPr>
             <w:r>
               <w:rPr>
-                <w:sz w:val="20"/>
-              </w:rPr>
-              <w:t>Rol 3 (administrador)</w:t>
+                <w:i w:val="0"/>
+                <w:color w:val="000000"/>
+                <w:sz w:val="20"/>
+              </w:rPr>
+              <w:t>Alberto Josué Hernández Armas</w:t>
             </w:r>
           </w:p>
         </w:tc>
@@ -8591,9 +8521,11 @@
             </w:pPr>
             <w:r>
               <w:rPr>
-                <w:sz w:val="20"/>
-              </w:rPr>
-              <w:t>Administración</w:t>
+                <w:i w:val="0"/>
+                <w:color w:val="000000"/>
+                <w:sz w:val="20"/>
+              </w:rPr>
+              <w:t>Administración de la instancia, inventario y compras</w:t>
             </w:r>
           </w:p>
         </w:tc>
@@ -8612,6 +8544,14 @@
               <w:spacing w:after="0"/>
               <w:jc w:val="left"/>
             </w:pPr>
+            <w:r>
+              <w:rPr>
+                <w:i w:val="0"/>
+                <w:color w:val="000000"/>
+                <w:sz w:val="20"/>
+              </w:rPr>
+              <w:t>santiago@rutamoto.gt</w:t>
+            </w:r>
           </w:p>
         </w:tc>
         <w:tc>
@@ -8626,9 +8566,11 @@
             </w:pPr>
             <w:r>
               <w:rPr>
-                <w:sz w:val="20"/>
-              </w:rPr>
-              <w:t>Rol 1</w:t>
+                <w:i w:val="0"/>
+                <w:color w:val="000000"/>
+                <w:sz w:val="20"/>
+              </w:rPr>
+              <w:t>Santiago Julián Barrera Reyes</w:t>
             </w:r>
           </w:p>
         </w:tc>
@@ -8642,6 +8584,14 @@
               <w:spacing w:after="0"/>
               <w:jc w:val="left"/>
             </w:pPr>
+            <w:r>
+              <w:rPr>
+                <w:i w:val="0"/>
+                <w:color w:val="000000"/>
+                <w:sz w:val="20"/>
+              </w:rPr>
+              <w:t>Inventario, ventas, compras, facturación y contactos</w:t>
+            </w:r>
           </w:p>
         </w:tc>
       </w:tr>
@@ -8659,6 +8609,14 @@
               <w:spacing w:after="0"/>
               <w:jc w:val="left"/>
             </w:pPr>
+            <w:r>
+              <w:rPr>
+                <w:i w:val="0"/>
+                <w:color w:val="000000"/>
+                <w:sz w:val="20"/>
+              </w:rPr>
+              <w:t>jemima@rutamoto.gt</w:t>
+            </w:r>
           </w:p>
         </w:tc>
         <w:tc>
@@ -8673,9 +8631,11 @@
             </w:pPr>
             <w:r>
               <w:rPr>
-                <w:sz w:val="20"/>
-              </w:rPr>
-              <w:t>Rol 2</w:t>
+                <w:i w:val="0"/>
+                <w:color w:val="000000"/>
+                <w:sz w:val="20"/>
+              </w:rPr>
+              <w:t>Jemima Solmaira Chavajay</w:t>
             </w:r>
           </w:p>
         </w:tc>
@@ -8689,6 +8649,14 @@
               <w:spacing w:after="0"/>
               <w:jc w:val="left"/>
             </w:pPr>
+            <w:r>
+              <w:rPr>
+                <w:i w:val="0"/>
+                <w:color w:val="000000"/>
+                <w:sz w:val="20"/>
+              </w:rPr>
+              <w:t>Inventario, ventas, compras, facturación y contactos</w:t>
+            </w:r>
           </w:p>
         </w:tc>
       </w:tr>
@@ -8705,6 +8673,14 @@
               <w:spacing w:after="0"/>
               <w:jc w:val="left"/>
             </w:pPr>
+            <w:r>
+              <w:rPr>
+                <w:i w:val="0"/>
+                <w:color w:val="000000"/>
+                <w:sz w:val="20"/>
+              </w:rPr>
+              <w:t>brayan@rutamoto.gt</w:t>
+            </w:r>
           </w:p>
         </w:tc>
         <w:tc>
@@ -8718,9 +8694,11 @@
             </w:pPr>
             <w:r>
               <w:rPr>
-                <w:sz w:val="20"/>
-              </w:rPr>
-              <w:t>Rol 4</w:t>
+                <w:i w:val="0"/>
+                <w:color w:val="000000"/>
+                <w:sz w:val="20"/>
+              </w:rPr>
+              <w:t>Brayan Emanuel García</w:t>
             </w:r>
           </w:p>
         </w:tc>
@@ -8733,6 +8711,14 @@
               <w:spacing w:after="0"/>
               <w:jc w:val="left"/>
             </w:pPr>
+            <w:r>
+              <w:rPr>
+                <w:i w:val="0"/>
+                <w:color w:val="000000"/>
+                <w:sz w:val="20"/>
+              </w:rPr>
+              <w:t>Inventario, ventas, compras, facturación, contactos y CRM</w:t>
+            </w:r>
           </w:p>
         </w:tc>
       </w:tr>
@@ -9985,11 +9971,70 @@
       </w:pPr>
       <w:r>
         <w:rPr>
-          <w:i/>
-          <w:color w:val="808080"/>
-          <w:sz w:val="20"/>
+          <w:i w:val="0"/>
+          <w:color w:val="000000"/>
         </w:rPr>
-        <w:t>Qué va aquí: el resumen del procedimiento (el detalle está en el MU-01), las decisiones que tomaste (por qué las categorías se crean antes, por qué se usa «Probar» antes de «Importar», cómo se resolvió el mapeo de columnas) y los errores que salieron con su solución. Una captura clave: la pantalla de importación con el mapeo de columnas y el mensaje de validación sin errores.</w:t>
+        <w:t>La importación se hizo hoja por hoja y en el orden que impone la dependencia entre registros: productos, existencias iniciales, reglas de reabastecimiento, proveedores, contactos de proveedor, lista de precios de proveedor y clientes. Ese orden no es una preferencia de método. Cada hoja nombra por texto registros que crea la anterior, así que invertir dos pasos deja filas sin referencia y la importación se detiene.</w:t>
+      </w:r>
+    </w:p>
+    <w:p>
+      <w:pPr>
+        <w:spacing w:after="120"/>
+      </w:pPr>
+      <w:r>
+        <w:rPr>
+          <w:i w:val="0"/>
+          <w:color w:val="000000"/>
+        </w:rPr>
+        <w:t>Antes de tocar el archivo hubo que preparar la base. Las seis categorías de producto se crearon sin categoría padre, porque Odoo compone el nombre completo con la jerarquía y una categoría colgada de «All» deja de coincidir con el texto del Excel. Las cuatro etiquetas de segmento se crearon por la misma razón. Y los términos de pago, que Odoo instala con nombre en inglés aunque la base esté en español, se renombraron a como los escribe el archivo; el quinto, «50% anticipo, 50% contra entrega», se creó con dos líneas porcentuales, porque Odoo 18 ya no admite el tipo de línea de saldo que usaban versiones anteriores.</w:t>
+      </w:r>
+    </w:p>
+    <w:p>
+      <w:pPr>
+        <w:spacing w:after="120"/>
+      </w:pPr>
+      <w:r>
+        <w:rPr>
+          <w:i w:val="0"/>
+          <w:color w:val="000000"/>
+        </w:rPr>
+        <w:t>Cada hoja se pasó primero por el botón «Probar», que ejecuta la importación completa contra la base y después deshace la transacción. Es la decisión de método que más tiempo ahorró. La validación encontró, sin escribir nada, que la columna de ubicación del archivo decía WH/Existencias mientras la ubicación real de la instancia es RMT/Existencias, porque la bodega se llama «Bodega Central RutaMoto» y su código corto es RMT desde la Fase 1. Con las treinta filas rechazadas y la base intacta, corregir costó un clic: como la instancia tiene una sola bodega, la columna se dejó en «No importar» y Odoo asignó la ubicación por omisión, que es precisamente la correcta. Se prefirió esa salida a editar el archivo, que ya estaba repartido entre los cuatro integrantes y cuya copia modificada habría abierto la puerta a que cada quien importara una versión distinta.</w:t>
+      </w:r>
+    </w:p>
+    <w:p>
+      <w:pPr>
+        <w:spacing w:after="120"/>
+      </w:pPr>
+      <w:r>
+        <w:rPr>
+          <w:i w:val="0"/>
+          <w:color w:val="000000"/>
+        </w:rPr>
+        <w:t>El mapeo de columnas se resolvió con la hoja «Diccionario» del propio archivo, que trae el nombre técnico de cada campo de Odoo. El importador reconoció por su cuenta solo dos columnas; las demás se asignaron a mano, y las columnas informativas, que están para cuadrar números y no para cargarse, se dejaron en «No importar». Las imágenes de producto entraron durante la misma importación: la columna correspondiente trae la dirección pública de cada archivo en el repositorio del grupo y Odoo las descarga sola, lo que obliga a que ese repositorio siga siendo público.</w:t>
+      </w:r>
+    </w:p>
+    <w:p>
+      <w:pPr>
+        <w:spacing w:after="120"/>
+      </w:pPr>
+      <w:r>
+        <w:rPr>
+          <w:i w:val="0"/>
+          <w:color w:val="000000"/>
+        </w:rPr>
+        <w:t>Dos advertencias conviene dejar escritas, porque las dos pueden arruinar la carga en silencio. La primera es que la hoja de existencias no carga existencia sino cantidades contadas: mientras no se pulse «Aplicar», el inventario sigue en cero y todo lo que venga después trabaja sobre datos vacíos. La segunda es que LUB-001 ya existía en la base desde la Fase 1, donde se creó como prueba de que la instalación operaba, con la misma referencia y los mismos precios del catálogo. El importador de Odoo no reconoce registros existentes si el archivo no trae una columna de identificador externo, así que importar esa fila habría dejado dos productos con el mismo código: se importaron las veintinueve restantes y se completó la ficha que ya estaba. Por eso la cantidad contada de sesenta unidades se aplicó sobre lo que había y el producto quedó en sesenta, y no en setenta y cinco.</w:t>
+      </w:r>
+    </w:p>
+    <w:p>
+      <w:pPr>
+        <w:spacing w:after="120"/>
+      </w:pPr>
+      <w:r>
+        <w:rPr>
+          <w:i w:val="0"/>
+          <w:color w:val="000000"/>
+        </w:rPr>
+        <w:t>El resultado de la carga masiva son 30 productos con su imagen, 30 líneas de existencia aplicadas por un valor al costo de Q 38,096.00, 30 reglas de reabastecimiento, 5 proveedores con su plazo de pago y su persona de contacto, 30 líneas de lista de precios de proveedor y 35 clientes con su segmento. El procedimiento completo, con captura en cada pantalla, está en el manual MU-01.</w:t>
       </w:r>
     </w:p>
     <w:p/>
@@ -10006,23 +10051,39 @@
         <w:jc w:val="center"/>
       </w:pPr>
       <w:r>
-        <w:rPr>
-          <w:i/>
-          <w:color w:val="808080"/>
-          <w:sz w:val="20"/>
-        </w:rPr>
-        <w:t xml:space="preserve">[ captura: pantalla de importación de productos con el mapeo de columnas y la prueba sin </w:t>
+        <w:drawing>
+          <wp:inline xmlns:a="http://schemas.openxmlformats.org/drawingml/2006/main" xmlns:pic="http://schemas.openxmlformats.org/drawingml/2006/picture">
+            <wp:extent cx="5486400" cy="4286250"/>
+            <wp:docPr id="101" name="Picture 1"/>
+            <wp:cNvGraphicFramePr>
+              <a:graphicFrameLocks noChangeAspect="1"/>
+            </wp:cNvGraphicFramePr>
+            <a:graphic>
+              <a:graphicData uri="http://schemas.openxmlformats.org/drawingml/2006/picture">
+                <pic:pic>
+                  <pic:nvPicPr>
+                    <pic:cNvPr id="0" name="mano_04_error_ubicacion.jpg"/>
+                    <pic:cNvPicPr/>
+                  </pic:nvPicPr>
+                  <pic:blipFill>
+                    <a:blip r:embed="rId8"/>
+                    <a:stretch>
+                      <a:fillRect/>
+                    </a:stretch>
+                  </pic:blipFill>
+                  <pic:spPr>
+                    <a:xfrm>
+                      <a:off x="0" y="0"/>
+                      <a:ext cx="5486400" cy="4286250"/>
+                    </a:xfrm>
+                    <a:prstGeom prst="rect"/>
+                  </pic:spPr>
+                </pic:pic>
+              </a:graphicData>
+            </a:graphic>
+          </wp:inline>
+        </w:drawing>
       </w:r>
-      <w:proofErr w:type="gramStart"/>
-      <w:r>
-        <w:rPr>
-          <w:i/>
-          <w:color w:val="808080"/>
-          <w:sz w:val="20"/>
-        </w:rPr>
-        <w:t>errores ]</w:t>
-      </w:r>
-      <w:proofErr w:type="gramEnd"/>
     </w:p>
     <w:p>
       <w:pPr>
@@ -10035,7 +10096,7 @@
           <w:color w:val="808080"/>
           <w:sz w:val="18"/>
         </w:rPr>
-        <w:t>Figura __. Importación masiva de productos: mapeo de columnas y validación. Elaboración propia.</w:t>
+        <w:t>Figura __. Validación previa de la importación: Odoo rechaza las 30 filas de la hoja de existencias porque la ubicación del archivo no existe en la instancia, y no escribe nada. Elaboración propia.</w:t>
       </w:r>
     </w:p>
     <w:tbl>
@@ -10130,6 +10191,14 @@
               <w:spacing w:after="0"/>
               <w:jc w:val="left"/>
             </w:pPr>
+            <w:r>
+              <w:rPr>
+                <w:i w:val="0"/>
+                <w:color w:val="000000"/>
+                <w:sz w:val="20"/>
+              </w:rPr>
+              <w:t>La columna de ubicación del archivo no existe en la instancia</w:t>
+            </w:r>
           </w:p>
         </w:tc>
         <w:tc>
@@ -10142,6 +10211,14 @@
               <w:spacing w:after="0"/>
               <w:jc w:val="left"/>
             </w:pPr>
+            <w:r>
+              <w:rPr>
+                <w:i w:val="0"/>
+                <w:color w:val="000000"/>
+                <w:sz w:val="20"/>
+              </w:rPr>
+              <w:t>El archivo trae WH/Existencias, que es el código por omisión de Odoo. La bodega del proyecto se llama «Bodega Central RutaMoto» y su código corto es RMT desde la Fase 1, así que su ubicación interna es RMT/Existencias.</w:t>
+            </w:r>
           </w:p>
         </w:tc>
         <w:tc>
@@ -10154,6 +10231,14 @@
               <w:spacing w:after="0"/>
               <w:jc w:val="left"/>
             </w:pPr>
+            <w:r>
+              <w:rPr>
+                <w:i w:val="0"/>
+                <w:color w:val="000000"/>
+                <w:sz w:val="20"/>
+              </w:rPr>
+              <w:t>La validación previa rechazó las 30 filas sin escribir nada. Como hay una sola bodega, la columna se dejó en «No importar» y Odoo asignó la ubicación por omisión, que es la correcta. El archivo de datos maestros no se modificó, para que los cuatro integrantes sigan trabajando sobre la misma copia.</w:t>
+            </w:r>
           </w:p>
         </w:tc>
       </w:tr>
@@ -10171,6 +10256,14 @@
               <w:spacing w:after="0"/>
               <w:jc w:val="left"/>
             </w:pPr>
+            <w:r>
+              <w:rPr>
+                <w:i w:val="0"/>
+                <w:color w:val="000000"/>
+                <w:sz w:val="20"/>
+              </w:rPr>
+              <w:t>LUB-001 ya existía en la base</w:t>
+            </w:r>
           </w:p>
         </w:tc>
         <w:tc>
@@ -10183,6 +10276,14 @@
               <w:spacing w:after="0"/>
               <w:jc w:val="left"/>
             </w:pPr>
+            <w:r>
+              <w:rPr>
+                <w:i w:val="0"/>
+                <w:color w:val="000000"/>
+                <w:sz w:val="20"/>
+              </w:rPr>
+              <w:t>Se creó en la Fase 1 como producto de prueba de la instalación, con la misma referencia del catálogo. El importador de Odoo no reconoce registros existentes si el archivo no trae columna de identificador externo.</w:t>
+            </w:r>
           </w:p>
         </w:tc>
         <w:tc>
@@ -10195,6 +10296,14 @@
               <w:spacing w:after="0"/>
               <w:jc w:val="left"/>
             </w:pPr>
+            <w:r>
+              <w:rPr>
+                <w:i w:val="0"/>
+                <w:color w:val="000000"/>
+                <w:sz w:val="20"/>
+              </w:rPr>
+              <w:t>Se importaron las 29 filas restantes y se completó la ficha existente, en lugar de crear un duplicado con el mismo código. La cantidad contada de la hoja de existencias se aplicó sobre esa misma ficha y la dejó en 60 unidades.</w:t>
+            </w:r>
           </w:p>
         </w:tc>
       </w:tr>
@@ -10211,6 +10320,14 @@
               <w:spacing w:after="0"/>
               <w:jc w:val="left"/>
             </w:pPr>
+            <w:r>
+              <w:rPr>
+                <w:i w:val="0"/>
+                <w:color w:val="000000"/>
+                <w:sz w:val="20"/>
+              </w:rPr>
+              <w:t>Los términos de pago estaban en inglés</w:t>
+            </w:r>
           </w:p>
         </w:tc>
         <w:tc>
@@ -10222,6 +10339,14 @@
               <w:spacing w:after="0"/>
               <w:jc w:val="left"/>
             </w:pPr>
+            <w:r>
+              <w:rPr>
+                <w:i w:val="0"/>
+                <w:color w:val="000000"/>
+                <w:sz w:val="20"/>
+              </w:rPr>
+              <w:t>La base se creó en español de Guatemala, pero los términos que Odoo instala por omisión conservan su nombre en inglés, y el archivo los nombra en español.</w:t>
+            </w:r>
           </w:p>
         </w:tc>
         <w:tc>
@@ -10233,6 +10358,14 @@
               <w:spacing w:after="0"/>
               <w:jc w:val="left"/>
             </w:pPr>
+            <w:r>
+              <w:rPr>
+                <w:i w:val="0"/>
+                <w:color w:val="000000"/>
+                <w:sz w:val="20"/>
+              </w:rPr>
+              <w:t>Se renombraron los cuatro existentes y se creó el quinto. Al crearlo se encontró que Odoo 18 ya no acepta el tipo de línea de saldo: las dos líneas se configuraron como porcentajes de 50 cada una.</w:t>
+            </w:r>
           </w:p>
         </w:tc>
       </w:tr>
@@ -10461,6 +10594,18 @@
         <w:t>. Si un número no cuadra, se escribe el que salió y por qué, no se corrige a mano para que cuadre.</w:t>
       </w:r>
     </w:p>
+    <w:p>
+      <w:pPr>
+        <w:spacing w:after="120"/>
+      </w:pPr>
+      <w:r>
+        <w:rPr>
+          <w:i w:val="0"/>
+          <w:color w:val="000000"/>
+        </w:rPr>
+        <w:t>La comprobación se hizo contra el archivo de origen y no contra la memoria: para cada fila se consultó Odoo y se comparó con la hoja «Cuadre» del Excel. La columna de resultado distingue lo que entró por importación de lo que aporta la carga manual, porque las dos cargas corren en paralelo y sus cifras se suman al final.</w:t>
+      </w:r>
+    </w:p>
     <w:tbl>
       <w:tblPr>
         <w:tblStyle w:val="Tablaconcuadrcula"/>
@@ -10495,6 +10640,7 @@
                 <w:b/>
                 <w:sz w:val="20"/>
               </w:rPr>
+              <w:lastRenderedPageBreak/>
               <w:t>Comprobación</w:t>
             </w:r>
           </w:p>
@@ -10515,17 +10661,8 @@
                 <w:b/>
                 <w:sz w:val="20"/>
               </w:rPr>
-              <w:t xml:space="preserve">Dónde se mira en </w:t>
-            </w:r>
-            <w:proofErr w:type="spellStart"/>
-            <w:r>
-              <w:rPr>
-                <w:b/>
-                <w:sz w:val="20"/>
-              </w:rPr>
-              <w:t>Odoo</w:t>
-            </w:r>
-            <w:proofErr w:type="spellEnd"/>
+              <w:t>Dónde se mira en Odoo</w:t>
+            </w:r>
           </w:p>
         </w:tc>
         <w:tc>
@@ -10637,6 +10774,14 @@
               <w:spacing w:after="0"/>
               <w:jc w:val="left"/>
             </w:pPr>
+            <w:r>
+              <w:rPr>
+                <w:i w:val="0"/>
+                <w:color w:val="000000"/>
+                <w:sz w:val="20"/>
+              </w:rPr>
+              <w:t>30 por importación, verificados contra la hoja 1_Productos. Los 6 restantes entran por la carga manual.</w:t>
+            </w:r>
           </w:p>
         </w:tc>
       </w:tr>
@@ -10708,6 +10853,14 @@
               <w:spacing w:after="0"/>
               <w:jc w:val="left"/>
             </w:pPr>
+            <w:r>
+              <w:rPr>
+                <w:i w:val="0"/>
+                <w:color w:val="000000"/>
+                <w:sz w:val="20"/>
+              </w:rPr>
+              <w:t>6 en cada una de las cinco categorías importadas. La sexta se completa con la carga manual.</w:t>
+            </w:r>
           </w:p>
         </w:tc>
       </w:tr>
@@ -10779,6 +10932,14 @@
               <w:spacing w:after="0"/>
               <w:jc w:val="left"/>
             </w:pPr>
+            <w:r>
+              <w:rPr>
+                <w:i w:val="0"/>
+                <w:color w:val="000000"/>
+                <w:sz w:val="20"/>
+              </w:rPr>
+              <w:t>Q 38,096.00 de la carga masiva, igual al centavo que la hoja «Cuadre». Con la carga manual llega a Q 45,000.00.</w:t>
+            </w:r>
           </w:p>
         </w:tc>
       </w:tr>
@@ -10850,6 +11011,14 @@
               <w:spacing w:after="0"/>
               <w:jc w:val="left"/>
             </w:pPr>
+            <w:r>
+              <w:rPr>
+                <w:i w:val="0"/>
+                <w:color w:val="000000"/>
+                <w:sz w:val="20"/>
+              </w:rPr>
+              <w:t>5 por importación, cada uno con su plazo de pago y su persona de contacto.</w:t>
+            </w:r>
           </w:p>
         </w:tc>
       </w:tr>
@@ -10921,6 +11090,14 @@
               <w:spacing w:after="0"/>
               <w:jc w:val="left"/>
             </w:pPr>
+            <w:r>
+              <w:rPr>
+                <w:i w:val="0"/>
+                <w:color w:val="000000"/>
+                <w:sz w:val="20"/>
+              </w:rPr>
+              <w:t>Por importación: Repartidor 12, Motociclista particular 11, Taller mecánico 7 y Entusiasta 5.</w:t>
+            </w:r>
           </w:p>
         </w:tc>
       </w:tr>
@@ -10992,6 +11169,14 @@
               <w:spacing w:after="0"/>
               <w:jc w:val="left"/>
             </w:pPr>
+            <w:r>
+              <w:rPr>
+                <w:i w:val="0"/>
+                <w:color w:val="000000"/>
+                <w:sz w:val="20"/>
+              </w:rPr>
+              <w:t>30 importadas, más 2 creadas con los productos adicionales: 32 al cierre de esta parte.</w:t>
+            </w:r>
           </w:p>
         </w:tc>
       </w:tr>
@@ -11063,6 +11248,14 @@
               <w:spacing w:after="0"/>
               <w:jc w:val="left"/>
             </w:pPr>
+            <w:r>
+              <w:rPr>
+                <w:i w:val="0"/>
+                <w:color w:val="000000"/>
+                <w:sz w:val="20"/>
+              </w:rPr>
+              <w:t>4: LUB-004 con 8 contra un mínimo de 20, FRE-001 con 6 contra 15, ELE-002 con 12 contra 30 y LLA-002 en cero contra 4.</w:t>
+            </w:r>
           </w:p>
         </w:tc>
       </w:tr>
@@ -11130,6 +11323,14 @@
               <w:spacing w:after="0"/>
               <w:jc w:val="left"/>
             </w:pPr>
+            <w:r>
+              <w:rPr>
+                <w:i w:val="0"/>
+                <w:color w:val="000000"/>
+                <w:sz w:val="20"/>
+              </w:rPr>
+              <w:t>Verificado: las 30 líneas de lista de precios quedaron en la pestaña de compra de cada producto, y las órdenes tomaron de ahí el proveedor, el precio y el plazo sin escribir nada.</w:t>
+            </w:r>
           </w:p>
         </w:tc>
       </w:tr>
@@ -11203,11 +11404,10 @@
       </w:pPr>
       <w:r>
         <w:rPr>
-          <w:i/>
-          <w:color w:val="808080"/>
-          <w:sz w:val="20"/>
+          <w:i w:val="0"/>
+          <w:color w:val="000000"/>
         </w:rPr>
-        <w:t>15 puntos compartidos con la 12.3. El alcance obligatorio del enunciado pide el ciclo COMPLETO: requisición, solicitud de cotización, orden de compra y recepción. Además, el «Módulo avanzado implementado» es requisito para optar a la calificación: si el ciclo no es demostrable, la nota del proyecto es cero. Detalle paso a paso en el MU-01, capítulos 8 a 12.</w:t>
+        <w:t>El enunciado exige el ciclo de compras completo: requisición, solicitud de cotización, orden de compra y recepción, con el movimiento reflejado en el módulo de inventario. Esta sección documenta cómo se implementó cada eslabón sobre Odoo 18 Community y qué documentos quedaron en la base como evidencia de cada uno.</w:t>
       </w:r>
     </w:p>
     <w:p>
@@ -11226,11 +11426,22 @@
       </w:pPr>
       <w:r>
         <w:rPr>
-          <w:i/>
-          <w:color w:val="808080"/>
-          <w:sz w:val="20"/>
+          <w:i w:val="0"/>
+          <w:color w:val="000000"/>
         </w:rPr>
-        <w:t>LUB-007 y ELE-007, creados desde el formulario y no desde el Excel, con existencia cero. Su existencia entra por la orden de compra: así un mismo producto demuestra la creación y el ciclo completo.</w:t>
+        <w:t>LUB-007, lubricante de cadena en aerosol de 400 ml, y ELE-007, bombillo LED de stop 1157, se crearon desde el formulario de producto y no desde el archivo, con la casilla de seguimiento de inventario marcada, existencia cero y su proveedor cargado en la pestaña de compra.</w:t>
+      </w:r>
+    </w:p>
+    <w:p>
+      <w:pPr>
+        <w:spacing w:after="120"/>
+      </w:pPr>
+      <w:r>
+        <w:rPr>
+          <w:i w:val="0"/>
+          <w:color w:val="000000"/>
+        </w:rPr>
+        <w:t>Su existencia entró después por las compras 2 y 3, de modo que un mismo producto demuestra las dos cosas que pide el enunciado: la creación desde el sistema y el ciclo de compras completo. Las reglas de reabastecimiento de ambos, con mínimo 10 y máximo 40, se crearon al final, con la mercadería ya recibida. El orden importa: creadas antes, los dos habrían entrado en la lista de alertas con existencia cero y la propuesta de reposición habría sido de cuarenta unidades de cada uno, en lugar de las cantidades del plan de compras.</w:t>
       </w:r>
     </w:p>
     <w:tbl>
@@ -11268,7 +11479,6 @@
                 <w:b/>
                 <w:sz w:val="20"/>
               </w:rPr>
-              <w:lastRenderedPageBreak/>
               <w:t>Código</w:t>
             </w:r>
           </w:p>
@@ -11570,65 +11780,58 @@
       </w:pPr>
       <w:r>
         <w:rPr>
-          <w:i/>
-          <w:color w:val="808080"/>
-          <w:sz w:val="20"/>
+          <w:i w:val="0"/>
+          <w:color w:val="000000"/>
         </w:rPr>
-        <w:t xml:space="preserve">Explicar cómo se implementó la requisición en </w:t>
+        <w:t>Odoo 18 Community no tiene un documento que se llame requisición. El módulo de Acuerdos de compra, que es lo más parecido, no viene en esta edición, y a dos semanas de la entrega no se quiso depender de un módulo de terceros para un requisito obligatorio. La requisición de este proyecto es, entonces, la alerta de la regla de reabastecimiento, y el acto de requerir es el botón «Ordenar una vez». Se documenta como decisión de diseño y no como una carencia disimulada, porque el ciclo queda completo y, sobre todo, trazable: cada orden de compra conserva como documento de origen la regla que la disparó.</w:t>
       </w:r>
-      <w:proofErr w:type="spellStart"/>
+    </w:p>
+    <w:p>
+      <w:pPr>
+        <w:spacing w:after="120"/>
+      </w:pPr>
       <w:r>
         <w:rPr>
-          <w:i/>
-          <w:color w:val="808080"/>
-          <w:sz w:val="20"/>
+          <w:i w:val="0"/>
+          <w:color w:val="000000"/>
         </w:rPr>
-        <w:t>Odoo</w:t>
+        <w:t>El inventario inicial del archivo está construido para que eso ocurra. Cuatro productos quedan por debajo de su mínimo al terminar la carga, y la cantidad que la regla propone para cada uno es exactamente la que lo lleva a su máximo: 44 unidades de FRE-001, 72 de LUB-004, 88 de ELE-002 y 16 de LLA-002. Esas cuatro cantidades son las de las compras del plan, de manera que ninguna cifra de esta sección se escribió a mano.</w:t>
       </w:r>
-      <w:proofErr w:type="spellEnd"/>
+    </w:p>
+    <w:p>
+      <w:pPr>
+        <w:spacing w:after="120"/>
+      </w:pPr>
       <w:r>
         <w:rPr>
-          <w:i/>
-          <w:color w:val="808080"/>
-          <w:sz w:val="20"/>
+          <w:i w:val="0"/>
+          <w:color w:val="000000"/>
         </w:rPr>
-        <w:t xml:space="preserve"> 18 </w:t>
+        <w:t>La compra 1 recorre el ciclo entero y es la que se documenta con detalle. La alerta de FRE-001, con 6 unidades contra un mínimo de 15, generó la solicitud de presupuesto P00001 a Frenos y Transmisiones de Guatemala por 44 unidades a Q 55, Q 2,420 en total. Ni el proveedor ni el precio ni la fecha prevista se escribieron: salieron de la lista de precios de proveedor importada, y el plazo de treinta días vino de la ficha del proveedor. Al confirmar, la solicitud pasó a pedido de compra y Odoo generó por su cuenta la recepción RMT/IN/00001, que se validó con las 44 unidades completas.</w:t>
       </w:r>
-      <w:proofErr w:type="spellStart"/>
+    </w:p>
+    <w:p>
+      <w:pPr>
+        <w:spacing w:after="120"/>
+      </w:pPr>
       <w:r>
         <w:rPr>
-          <w:i/>
-          <w:color w:val="808080"/>
-          <w:sz w:val="20"/>
+          <w:i w:val="0"/>
+          <w:color w:val="000000"/>
         </w:rPr>
-        <w:t>Community</w:t>
+        <w:t>Las compras 2 y 3 siguieron el mismo camino. La segunda nació de la alerta de LUB-004, por 72 unidades, y antes de confirmarla se le agregó una línea de 24 unidades de LUB-007: Q 2,280 recibidos en RMT/IN/00002. La tercera, 30 unidades de ELE-007 por Q 660, se creó desde el formulario porque ese producto todavía no tenía regla de reabastecimiento, y se recibió en RMT/IN/00003.</w:t>
       </w:r>
-      <w:proofErr w:type="spellEnd"/>
+    </w:p>
+    <w:p>
+      <w:pPr>
+        <w:spacing w:after="120"/>
+      </w:pPr>
       <w:r>
         <w:rPr>
-          <w:i/>
-          <w:color w:val="808080"/>
-          <w:sz w:val="20"/>
+          <w:i w:val="0"/>
+          <w:color w:val="000000"/>
         </w:rPr>
-        <w:t xml:space="preserve">, que no tiene un documento llamado así: la requisición nace de la alerta de stock bajo (regla de reabastecimiento) y se convierte en solicitud de cotización al proveedor. Si instalaron Acuerdos de compra (licitación) para comparar dos proveedores, decirlo aquí. Luego la solicitud de cotización se confirma como orden de compra y la mercadería se recibe. Una fila por documento, con su número real de </w:t>
-      </w:r>
-      <w:proofErr w:type="spellStart"/>
-      <w:r>
-        <w:rPr>
-          <w:i/>
-          <w:color w:val="808080"/>
-          <w:sz w:val="20"/>
-        </w:rPr>
-        <w:t>Odoo</w:t>
-      </w:r>
-      <w:proofErr w:type="spellEnd"/>
-      <w:r>
-        <w:rPr>
-          <w:i/>
-          <w:color w:val="808080"/>
-          <w:sz w:val="20"/>
-        </w:rPr>
-        <w:t xml:space="preserve"> (P0000x, WH/IN/0000x).</w:t>
+        <w:t>Las compras 4 y 5 quedaron abiertas a propósito. La cuarta está confirmada, con su recepción preparada pero sin validar; la quinta quedó como solicitud enviada, sin confirmar. Son las órdenes pendientes de proveedores que pide el informe de inventario de la sección 9, y son también la razón por la que LLA-002 sigue en cero al cierre de la fase.</w:t>
       </w:r>
     </w:p>
     <w:tbl>
@@ -11686,17 +11889,8 @@
                 <w:b/>
                 <w:sz w:val="20"/>
               </w:rPr>
-              <w:t xml:space="preserve">Documento en </w:t>
-            </w:r>
-            <w:proofErr w:type="spellStart"/>
-            <w:r>
-              <w:rPr>
-                <w:b/>
-                <w:sz w:val="20"/>
-              </w:rPr>
-              <w:t>Odoo</w:t>
-            </w:r>
-            <w:proofErr w:type="spellEnd"/>
+              <w:t>Documento en Odoo</w:t>
+            </w:r>
           </w:p>
         </w:tc>
         <w:tc>
@@ -11810,6 +12004,14 @@
               <w:spacing w:after="0"/>
               <w:jc w:val="left"/>
             </w:pPr>
+            <w:r>
+              <w:rPr>
+                <w:i w:val="0"/>
+                <w:color w:val="000000"/>
+                <w:sz w:val="20"/>
+              </w:rPr>
+              <w:t>Regla de FRE-001</w:t>
+            </w:r>
           </w:p>
         </w:tc>
         <w:tc>
@@ -11840,6 +12042,14 @@
               <w:spacing w:after="0"/>
               <w:jc w:val="left"/>
             </w:pPr>
+            <w:r>
+              <w:rPr>
+                <w:i w:val="0"/>
+                <w:color w:val="000000"/>
+                <w:sz w:val="20"/>
+              </w:rPr>
+              <w:t>Disparada: propone 44 unidades para llegar al máximo de 50</w:t>
+            </w:r>
           </w:p>
         </w:tc>
       </w:tr>
@@ -11895,11 +12105,11 @@
             </w:pPr>
             <w:r>
               <w:rPr>
-                <w:i/>
-                <w:color w:val="808080"/>
-                <w:sz w:val="20"/>
-              </w:rPr>
-              <w:t>P0000_</w:t>
+                <w:i w:val="0"/>
+                <w:color w:val="000000"/>
+                <w:sz w:val="20"/>
+              </w:rPr>
+              <w:t>P00001</w:t>
             </w:r>
           </w:p>
         </w:tc>
@@ -11931,6 +12141,14 @@
               <w:spacing w:after="0"/>
               <w:jc w:val="left"/>
             </w:pPr>
+            <w:r>
+              <w:rPr>
+                <w:i w:val="0"/>
+                <w:color w:val="000000"/>
+                <w:sz w:val="20"/>
+              </w:rPr>
+              <w:t>Enviada al proveedor</w:t>
+            </w:r>
           </w:p>
         </w:tc>
       </w:tr>
@@ -11986,11 +12204,11 @@
             </w:pPr>
             <w:r>
               <w:rPr>
-                <w:i/>
-                <w:color w:val="808080"/>
-                <w:sz w:val="20"/>
-              </w:rPr>
-              <w:t>P0000_</w:t>
+                <w:i w:val="0"/>
+                <w:color w:val="000000"/>
+                <w:sz w:val="20"/>
+              </w:rPr>
+              <w:t>P00001</w:t>
             </w:r>
           </w:p>
         </w:tc>
@@ -12022,6 +12240,14 @@
               <w:spacing w:after="0"/>
               <w:jc w:val="left"/>
             </w:pPr>
+            <w:r>
+              <w:rPr>
+                <w:i w:val="0"/>
+                <w:color w:val="000000"/>
+                <w:sz w:val="20"/>
+              </w:rPr>
+              <w:t>Confirmada</w:t>
+            </w:r>
           </w:p>
         </w:tc>
       </w:tr>
@@ -12074,11 +12300,11 @@
             </w:pPr>
             <w:r>
               <w:rPr>
-                <w:i/>
-                <w:color w:val="808080"/>
-                <w:sz w:val="20"/>
-              </w:rPr>
-              <w:t>WH/IN/0000_</w:t>
+                <w:i w:val="0"/>
+                <w:color w:val="000000"/>
+                <w:sz w:val="20"/>
+              </w:rPr>
+              <w:t>RMT/IN/00001</w:t>
             </w:r>
           </w:p>
         </w:tc>
@@ -12108,6 +12334,14 @@
               <w:spacing w:after="0"/>
               <w:jc w:val="left"/>
             </w:pPr>
+            <w:r>
+              <w:rPr>
+                <w:i w:val="0"/>
+                <w:color w:val="000000"/>
+                <w:sz w:val="20"/>
+              </w:rPr>
+              <w:t>Validada, estado Hecho</w:t>
+            </w:r>
           </w:p>
         </w:tc>
       </w:tr>
@@ -12335,6 +12569,14 @@
               <w:spacing w:after="0"/>
               <w:jc w:val="left"/>
             </w:pPr>
+            <w:r>
+              <w:rPr>
+                <w:i w:val="0"/>
+                <w:color w:val="000000"/>
+                <w:sz w:val="20"/>
+              </w:rPr>
+              <w:t>P00001</w:t>
+            </w:r>
           </w:p>
         </w:tc>
         <w:tc>
@@ -12349,6 +12591,8 @@
             </w:pPr>
             <w:r>
               <w:rPr>
+                <w:i w:val="0"/>
+                <w:color w:val="000000"/>
                 <w:sz w:val="20"/>
               </w:rPr>
               <w:t>Recibida</w:t>
@@ -12365,6 +12609,14 @@
               <w:spacing w:after="0"/>
               <w:jc w:val="left"/>
             </w:pPr>
+            <w:r>
+              <w:rPr>
+                <w:i w:val="0"/>
+                <w:color w:val="000000"/>
+                <w:sz w:val="20"/>
+              </w:rPr>
+              <w:t>Recibida completa en RMT/IN/00001, por Q 2,420</w:t>
+            </w:r>
           </w:p>
         </w:tc>
       </w:tr>
@@ -12436,6 +12688,14 @@
               <w:spacing w:after="0"/>
               <w:jc w:val="left"/>
             </w:pPr>
+            <w:r>
+              <w:rPr>
+                <w:i w:val="0"/>
+                <w:color w:val="000000"/>
+                <w:sz w:val="20"/>
+              </w:rPr>
+              <w:t>P00002</w:t>
+            </w:r>
           </w:p>
         </w:tc>
         <w:tc>
@@ -12450,6 +12710,8 @@
             </w:pPr>
             <w:r>
               <w:rPr>
+                <w:i w:val="0"/>
+                <w:color w:val="000000"/>
                 <w:sz w:val="20"/>
               </w:rPr>
               <w:t>Recibida</w:t>
@@ -12466,6 +12728,14 @@
               <w:spacing w:after="0"/>
               <w:jc w:val="left"/>
             </w:pPr>
+            <w:r>
+              <w:rPr>
+                <w:i w:val="0"/>
+                <w:color w:val="000000"/>
+                <w:sz w:val="20"/>
+              </w:rPr>
+              <w:t>Recibida completa en RMT/IN/00002, por Q 2,280</w:t>
+            </w:r>
           </w:p>
         </w:tc>
       </w:tr>
@@ -12537,6 +12807,14 @@
               <w:spacing w:after="0"/>
               <w:jc w:val="left"/>
             </w:pPr>
+            <w:r>
+              <w:rPr>
+                <w:i w:val="0"/>
+                <w:color w:val="000000"/>
+                <w:sz w:val="20"/>
+              </w:rPr>
+              <w:t>P00003</w:t>
+            </w:r>
           </w:p>
         </w:tc>
         <w:tc>
@@ -12551,6 +12829,8 @@
             </w:pPr>
             <w:r>
               <w:rPr>
+                <w:i w:val="0"/>
+                <w:color w:val="000000"/>
                 <w:sz w:val="20"/>
               </w:rPr>
               <w:t>Recibida</w:t>
@@ -12567,6 +12847,14 @@
               <w:spacing w:after="0"/>
               <w:jc w:val="left"/>
             </w:pPr>
+            <w:r>
+              <w:rPr>
+                <w:i w:val="0"/>
+                <w:color w:val="000000"/>
+                <w:sz w:val="20"/>
+              </w:rPr>
+              <w:t>Recibida completa en RMT/IN/00003, por Q 660</w:t>
+            </w:r>
           </w:p>
         </w:tc>
       </w:tr>
@@ -12638,6 +12926,14 @@
               <w:spacing w:after="0"/>
               <w:jc w:val="left"/>
             </w:pPr>
+            <w:r>
+              <w:rPr>
+                <w:i w:val="0"/>
+                <w:color w:val="000000"/>
+                <w:sz w:val="20"/>
+              </w:rPr>
+              <w:t>P00004</w:t>
+            </w:r>
           </w:p>
         </w:tc>
         <w:tc>
@@ -12652,6 +12948,8 @@
             </w:pPr>
             <w:r>
               <w:rPr>
+                <w:i w:val="0"/>
+                <w:color w:val="000000"/>
                 <w:sz w:val="20"/>
               </w:rPr>
               <w:t>Por recibir</w:t>
@@ -12668,6 +12966,14 @@
               <w:spacing w:after="0"/>
               <w:jc w:val="left"/>
             </w:pPr>
+            <w:r>
+              <w:rPr>
+                <w:i w:val="0"/>
+                <w:color w:val="000000"/>
+                <w:sz w:val="20"/>
+              </w:rPr>
+              <w:t>Confirmada por Q 4,400; la recepción RMT/IN/00004 queda lista sin validar</w:t>
+            </w:r>
           </w:p>
         </w:tc>
       </w:tr>
@@ -12735,6 +13041,14 @@
               <w:spacing w:after="0"/>
               <w:jc w:val="left"/>
             </w:pPr>
+            <w:r>
+              <w:rPr>
+                <w:i w:val="0"/>
+                <w:color w:val="000000"/>
+                <w:sz w:val="20"/>
+              </w:rPr>
+              <w:t>P00005</w:t>
+            </w:r>
           </w:p>
         </w:tc>
         <w:tc>
@@ -12748,6 +13062,8 @@
             </w:pPr>
             <w:r>
               <w:rPr>
+                <w:i w:val="0"/>
+                <w:color w:val="000000"/>
                 <w:sz w:val="20"/>
               </w:rPr>
               <w:t>Solicitud enviada</w:t>
@@ -12763,6 +13079,14 @@
               <w:spacing w:after="0"/>
               <w:jc w:val="left"/>
             </w:pPr>
+            <w:r>
+              <w:rPr>
+                <w:i w:val="0"/>
+                <w:color w:val="000000"/>
+                <w:sz w:val="20"/>
+              </w:rPr>
+              <w:t>Solicitud de cotización por Q 1,584, sin confirmar</w:t>
+            </w:r>
           </w:p>
         </w:tc>
       </w:tr>
@@ -12797,11 +13121,22 @@
       </w:pPr>
       <w:r>
         <w:rPr>
-          <w:i/>
-          <w:color w:val="808080"/>
-          <w:sz w:val="20"/>
+          <w:i w:val="0"/>
+          <w:color w:val="000000"/>
         </w:rPr>
-        <w:t>El enunciado pide «verificar que el movimiento se refleje en el módulo de inventario». Mostrarlo con un antes y después del mismo producto, y con el movimiento registrado en Inventario › Informes › Historial de movimientos.</w:t>
+        <w:t>La comprobación que pide el enunciado es que el movimiento de compra se vea en el módulo de inventario, y se hizo producto por producto, con el antes y el después. FRE-001 pasó de 6 a 50 unidades, LUB-004 de 8 a 80, y los dos productos creados desde el sistema pasaron de cero a 24 y a 30 unidades. En el historial de movimientos queda, por cada recepción, la línea de entrada desde la ubicación de proveedores hacia RMT/Existencias, con su fecha, su documento de origen y el usuario que la validó.</w:t>
+      </w:r>
+    </w:p>
+    <w:p>
+      <w:pPr>
+        <w:spacing w:after="120"/>
+      </w:pPr>
+      <w:r>
+        <w:rPr>
+          <w:i w:val="0"/>
+          <w:color w:val="000000"/>
+        </w:rPr>
+        <w:t>El efecto se ve además donde no se estaba buscando. Las alertas de reabastecimiento de los productos recibidos desaparecieron solas, porque la existencia volvió a estar por encima del mínimo, y el inventario valorizado subió de Q 38,096.00 a Q 43,456.00: exactamente el costo de las tres compras recibidas, Q 2,420 más Q 2,280 más Q 660. Que esa suma cierre al quetzal es la prueba de que el movimiento no se registró en dos lugares distintos, sino en uno solo que los módulos comparten.</w:t>
       </w:r>
     </w:p>
     <w:tbl>
@@ -12839,7 +13174,6 @@
                 <w:b/>
                 <w:sz w:val="20"/>
               </w:rPr>
-              <w:lastRenderedPageBreak/>
               <w:t>Producto</w:t>
             </w:r>
           </w:p>
@@ -13011,6 +13345,14 @@
               <w:spacing w:after="0"/>
               <w:jc w:val="left"/>
             </w:pPr>
+            <w:r>
+              <w:rPr>
+                <w:i w:val="0"/>
+                <w:color w:val="000000"/>
+                <w:sz w:val="20"/>
+              </w:rPr>
+              <w:t>50</w:t>
+            </w:r>
           </w:p>
         </w:tc>
       </w:tr>
@@ -13100,6 +13442,14 @@
               <w:spacing w:after="0"/>
               <w:jc w:val="left"/>
             </w:pPr>
+            <w:r>
+              <w:rPr>
+                <w:i w:val="0"/>
+                <w:color w:val="000000"/>
+                <w:sz w:val="20"/>
+              </w:rPr>
+              <w:t>80</w:t>
+            </w:r>
           </w:p>
         </w:tc>
       </w:tr>
@@ -13189,6 +13539,14 @@
               <w:spacing w:after="0"/>
               <w:jc w:val="left"/>
             </w:pPr>
+            <w:r>
+              <w:rPr>
+                <w:i w:val="0"/>
+                <w:color w:val="000000"/>
+                <w:sz w:val="20"/>
+              </w:rPr>
+              <w:t>24</w:t>
+            </w:r>
           </w:p>
         </w:tc>
       </w:tr>
@@ -13273,6 +13631,14 @@
               <w:spacing w:after="0"/>
               <w:jc w:val="left"/>
             </w:pPr>
+            <w:r>
+              <w:rPr>
+                <w:i w:val="0"/>
+                <w:color w:val="000000"/>
+                <w:sz w:val="20"/>
+              </w:rPr>
+              <w:t>30</w:t>
+            </w:r>
           </w:p>
         </w:tc>
       </w:tr>
@@ -13304,23 +13670,39 @@
         <w:jc w:val="center"/>
       </w:pPr>
       <w:r>
-        <w:rPr>
-          <w:i/>
-          <w:color w:val="808080"/>
-          <w:sz w:val="20"/>
-        </w:rPr>
-        <w:t>[ captura: historial de movimientos mostrando la entrada de FRE-001 desde el proveedor a WH/</w:t>
+        <w:drawing>
+          <wp:inline xmlns:a="http://schemas.openxmlformats.org/drawingml/2006/main" xmlns:pic="http://schemas.openxmlformats.org/drawingml/2006/picture">
+            <wp:extent cx="5486400" cy="3105937"/>
+            <wp:docPr id="102" name="Picture 2"/>
+            <wp:cNvGraphicFramePr>
+              <a:graphicFrameLocks noChangeAspect="1"/>
+            </wp:cNvGraphicFramePr>
+            <a:graphic>
+              <a:graphicData uri="http://schemas.openxmlformats.org/drawingml/2006/picture">
+                <pic:pic>
+                  <pic:nvPicPr>
+                    <pic:cNvPr id="0" name="28_historial_movimientos.png"/>
+                    <pic:cNvPicPr/>
+                  </pic:nvPicPr>
+                  <pic:blipFill>
+                    <a:blip r:embed="rId9"/>
+                    <a:stretch>
+                      <a:fillRect/>
+                    </a:stretch>
+                  </pic:blipFill>
+                  <pic:spPr>
+                    <a:xfrm>
+                      <a:off x="0" y="0"/>
+                      <a:ext cx="5486400" cy="3105937"/>
+                    </a:xfrm>
+                    <a:prstGeom prst="rect"/>
+                  </pic:spPr>
+                </pic:pic>
+              </a:graphicData>
+            </a:graphic>
+          </wp:inline>
+        </w:drawing>
       </w:r>
-      <w:proofErr w:type="gramStart"/>
-      <w:r>
-        <w:rPr>
-          <w:i/>
-          <w:color w:val="808080"/>
-          <w:sz w:val="20"/>
-        </w:rPr>
-        <w:t>Existencias ]</w:t>
-      </w:r>
-      <w:proofErr w:type="gramEnd"/>
     </w:p>
     <w:p>
       <w:pPr>
@@ -13333,7 +13715,7 @@
           <w:color w:val="808080"/>
           <w:sz w:val="18"/>
         </w:rPr>
-        <w:t>Figura __. Movimiento de inventario generado por la recepción. Elaboración propia.</w:t>
+        <w:t>Figura __. Historial de movimientos: la entrada de FRE-001 desde la ubicación de proveedores hacia RMT/Existencias. Elaboración propia.</w:t>
       </w:r>
     </w:p>
     <w:p>

</xml_diff>